<commit_message>
Align Feishu submission with official hackathon template
</commit_message>
<xml_diff>
--- a/寻忆｜Anker黑客松预赛材料｜飞书导入版.docx
+++ b/寻忆｜Anker黑客松预赛材料｜飞书导入版.docx
@@ -4,133 +4,83 @@
   <w:body>
     <w:p>
       <w:pPr>
+        <w:pStyle w:val="Title"/>
         <w:spacing w:after="160"/>
-      </w:pPr>
-      <w:r>
-        <w:rPr>
-          <w:rFonts w:ascii="Arial Unicode MS" w:hAnsi="Arial Unicode MS" w:eastAsia="Arial Unicode MS"/>
-          <w:b/>
-          <w:color w:val="55705E"/>
-          <w:sz w:val="20"/>
-        </w:rPr>
-        <w:t>ANKER 首届黑客松挑战赛</w:t>
-      </w:r>
-    </w:p>
-    <w:p>
-      <w:pPr>
-        <w:pStyle w:val="Title"/>
-        <w:spacing w:before="680" w:after="240"/>
-        <w:jc w:val="left"/>
+        <w:jc w:val="center"/>
       </w:pPr>
       <w:r>
         <w:rPr>
           <w:rFonts w:ascii="Arial Unicode MS" w:hAnsi="Arial Unicode MS" w:eastAsia="Arial Unicode MS"/>
           <w:b/>
           <w:color w:val="000000"/>
-          <w:sz w:val="76"/>
+          <w:sz w:val="36"/>
         </w:rPr>
-        <w:t>寻忆</w:t>
+        <w:t>Anker首届黑客松挑战赛 · 【待填写队名】预赛材料</w:t>
       </w:r>
     </w:p>
     <w:p>
       <w:pPr>
-        <w:spacing w:after="600"/>
-      </w:pPr>
-      <w:r>
-        <w:rPr>
-          <w:rFonts w:ascii="Arial Unicode MS" w:hAnsi="Arial Unicode MS" w:eastAsia="Arial Unicode MS"/>
-          <w:b w:val="0"/>
-          <w:color w:val="B75B48"/>
-          <w:sz w:val="40"/>
-        </w:rPr>
-        <w:t>地点感知式声音记忆载体</w:t>
-      </w:r>
-    </w:p>
-    <w:p>
-      <w:pPr>
-        <w:spacing w:after="400" w:line="360" w:lineRule="auto"/>
-      </w:pPr>
-      <w:r>
-        <w:rPr>
-          <w:rFonts w:ascii="Arial Unicode MS" w:hAnsi="Arial Unicode MS" w:eastAsia="Arial Unicode MS"/>
-          <w:color w:val="26322D"/>
-          <w:sz w:val="26"/>
-        </w:rPr>
-        <w:t>面向老人及其家庭，用一颗手机挂坠大小的声音记忆珠留下真实原声，再由 AI 把零散讲述整理成可回看、可倾听、可传承的生命故事。</w:t>
-      </w:r>
-    </w:p>
-    <w:p>
-      <w:pPr>
-        <w:jc w:val="center"/>
-      </w:pPr>
-      <w:r>
-        <w:drawing>
-          <wp:inline xmlns:a="http://schemas.openxmlformats.org/drawingml/2006/main" xmlns:pic="http://schemas.openxmlformats.org/drawingml/2006/picture">
-            <wp:extent cx="3888000" cy="3553134"/>
-            <wp:docPr id="1" name="Picture 1"/>
-            <wp:cNvGraphicFramePr>
-              <a:graphicFrameLocks noChangeAspect="1"/>
-            </wp:cNvGraphicFramePr>
-            <a:graphic>
-              <a:graphicData uri="http://schemas.openxmlformats.org/drawingml/2006/picture">
-                <pic:pic>
-                  <pic:nvPicPr>
-                    <pic:cNvPr id="0" name="xunyi-bean-product.png"/>
-                    <pic:cNvPicPr/>
-                  </pic:nvPicPr>
-                  <pic:blipFill>
-                    <a:blip r:embed="rId9"/>
-                    <a:stretch>
-                      <a:fillRect/>
-                    </a:stretch>
-                  </pic:blipFill>
-                  <pic:spPr>
-                    <a:xfrm>
-                      <a:off x="0" y="0"/>
-                      <a:ext cx="3888000" cy="3553134"/>
-                    </a:xfrm>
-                    <a:prstGeom prst="rect"/>
-                  </pic:spPr>
-                </pic:pic>
-              </a:graphicData>
-            </a:graphic>
-          </wp:inline>
-        </w:drawing>
-      </w:r>
-    </w:p>
-    <w:p>
-      <w:pPr>
+        <w:spacing w:after="60"/>
         <w:jc w:val="center"/>
       </w:pPr>
       <w:r>
         <w:rPr>
           <w:rFonts w:ascii="Arial Unicode MS" w:hAnsi="Arial Unicode MS" w:eastAsia="Arial Unicode MS"/>
           <w:b/>
-          <w:color w:val="55705E"/>
-          <w:sz w:val="24"/>
+          <w:color w:val="B84D3E"/>
+          <w:sz w:val="19"/>
         </w:rPr>
-        <w:t>把想起的那一刻 留成全家都能听懂的故事</w:t>
+        <w:t>提交前请开启飞书文档「互联网获取链接可阅读」权限</w:t>
       </w:r>
     </w:p>
     <w:p>
+      <w:pPr>
+        <w:spacing w:after="260"/>
+        <w:jc w:val="center"/>
+      </w:pPr>
       <w:r>
-        <w:br w:type="page"/>
+        <w:rPr>
+          <w:rFonts w:ascii="Arial Unicode MS" w:hAnsi="Arial Unicode MS" w:eastAsia="Arial Unicode MS"/>
+          <w:b w:val="0"/>
+          <w:color w:val="5F6368"/>
+          <w:sz w:val="19"/>
+        </w:rPr>
+        <w:t>完成后请在</w:t>
+      </w:r>
+      <w:hyperlink r:id="rId9">
+        <w:r>
+          <w:rPr>
+            <w:rFonts w:ascii="Arial Unicode MS" w:eastAsia="Arial Unicode MS"/>
+            <w:color w:val="B84D3E"/>
+            <w:u w:val="single"/>
+          </w:rPr>
+          <w:t>预赛提交问卷</w:t>
+        </w:r>
+      </w:hyperlink>
+      <w:r>
+        <w:rPr>
+          <w:rFonts w:ascii="Arial Unicode MS" w:hAnsi="Arial Unicode MS" w:eastAsia="Arial Unicode MS"/>
+          <w:b w:val="0"/>
+          <w:color w:val="5F6368"/>
+          <w:sz w:val="19"/>
+        </w:rPr>
+        <w:t>中提交本文档链接。</w:t>
       </w:r>
     </w:p>
     <w:p>
       <w:pPr>
         <w:pStyle w:val="Heading1"/>
         <w:keepNext/>
-        <w:spacing w:before="360" w:after="160"/>
+        <w:spacing w:before="320" w:after="120"/>
       </w:pPr>
       <w:r>
         <w:rPr>
-          <w:rFonts w:ascii="PingFang SC" w:hAnsi="PingFang SC" w:eastAsia="PingFang SC"/>
+          <w:rFonts w:ascii="Arial Unicode MS" w:hAnsi="Arial Unicode MS" w:eastAsia="Arial Unicode MS"/>
           <w:b/>
-          <w:color w:val="26322D"/>
-          <w:sz w:val="36"/>
+          <w:color w:val="000000"/>
+          <w:sz w:val="34"/>
         </w:rPr>
-        <w:t>一 预赛信息</w:t>
+        <w:t>一、预赛信息卡【必须包含】</w:t>
       </w:r>
     </w:p>
     <w:tbl>
@@ -141,1046 +91,13 @@
         <w:tblLook w:firstColumn="1" w:firstRow="1" w:lastColumn="0" w:lastRow="0" w:noHBand="0" w:noVBand="1" w:val="04A0"/>
       </w:tblPr>
       <w:tblGrid>
-        <w:gridCol w:w="4873"/>
-        <w:gridCol w:w="4873"/>
+        <w:gridCol w:w="4986"/>
+        <w:gridCol w:w="4986"/>
       </w:tblGrid>
       <w:tr>
-        <w:tc>
-          <w:tcPr>
-            <w:tcW w:type="dxa" w:w="1871"/>
-            <w:vAlign w:val="center"/>
-            <w:tcBorders>
-              <w:top w:val="single" w:sz="6" w:color="D9D9D9"/>
-              <w:left w:val="single" w:sz="6" w:color="D9D9D9"/>
-              <w:bottom w:val="single" w:sz="6" w:color="D9D9D9"/>
-              <w:right w:val="single" w:sz="6" w:color="D9D9D9"/>
-              <w:insideH w:val="single" w:sz="6" w:color="D9D9D9"/>
-              <w:insideV w:val="single" w:sz="6" w:color="D9D9D9"/>
-            </w:tcBorders>
-            <w:tcMar>
-              <w:top w:w="120" w:type="dxa"/>
-              <w:start w:w="130" w:type="dxa"/>
-              <w:bottom w:w="120" w:type="dxa"/>
-              <w:end w:w="130" w:type="dxa"/>
-            </w:tcMar>
-            <w:shd w:fill="55705E"/>
-          </w:tcPr>
-          <w:p>
-            <w:pPr>
-              <w:spacing w:after="0" w:line="276" w:lineRule="auto"/>
-            </w:pPr>
-            <w:r>
-              <w:rPr>
-                <w:rFonts w:ascii="Arial Unicode MS" w:hAnsi="Arial Unicode MS" w:eastAsia="Arial Unicode MS"/>
-                <w:b/>
-                <w:color w:val="FFFFFF"/>
-                <w:sz w:val="18"/>
-              </w:rPr>
-              <w:t>项目</w:t>
-            </w:r>
-          </w:p>
-        </w:tc>
-        <w:tc>
-          <w:tcPr>
-            <w:tcW w:type="dxa" w:w="6803"/>
-            <w:vAlign w:val="center"/>
-            <w:tcBorders>
-              <w:top w:val="single" w:sz="6" w:color="D9D9D9"/>
-              <w:left w:val="single" w:sz="6" w:color="D9D9D9"/>
-              <w:bottom w:val="single" w:sz="6" w:color="D9D9D9"/>
-              <w:right w:val="single" w:sz="6" w:color="D9D9D9"/>
-              <w:insideH w:val="single" w:sz="6" w:color="D9D9D9"/>
-              <w:insideV w:val="single" w:sz="6" w:color="D9D9D9"/>
-            </w:tcBorders>
-            <w:tcMar>
-              <w:top w:w="120" w:type="dxa"/>
-              <w:start w:w="130" w:type="dxa"/>
-              <w:bottom w:w="120" w:type="dxa"/>
-              <w:end w:w="130" w:type="dxa"/>
-            </w:tcMar>
-            <w:shd w:fill="55705E"/>
-          </w:tcPr>
-          <w:p>
-            <w:pPr>
-              <w:spacing w:after="0" w:line="276" w:lineRule="auto"/>
-            </w:pPr>
-            <w:r>
-              <w:rPr>
-                <w:rFonts w:ascii="Arial Unicode MS" w:hAnsi="Arial Unicode MS" w:eastAsia="Arial Unicode MS"/>
-                <w:b/>
-                <w:color w:val="FFFFFF"/>
-                <w:sz w:val="18"/>
-              </w:rPr>
-              <w:t>填写内容</w:t>
-            </w:r>
-          </w:p>
-        </w:tc>
-      </w:tr>
-      <w:tr>
-        <w:tc>
-          <w:tcPr>
-            <w:tcW w:type="dxa" w:w="1871"/>
-            <w:vAlign w:val="center"/>
-            <w:tcBorders>
-              <w:top w:val="single" w:sz="6" w:color="D9D9D9"/>
-              <w:left w:val="single" w:sz="6" w:color="D9D9D9"/>
-              <w:bottom w:val="single" w:sz="6" w:color="D9D9D9"/>
-              <w:right w:val="single" w:sz="6" w:color="D9D9D9"/>
-              <w:insideH w:val="single" w:sz="6" w:color="D9D9D9"/>
-              <w:insideV w:val="single" w:sz="6" w:color="D9D9D9"/>
-            </w:tcBorders>
-            <w:tcMar>
-              <w:top w:w="120" w:type="dxa"/>
-              <w:start w:w="130" w:type="dxa"/>
-              <w:bottom w:w="120" w:type="dxa"/>
-              <w:end w:w="130" w:type="dxa"/>
-            </w:tcMar>
-          </w:tcPr>
-          <w:p>
-            <w:pPr>
-              <w:spacing w:after="0" w:line="276" w:lineRule="auto"/>
-            </w:pPr>
-            <w:r>
-              <w:rPr>
-                <w:rFonts w:ascii="Arial Unicode MS" w:hAnsi="Arial Unicode MS" w:eastAsia="Arial Unicode MS"/>
-                <w:b w:val="0"/>
-                <w:color w:val="26322D"/>
-                <w:sz w:val="18"/>
-              </w:rPr>
-              <w:t>队名</w:t>
-            </w:r>
-          </w:p>
-        </w:tc>
-        <w:tc>
-          <w:tcPr>
-            <w:tcW w:type="dxa" w:w="6803"/>
-            <w:vAlign w:val="center"/>
-            <w:tcBorders>
-              <w:top w:val="single" w:sz="6" w:color="D9D9D9"/>
-              <w:left w:val="single" w:sz="6" w:color="D9D9D9"/>
-              <w:bottom w:val="single" w:sz="6" w:color="D9D9D9"/>
-              <w:right w:val="single" w:sz="6" w:color="D9D9D9"/>
-              <w:insideH w:val="single" w:sz="6" w:color="D9D9D9"/>
-              <w:insideV w:val="single" w:sz="6" w:color="D9D9D9"/>
-            </w:tcBorders>
-            <w:tcMar>
-              <w:top w:w="120" w:type="dxa"/>
-              <w:start w:w="130" w:type="dxa"/>
-              <w:bottom w:w="120" w:type="dxa"/>
-              <w:end w:w="130" w:type="dxa"/>
-            </w:tcMar>
-          </w:tcPr>
-          <w:p>
-            <w:pPr>
-              <w:spacing w:after="0" w:line="276" w:lineRule="auto"/>
-            </w:pPr>
-            <w:r>
-              <w:rPr>
-                <w:rFonts w:ascii="Arial Unicode MS" w:hAnsi="Arial Unicode MS" w:eastAsia="Arial Unicode MS"/>
-                <w:b w:val="0"/>
-                <w:color w:val="26322D"/>
-                <w:sz w:val="18"/>
-              </w:rPr>
-              <w:t>待填写</w:t>
-            </w:r>
-          </w:p>
-        </w:tc>
-      </w:tr>
-      <w:tr>
-        <w:tc>
-          <w:tcPr>
-            <w:tcW w:type="dxa" w:w="1871"/>
-            <w:vAlign w:val="center"/>
-            <w:tcBorders>
-              <w:top w:val="single" w:sz="6" w:color="D9D9D9"/>
-              <w:left w:val="single" w:sz="6" w:color="D9D9D9"/>
-              <w:bottom w:val="single" w:sz="6" w:color="D9D9D9"/>
-              <w:right w:val="single" w:sz="6" w:color="D9D9D9"/>
-              <w:insideH w:val="single" w:sz="6" w:color="D9D9D9"/>
-              <w:insideV w:val="single" w:sz="6" w:color="D9D9D9"/>
-            </w:tcBorders>
-            <w:tcMar>
-              <w:top w:w="120" w:type="dxa"/>
-              <w:start w:w="130" w:type="dxa"/>
-              <w:bottom w:w="120" w:type="dxa"/>
-              <w:end w:w="130" w:type="dxa"/>
-            </w:tcMar>
-            <w:shd w:fill="F7F7F5"/>
-          </w:tcPr>
-          <w:p>
-            <w:pPr>
-              <w:spacing w:after="0" w:line="276" w:lineRule="auto"/>
-            </w:pPr>
-            <w:r>
-              <w:rPr>
-                <w:rFonts w:ascii="Arial Unicode MS" w:hAnsi="Arial Unicode MS" w:eastAsia="Arial Unicode MS"/>
-                <w:b w:val="0"/>
-                <w:color w:val="26322D"/>
-                <w:sz w:val="18"/>
-              </w:rPr>
-              <w:t>意向赛道</w:t>
-            </w:r>
-          </w:p>
-        </w:tc>
-        <w:tc>
-          <w:tcPr>
-            <w:tcW w:type="dxa" w:w="6803"/>
-            <w:vAlign w:val="center"/>
-            <w:tcBorders>
-              <w:top w:val="single" w:sz="6" w:color="D9D9D9"/>
-              <w:left w:val="single" w:sz="6" w:color="D9D9D9"/>
-              <w:bottom w:val="single" w:sz="6" w:color="D9D9D9"/>
-              <w:right w:val="single" w:sz="6" w:color="D9D9D9"/>
-              <w:insideH w:val="single" w:sz="6" w:color="D9D9D9"/>
-              <w:insideV w:val="single" w:sz="6" w:color="D9D9D9"/>
-            </w:tcBorders>
-            <w:tcMar>
-              <w:top w:w="120" w:type="dxa"/>
-              <w:start w:w="130" w:type="dxa"/>
-              <w:bottom w:w="120" w:type="dxa"/>
-              <w:end w:w="130" w:type="dxa"/>
-            </w:tcMar>
-            <w:shd w:fill="F7F7F5"/>
-          </w:tcPr>
-          <w:p>
-            <w:pPr>
-              <w:spacing w:after="0" w:line="276" w:lineRule="auto"/>
-            </w:pPr>
-            <w:r>
-              <w:rPr>
-                <w:rFonts w:ascii="Arial Unicode MS" w:hAnsi="Arial Unicode MS" w:eastAsia="Arial Unicode MS"/>
-                <w:b w:val="0"/>
-                <w:color w:val="26322D"/>
-                <w:sz w:val="18"/>
-              </w:rPr>
-              <w:t>智能录音</w:t>
-            </w:r>
-          </w:p>
-        </w:tc>
-      </w:tr>
-      <w:tr>
-        <w:tc>
-          <w:tcPr>
-            <w:tcW w:type="dxa" w:w="1871"/>
-            <w:vAlign w:val="center"/>
-            <w:tcBorders>
-              <w:top w:val="single" w:sz="6" w:color="D9D9D9"/>
-              <w:left w:val="single" w:sz="6" w:color="D9D9D9"/>
-              <w:bottom w:val="single" w:sz="6" w:color="D9D9D9"/>
-              <w:right w:val="single" w:sz="6" w:color="D9D9D9"/>
-              <w:insideH w:val="single" w:sz="6" w:color="D9D9D9"/>
-              <w:insideV w:val="single" w:sz="6" w:color="D9D9D9"/>
-            </w:tcBorders>
-            <w:tcMar>
-              <w:top w:w="120" w:type="dxa"/>
-              <w:start w:w="130" w:type="dxa"/>
-              <w:bottom w:w="120" w:type="dxa"/>
-              <w:end w:w="130" w:type="dxa"/>
-            </w:tcMar>
-          </w:tcPr>
-          <w:p>
-            <w:pPr>
-              <w:spacing w:after="0" w:line="276" w:lineRule="auto"/>
-            </w:pPr>
-            <w:r>
-              <w:rPr>
-                <w:rFonts w:ascii="Arial Unicode MS" w:hAnsi="Arial Unicode MS" w:eastAsia="Arial Unicode MS"/>
-                <w:b w:val="0"/>
-                <w:color w:val="26322D"/>
-                <w:sz w:val="18"/>
-              </w:rPr>
-              <w:t>队长信息</w:t>
-            </w:r>
-          </w:p>
-        </w:tc>
-        <w:tc>
-          <w:tcPr>
-            <w:tcW w:type="dxa" w:w="6803"/>
-            <w:vAlign w:val="center"/>
-            <w:tcBorders>
-              <w:top w:val="single" w:sz="6" w:color="D9D9D9"/>
-              <w:left w:val="single" w:sz="6" w:color="D9D9D9"/>
-              <w:bottom w:val="single" w:sz="6" w:color="D9D9D9"/>
-              <w:right w:val="single" w:sz="6" w:color="D9D9D9"/>
-              <w:insideH w:val="single" w:sz="6" w:color="D9D9D9"/>
-              <w:insideV w:val="single" w:sz="6" w:color="D9D9D9"/>
-            </w:tcBorders>
-            <w:tcMar>
-              <w:top w:w="120" w:type="dxa"/>
-              <w:start w:w="130" w:type="dxa"/>
-              <w:bottom w:w="120" w:type="dxa"/>
-              <w:end w:w="130" w:type="dxa"/>
-            </w:tcMar>
-          </w:tcPr>
-          <w:p>
-            <w:pPr>
-              <w:spacing w:after="0" w:line="276" w:lineRule="auto"/>
-            </w:pPr>
-            <w:r>
-              <w:rPr>
-                <w:rFonts w:ascii="Arial Unicode MS" w:hAnsi="Arial Unicode MS" w:eastAsia="Arial Unicode MS"/>
-                <w:b w:val="0"/>
-                <w:color w:val="26322D"/>
-                <w:sz w:val="18"/>
-              </w:rPr>
-              <w:t>待填写 姓名 邮箱 手机号</w:t>
-            </w:r>
-          </w:p>
-        </w:tc>
-      </w:tr>
-      <w:tr>
-        <w:tc>
-          <w:tcPr>
-            <w:tcW w:type="dxa" w:w="1871"/>
-            <w:vAlign w:val="center"/>
-            <w:tcBorders>
-              <w:top w:val="single" w:sz="6" w:color="D9D9D9"/>
-              <w:left w:val="single" w:sz="6" w:color="D9D9D9"/>
-              <w:bottom w:val="single" w:sz="6" w:color="D9D9D9"/>
-              <w:right w:val="single" w:sz="6" w:color="D9D9D9"/>
-              <w:insideH w:val="single" w:sz="6" w:color="D9D9D9"/>
-              <w:insideV w:val="single" w:sz="6" w:color="D9D9D9"/>
-            </w:tcBorders>
-            <w:tcMar>
-              <w:top w:w="120" w:type="dxa"/>
-              <w:start w:w="130" w:type="dxa"/>
-              <w:bottom w:w="120" w:type="dxa"/>
-              <w:end w:w="130" w:type="dxa"/>
-            </w:tcMar>
-            <w:shd w:fill="F7F7F5"/>
-          </w:tcPr>
-          <w:p>
-            <w:pPr>
-              <w:spacing w:after="0" w:line="276" w:lineRule="auto"/>
-            </w:pPr>
-            <w:r>
-              <w:rPr>
-                <w:rFonts w:ascii="Arial Unicode MS" w:hAnsi="Arial Unicode MS" w:eastAsia="Arial Unicode MS"/>
-                <w:b w:val="0"/>
-                <w:color w:val="26322D"/>
-                <w:sz w:val="18"/>
-              </w:rPr>
-              <w:t>成员与分工</w:t>
-            </w:r>
-          </w:p>
-        </w:tc>
-        <w:tc>
-          <w:tcPr>
-            <w:tcW w:type="dxa" w:w="6803"/>
-            <w:vAlign w:val="center"/>
-            <w:tcBorders>
-              <w:top w:val="single" w:sz="6" w:color="D9D9D9"/>
-              <w:left w:val="single" w:sz="6" w:color="D9D9D9"/>
-              <w:bottom w:val="single" w:sz="6" w:color="D9D9D9"/>
-              <w:right w:val="single" w:sz="6" w:color="D9D9D9"/>
-              <w:insideH w:val="single" w:sz="6" w:color="D9D9D9"/>
-              <w:insideV w:val="single" w:sz="6" w:color="D9D9D9"/>
-            </w:tcBorders>
-            <w:tcMar>
-              <w:top w:w="120" w:type="dxa"/>
-              <w:start w:w="130" w:type="dxa"/>
-              <w:bottom w:w="120" w:type="dxa"/>
-              <w:end w:w="130" w:type="dxa"/>
-            </w:tcMar>
-            <w:shd w:fill="F7F7F5"/>
-          </w:tcPr>
-          <w:p>
-            <w:pPr>
-              <w:spacing w:after="0" w:line="276" w:lineRule="auto"/>
-            </w:pPr>
-            <w:r>
-              <w:rPr>
-                <w:rFonts w:ascii="Arial Unicode MS" w:hAnsi="Arial Unicode MS" w:eastAsia="Arial Unicode MS"/>
-                <w:b w:val="0"/>
-                <w:color w:val="26322D"/>
-                <w:sz w:val="18"/>
-              </w:rPr>
-              <w:t>待填写 2 至 4 人姓名 邮箱与分工</w:t>
-            </w:r>
-          </w:p>
-        </w:tc>
-      </w:tr>
-    </w:tbl>
-    <w:p>
-      <w:pPr>
-        <w:spacing w:after="40"/>
-      </w:pPr>
-    </w:p>
-    <w:p>
-      <w:pPr>
-        <w:pStyle w:val="Heading1"/>
-        <w:keepNext/>
-        <w:spacing w:before="360" w:after="160"/>
-      </w:pPr>
-      <w:r>
-        <w:rPr>
-          <w:rFonts w:ascii="PingFang SC" w:hAnsi="PingFang SC" w:eastAsia="PingFang SC"/>
-          <w:b/>
-          <w:color w:val="26322D"/>
-          <w:sz w:val="36"/>
-        </w:rPr>
-        <w:t>二 赛题理解</w:t>
-      </w:r>
-    </w:p>
-    <w:p>
-      <w:pPr>
-        <w:spacing w:after="140" w:line="331" w:lineRule="auto"/>
-      </w:pPr>
-      <w:r>
-        <w:rPr>
-          <w:rFonts w:ascii="Arial Unicode MS" w:hAnsi="Arial Unicode MS" w:eastAsia="Arial Unicode MS"/>
-          <w:color w:val="26322D"/>
-          <w:sz w:val="21"/>
-        </w:rPr>
-        <w:t>智能录音不只解决录音 转写 摘要和待办。对家庭来说，最值得留下的往往是老人散步 探亲或聊天时突然想起的一句话。它出现突然 讲述零散 而且不可复制。</w:t>
-      </w:r>
-    </w:p>
-    <w:p>
-      <w:pPr>
-        <w:spacing w:after="140" w:line="331" w:lineRule="auto"/>
-      </w:pPr>
-      <w:r>
-        <w:rPr>
-          <w:rFonts w:ascii="Arial Unicode MS" w:hAnsi="Arial Unicode MS" w:eastAsia="Arial Unicode MS"/>
-          <w:color w:val="26322D"/>
-          <w:sz w:val="21"/>
-        </w:rPr>
-        <w:t>寻忆要解决的是 这段声音属于哪段人生经历 与谁有关 在哪里发生 以及以后什么时候值得再次被听见。</w:t>
-      </w:r>
-    </w:p>
-    <w:p>
-      <w:pPr>
-        <w:pStyle w:val="ListBullet"/>
-        <w:spacing w:after="80" w:line="307" w:lineRule="auto"/>
-        <w:ind w:left="283" w:hanging="142"/>
-      </w:pPr>
-      <w:r>
-        <w:rPr>
-          <w:rFonts w:ascii="Arial Unicode MS" w:hAnsi="Arial Unicode MS" w:eastAsia="Arial Unicode MS"/>
-          <w:color w:val="26322D"/>
-          <w:sz w:val="20"/>
-        </w:rPr>
-        <w:t>目标用户  六十岁以上 需要低门槛操作的老人 以及购买 共忆 整理和回听的子女。</w:t>
-      </w:r>
-    </w:p>
-    <w:p>
-      <w:pPr>
-        <w:pStyle w:val="ListBullet"/>
-        <w:spacing w:after="80" w:line="307" w:lineRule="auto"/>
-        <w:ind w:left="283" w:hanging="142"/>
-      </w:pPr>
-      <w:r>
-        <w:rPr>
-          <w:rFonts w:ascii="Arial Unicode MS" w:hAnsi="Arial Unicode MS" w:eastAsia="Arial Unicode MS"/>
-          <w:color w:val="26322D"/>
-          <w:sz w:val="20"/>
-        </w:rPr>
-        <w:t>产品边界  家庭回忆与数字生命故事工具 不是记忆测试 医疗诊断或治疗设备。</w:t>
-      </w:r>
-    </w:p>
-    <w:p>
-      <w:pPr>
-        <w:pStyle w:val="ListBullet"/>
-        <w:spacing w:after="80" w:line="307" w:lineRule="auto"/>
-        <w:ind w:left="283" w:hanging="142"/>
-      </w:pPr>
-      <w:r>
-        <w:rPr>
-          <w:rFonts w:ascii="Arial Unicode MS" w:hAnsi="Arial Unicode MS" w:eastAsia="Arial Unicode MS"/>
-          <w:color w:val="26322D"/>
-          <w:sz w:val="20"/>
-        </w:rPr>
-        <w:t>产品原则  真声是事实底座 AI 在后台自动沉淀 用户可以让它忘记 家庭分享单独授权。</w:t>
-      </w:r>
-    </w:p>
-    <w:p>
-      <w:pPr>
-        <w:pStyle w:val="Heading1"/>
-        <w:keepNext/>
-        <w:spacing w:before="360" w:after="160"/>
-      </w:pPr>
-      <w:r>
-        <w:rPr>
-          <w:rFonts w:ascii="PingFang SC" w:hAnsi="PingFang SC" w:eastAsia="PingFang SC"/>
-          <w:b/>
-          <w:color w:val="26322D"/>
-          <w:sz w:val="36"/>
-        </w:rPr>
-        <w:t>三 产品方案</w:t>
-      </w:r>
-    </w:p>
-    <w:p>
-      <w:pPr>
-        <w:pStyle w:val="Heading2"/>
-        <w:keepNext/>
-        <w:spacing w:before="240" w:after="160"/>
-      </w:pPr>
-      <w:r>
-        <w:rPr>
-          <w:rFonts w:ascii="PingFang SC" w:hAnsi="PingFang SC" w:eastAsia="PingFang SC"/>
-          <w:b/>
-          <w:color w:val="26322D"/>
-          <w:sz w:val="28"/>
-        </w:rPr>
-        <w:t>一句话定义</w:t>
-      </w:r>
-    </w:p>
-    <w:p>
-      <w:pPr>
-        <w:spacing w:after="140" w:line="331" w:lineRule="auto"/>
-      </w:pPr>
-      <w:r>
-        <w:rPr>
-          <w:rFonts w:ascii="Arial Unicode MS" w:hAnsi="Arial Unicode MS" w:eastAsia="Arial Unicode MS"/>
-          <w:color w:val="26322D"/>
-          <w:sz w:val="21"/>
-        </w:rPr>
-        <w:t>寻忆基于安克录音豆的可穿戴录音基础 把记录一次谈话升级为连接一生故事 通过一键记录 时间与可选地点锚点 AI 自动整理和家庭共忆 让真实原声持续生长为生命故事。</w:t>
-      </w:r>
-    </w:p>
-    <w:p>
-      <w:pPr>
-        <w:pStyle w:val="Heading2"/>
-        <w:keepNext/>
-        <w:spacing w:before="240" w:after="160"/>
-      </w:pPr>
-      <w:r>
-        <w:rPr>
-          <w:rFonts w:ascii="PingFang SC" w:hAnsi="PingFang SC" w:eastAsia="PingFang SC"/>
-          <w:b/>
-          <w:color w:val="26322D"/>
-          <w:sz w:val="28"/>
-        </w:rPr>
-        <w:t>两个真实场景</w:t>
-      </w:r>
-    </w:p>
-    <w:tbl>
-      <w:tblPr>
-        <w:tblW w:type="auto" w:w="0"/>
-        <w:jc w:val="center"/>
-        <w:tblLayout w:type="fixed"/>
-        <w:tblLook w:firstColumn="1" w:firstRow="1" w:lastColumn="0" w:lastRow="0" w:noHBand="0" w:noVBand="1" w:val="04A0"/>
-      </w:tblPr>
-      <w:tblGrid>
-        <w:gridCol w:w="3249"/>
-        <w:gridCol w:w="3249"/>
-        <w:gridCol w:w="3249"/>
-      </w:tblGrid>
-      <w:tr>
-        <w:tc>
-          <w:tcPr>
-            <w:tcW w:type="dxa" w:w="1474"/>
-            <w:vAlign w:val="center"/>
-            <w:tcBorders>
-              <w:top w:val="single" w:sz="6" w:color="D9D9D9"/>
-              <w:left w:val="single" w:sz="6" w:color="D9D9D9"/>
-              <w:bottom w:val="single" w:sz="6" w:color="D9D9D9"/>
-              <w:right w:val="single" w:sz="6" w:color="D9D9D9"/>
-              <w:insideH w:val="single" w:sz="6" w:color="D9D9D9"/>
-              <w:insideV w:val="single" w:sz="6" w:color="D9D9D9"/>
-            </w:tcBorders>
-            <w:tcMar>
-              <w:top w:w="120" w:type="dxa"/>
-              <w:start w:w="130" w:type="dxa"/>
-              <w:bottom w:w="120" w:type="dxa"/>
-              <w:end w:w="130" w:type="dxa"/>
-            </w:tcMar>
-            <w:shd w:fill="55705E"/>
-          </w:tcPr>
-          <w:p>
-            <w:pPr>
-              <w:spacing w:after="0" w:line="276" w:lineRule="auto"/>
-            </w:pPr>
-            <w:r>
-              <w:rPr>
-                <w:rFonts w:ascii="Arial Unicode MS" w:hAnsi="Arial Unicode MS" w:eastAsia="Arial Unicode MS"/>
-                <w:b/>
-                <w:color w:val="FFFFFF"/>
-                <w:sz w:val="18"/>
-              </w:rPr>
-              <w:t>场景</w:t>
-            </w:r>
-          </w:p>
-        </w:tc>
-        <w:tc>
-          <w:tcPr>
-            <w:tcW w:type="dxa" w:w="3600"/>
-            <w:vAlign w:val="center"/>
-            <w:tcBorders>
-              <w:top w:val="single" w:sz="6" w:color="D9D9D9"/>
-              <w:left w:val="single" w:sz="6" w:color="D9D9D9"/>
-              <w:bottom w:val="single" w:sz="6" w:color="D9D9D9"/>
-              <w:right w:val="single" w:sz="6" w:color="D9D9D9"/>
-              <w:insideH w:val="single" w:sz="6" w:color="D9D9D9"/>
-              <w:insideV w:val="single" w:sz="6" w:color="D9D9D9"/>
-            </w:tcBorders>
-            <w:tcMar>
-              <w:top w:w="120" w:type="dxa"/>
-              <w:start w:w="130" w:type="dxa"/>
-              <w:bottom w:w="120" w:type="dxa"/>
-              <w:end w:w="130" w:type="dxa"/>
-            </w:tcMar>
-            <w:shd w:fill="55705E"/>
-          </w:tcPr>
-          <w:p>
-            <w:pPr>
-              <w:spacing w:after="0" w:line="276" w:lineRule="auto"/>
-            </w:pPr>
-            <w:r>
-              <w:rPr>
-                <w:rFonts w:ascii="Arial Unicode MS" w:hAnsi="Arial Unicode MS" w:eastAsia="Arial Unicode MS"/>
-                <w:b/>
-                <w:color w:val="FFFFFF"/>
-                <w:sz w:val="18"/>
-              </w:rPr>
-              <w:t>老人独自记录</w:t>
-            </w:r>
-          </w:p>
-        </w:tc>
-        <w:tc>
-          <w:tcPr>
-            <w:tcW w:type="dxa" w:w="3600"/>
-            <w:vAlign w:val="center"/>
-            <w:tcBorders>
-              <w:top w:val="single" w:sz="6" w:color="D9D9D9"/>
-              <w:left w:val="single" w:sz="6" w:color="D9D9D9"/>
-              <w:bottom w:val="single" w:sz="6" w:color="D9D9D9"/>
-              <w:right w:val="single" w:sz="6" w:color="D9D9D9"/>
-              <w:insideH w:val="single" w:sz="6" w:color="D9D9D9"/>
-              <w:insideV w:val="single" w:sz="6" w:color="D9D9D9"/>
-            </w:tcBorders>
-            <w:tcMar>
-              <w:top w:w="120" w:type="dxa"/>
-              <w:start w:w="130" w:type="dxa"/>
-              <w:bottom w:w="120" w:type="dxa"/>
-              <w:end w:w="130" w:type="dxa"/>
-            </w:tcMar>
-            <w:shd w:fill="55705E"/>
-          </w:tcPr>
-          <w:p>
-            <w:pPr>
-              <w:spacing w:after="0" w:line="276" w:lineRule="auto"/>
-            </w:pPr>
-            <w:r>
-              <w:rPr>
-                <w:rFonts w:ascii="Arial Unicode MS" w:hAnsi="Arial Unicode MS" w:eastAsia="Arial Unicode MS"/>
-                <w:b/>
-                <w:color w:val="FFFFFF"/>
-                <w:sz w:val="18"/>
-              </w:rPr>
-              <w:t>老人与子女共同回忆</w:t>
-            </w:r>
-          </w:p>
-        </w:tc>
-      </w:tr>
-      <w:tr>
-        <w:tc>
-          <w:tcPr>
-            <w:tcW w:type="dxa" w:w="1474"/>
-            <w:vAlign w:val="center"/>
-            <w:tcBorders>
-              <w:top w:val="single" w:sz="6" w:color="D9D9D9"/>
-              <w:left w:val="single" w:sz="6" w:color="D9D9D9"/>
-              <w:bottom w:val="single" w:sz="6" w:color="D9D9D9"/>
-              <w:right w:val="single" w:sz="6" w:color="D9D9D9"/>
-              <w:insideH w:val="single" w:sz="6" w:color="D9D9D9"/>
-              <w:insideV w:val="single" w:sz="6" w:color="D9D9D9"/>
-            </w:tcBorders>
-            <w:tcMar>
-              <w:top w:w="120" w:type="dxa"/>
-              <w:start w:w="130" w:type="dxa"/>
-              <w:bottom w:w="120" w:type="dxa"/>
-              <w:end w:w="130" w:type="dxa"/>
-            </w:tcMar>
-          </w:tcPr>
-          <w:p>
-            <w:pPr>
-              <w:spacing w:after="0" w:line="276" w:lineRule="auto"/>
-            </w:pPr>
-            <w:r>
-              <w:rPr>
-                <w:rFonts w:ascii="Arial Unicode MS" w:hAnsi="Arial Unicode MS" w:eastAsia="Arial Unicode MS"/>
-                <w:b w:val="0"/>
-                <w:color w:val="26322D"/>
-                <w:sz w:val="18"/>
-              </w:rPr>
-              <w:t>输入</w:t>
-            </w:r>
-          </w:p>
-        </w:tc>
-        <w:tc>
-          <w:tcPr>
-            <w:tcW w:type="dxa" w:w="3600"/>
-            <w:vAlign w:val="center"/>
-            <w:tcBorders>
-              <w:top w:val="single" w:sz="6" w:color="D9D9D9"/>
-              <w:left w:val="single" w:sz="6" w:color="D9D9D9"/>
-              <w:bottom w:val="single" w:sz="6" w:color="D9D9D9"/>
-              <w:right w:val="single" w:sz="6" w:color="D9D9D9"/>
-              <w:insideH w:val="single" w:sz="6" w:color="D9D9D9"/>
-              <w:insideV w:val="single" w:sz="6" w:color="D9D9D9"/>
-            </w:tcBorders>
-            <w:tcMar>
-              <w:top w:w="120" w:type="dxa"/>
-              <w:start w:w="130" w:type="dxa"/>
-              <w:bottom w:w="120" w:type="dxa"/>
-              <w:end w:w="130" w:type="dxa"/>
-            </w:tcMar>
-          </w:tcPr>
-          <w:p>
-            <w:pPr>
-              <w:spacing w:after="0" w:line="276" w:lineRule="auto"/>
-            </w:pPr>
-            <w:r>
-              <w:rPr>
-                <w:rFonts w:ascii="Arial Unicode MS" w:hAnsi="Arial Unicode MS" w:eastAsia="Arial Unicode MS"/>
-                <w:b w:val="0"/>
-                <w:color w:val="26322D"/>
-                <w:sz w:val="18"/>
-              </w:rPr>
-              <w:t>硬件一键录音 离线保存 时间与地点线索</w:t>
-            </w:r>
-          </w:p>
-        </w:tc>
-        <w:tc>
-          <w:tcPr>
-            <w:tcW w:type="dxa" w:w="3600"/>
-            <w:vAlign w:val="center"/>
-            <w:tcBorders>
-              <w:top w:val="single" w:sz="6" w:color="D9D9D9"/>
-              <w:left w:val="single" w:sz="6" w:color="D9D9D9"/>
-              <w:bottom w:val="single" w:sz="6" w:color="D9D9D9"/>
-              <w:right w:val="single" w:sz="6" w:color="D9D9D9"/>
-              <w:insideH w:val="single" w:sz="6" w:color="D9D9D9"/>
-              <w:insideV w:val="single" w:sz="6" w:color="D9D9D9"/>
-            </w:tcBorders>
-            <w:tcMar>
-              <w:top w:w="120" w:type="dxa"/>
-              <w:start w:w="130" w:type="dxa"/>
-              <w:bottom w:w="120" w:type="dxa"/>
-              <w:end w:w="130" w:type="dxa"/>
-            </w:tcMar>
-          </w:tcPr>
-          <w:p>
-            <w:pPr>
-              <w:spacing w:after="0" w:line="276" w:lineRule="auto"/>
-            </w:pPr>
-            <w:r>
-              <w:rPr>
-                <w:rFonts w:ascii="Arial Unicode MS" w:hAnsi="Arial Unicode MS" w:eastAsia="Arial Unicode MS"/>
-                <w:b w:val="0"/>
-                <w:color w:val="26322D"/>
-                <w:sz w:val="18"/>
-              </w:rPr>
-              <w:t>手机连接 实时转写 子女控制谈话节奏</w:t>
-            </w:r>
-          </w:p>
-        </w:tc>
-      </w:tr>
-      <w:tr>
-        <w:tc>
-          <w:tcPr>
-            <w:tcW w:type="dxa" w:w="1474"/>
-            <w:vAlign w:val="center"/>
-            <w:tcBorders>
-              <w:top w:val="single" w:sz="6" w:color="D9D9D9"/>
-              <w:left w:val="single" w:sz="6" w:color="D9D9D9"/>
-              <w:bottom w:val="single" w:sz="6" w:color="D9D9D9"/>
-              <w:right w:val="single" w:sz="6" w:color="D9D9D9"/>
-              <w:insideH w:val="single" w:sz="6" w:color="D9D9D9"/>
-              <w:insideV w:val="single" w:sz="6" w:color="D9D9D9"/>
-            </w:tcBorders>
-            <w:tcMar>
-              <w:top w:w="120" w:type="dxa"/>
-              <w:start w:w="130" w:type="dxa"/>
-              <w:bottom w:w="120" w:type="dxa"/>
-              <w:end w:w="130" w:type="dxa"/>
-            </w:tcMar>
-            <w:shd w:fill="F7F7F5"/>
-          </w:tcPr>
-          <w:p>
-            <w:pPr>
-              <w:spacing w:after="0" w:line="276" w:lineRule="auto"/>
-            </w:pPr>
-            <w:r>
-              <w:rPr>
-                <w:rFonts w:ascii="Arial Unicode MS" w:hAnsi="Arial Unicode MS" w:eastAsia="Arial Unicode MS"/>
-                <w:b w:val="0"/>
-                <w:color w:val="26322D"/>
-                <w:sz w:val="18"/>
-              </w:rPr>
-              <w:t>AI 作用</w:t>
-            </w:r>
-          </w:p>
-        </w:tc>
-        <w:tc>
-          <w:tcPr>
-            <w:tcW w:type="dxa" w:w="3600"/>
-            <w:vAlign w:val="center"/>
-            <w:tcBorders>
-              <w:top w:val="single" w:sz="6" w:color="D9D9D9"/>
-              <w:left w:val="single" w:sz="6" w:color="D9D9D9"/>
-              <w:bottom w:val="single" w:sz="6" w:color="D9D9D9"/>
-              <w:right w:val="single" w:sz="6" w:color="D9D9D9"/>
-              <w:insideH w:val="single" w:sz="6" w:color="D9D9D9"/>
-              <w:insideV w:val="single" w:sz="6" w:color="D9D9D9"/>
-            </w:tcBorders>
-            <w:tcMar>
-              <w:top w:w="120" w:type="dxa"/>
-              <w:start w:w="130" w:type="dxa"/>
-              <w:bottom w:w="120" w:type="dxa"/>
-              <w:end w:w="130" w:type="dxa"/>
-            </w:tcMar>
-            <w:shd w:fill="F7F7F5"/>
-          </w:tcPr>
-          <w:p>
-            <w:pPr>
-              <w:spacing w:after="0" w:line="276" w:lineRule="auto"/>
-            </w:pPr>
-            <w:r>
-              <w:rPr>
-                <w:rFonts w:ascii="Arial Unicode MS" w:hAnsi="Arial Unicode MS" w:eastAsia="Arial Unicode MS"/>
-                <w:b w:val="0"/>
-                <w:color w:val="26322D"/>
-                <w:sz w:val="18"/>
-              </w:rPr>
-              <w:t>识别人 事 地点并聚合多个片段</w:t>
-            </w:r>
-          </w:p>
-        </w:tc>
-        <w:tc>
-          <w:tcPr>
-            <w:tcW w:type="dxa" w:w="3600"/>
-            <w:vAlign w:val="center"/>
-            <w:tcBorders>
-              <w:top w:val="single" w:sz="6" w:color="D9D9D9"/>
-              <w:left w:val="single" w:sz="6" w:color="D9D9D9"/>
-              <w:bottom w:val="single" w:sz="6" w:color="D9D9D9"/>
-              <w:right w:val="single" w:sz="6" w:color="D9D9D9"/>
-              <w:insideH w:val="single" w:sz="6" w:color="D9D9D9"/>
-              <w:insideV w:val="single" w:sz="6" w:color="D9D9D9"/>
-            </w:tcBorders>
-            <w:tcMar>
-              <w:top w:w="120" w:type="dxa"/>
-              <w:start w:w="130" w:type="dxa"/>
-              <w:bottom w:w="120" w:type="dxa"/>
-              <w:end w:w="130" w:type="dxa"/>
-            </w:tcMar>
-            <w:shd w:fill="F7F7F5"/>
-          </w:tcPr>
-          <w:p>
-            <w:pPr>
-              <w:spacing w:after="0" w:line="276" w:lineRule="auto"/>
-            </w:pPr>
-            <w:r>
-              <w:rPr>
-                <w:rFonts w:ascii="Arial Unicode MS" w:hAnsi="Arial Unicode MS" w:eastAsia="Arial Unicode MS"/>
-                <w:b w:val="0"/>
-                <w:color w:val="26322D"/>
-                <w:sz w:val="18"/>
-              </w:rPr>
-              <w:t>召回相关记忆 在停顿后给出开放式追问</w:t>
-            </w:r>
-          </w:p>
-        </w:tc>
-      </w:tr>
-      <w:tr>
-        <w:tc>
-          <w:tcPr>
-            <w:tcW w:type="dxa" w:w="1474"/>
-            <w:vAlign w:val="center"/>
-            <w:tcBorders>
-              <w:top w:val="single" w:sz="6" w:color="D9D9D9"/>
-              <w:left w:val="single" w:sz="6" w:color="D9D9D9"/>
-              <w:bottom w:val="single" w:sz="6" w:color="D9D9D9"/>
-              <w:right w:val="single" w:sz="6" w:color="D9D9D9"/>
-              <w:insideH w:val="single" w:sz="6" w:color="D9D9D9"/>
-              <w:insideV w:val="single" w:sz="6" w:color="D9D9D9"/>
-            </w:tcBorders>
-            <w:tcMar>
-              <w:top w:w="120" w:type="dxa"/>
-              <w:start w:w="130" w:type="dxa"/>
-              <w:bottom w:w="120" w:type="dxa"/>
-              <w:end w:w="130" w:type="dxa"/>
-            </w:tcMar>
-          </w:tcPr>
-          <w:p>
-            <w:pPr>
-              <w:spacing w:after="0" w:line="276" w:lineRule="auto"/>
-            </w:pPr>
-            <w:r>
-              <w:rPr>
-                <w:rFonts w:ascii="Arial Unicode MS" w:hAnsi="Arial Unicode MS" w:eastAsia="Arial Unicode MS"/>
-                <w:b w:val="0"/>
-                <w:color w:val="26322D"/>
-                <w:sz w:val="18"/>
-              </w:rPr>
-              <w:t>输出</w:t>
-            </w:r>
-          </w:p>
-        </w:tc>
-        <w:tc>
-          <w:tcPr>
-            <w:tcW w:type="dxa" w:w="3600"/>
-            <w:vAlign w:val="center"/>
-            <w:tcBorders>
-              <w:top w:val="single" w:sz="6" w:color="D9D9D9"/>
-              <w:left w:val="single" w:sz="6" w:color="D9D9D9"/>
-              <w:bottom w:val="single" w:sz="6" w:color="D9D9D9"/>
-              <w:right w:val="single" w:sz="6" w:color="D9D9D9"/>
-              <w:insideH w:val="single" w:sz="6" w:color="D9D9D9"/>
-              <w:insideV w:val="single" w:sz="6" w:color="D9D9D9"/>
-            </w:tcBorders>
-            <w:tcMar>
-              <w:top w:w="120" w:type="dxa"/>
-              <w:start w:w="130" w:type="dxa"/>
-              <w:bottom w:w="120" w:type="dxa"/>
-              <w:end w:w="130" w:type="dxa"/>
-            </w:tcMar>
-          </w:tcPr>
-          <w:p>
-            <w:pPr>
-              <w:spacing w:after="0" w:line="276" w:lineRule="auto"/>
-            </w:pPr>
-            <w:r>
-              <w:rPr>
-                <w:rFonts w:ascii="Arial Unicode MS" w:hAnsi="Arial Unicode MS" w:eastAsia="Arial Unicode MS"/>
-                <w:b w:val="0"/>
-                <w:color w:val="26322D"/>
-                <w:sz w:val="18"/>
-              </w:rPr>
-              <w:t>待确认故事 人生时间线 记忆地图</w:t>
-            </w:r>
-          </w:p>
-        </w:tc>
-        <w:tc>
-          <w:tcPr>
-            <w:tcW w:type="dxa" w:w="3600"/>
-            <w:vAlign w:val="center"/>
-            <w:tcBorders>
-              <w:top w:val="single" w:sz="6" w:color="D9D9D9"/>
-              <w:left w:val="single" w:sz="6" w:color="D9D9D9"/>
-              <w:bottom w:val="single" w:sz="6" w:color="D9D9D9"/>
-              <w:right w:val="single" w:sz="6" w:color="D9D9D9"/>
-              <w:insideH w:val="single" w:sz="6" w:color="D9D9D9"/>
-              <w:insideV w:val="single" w:sz="6" w:color="D9D9D9"/>
-            </w:tcBorders>
-            <w:tcMar>
-              <w:top w:w="120" w:type="dxa"/>
-              <w:start w:w="130" w:type="dxa"/>
-              <w:bottom w:w="120" w:type="dxa"/>
-              <w:end w:w="130" w:type="dxa"/>
-            </w:tcMar>
-          </w:tcPr>
-          <w:p>
-            <w:pPr>
-              <w:spacing w:after="0" w:line="276" w:lineRule="auto"/>
-            </w:pPr>
-            <w:r>
-              <w:rPr>
-                <w:rFonts w:ascii="Arial Unicode MS" w:hAnsi="Arial Unicode MS" w:eastAsia="Arial Unicode MS"/>
-                <w:b w:val="0"/>
-                <w:color w:val="26322D"/>
-                <w:sz w:val="18"/>
-              </w:rPr>
-              <w:t>更完整的原声故事 人物关系 可编辑回忆录</w:t>
-            </w:r>
-          </w:p>
-        </w:tc>
-      </w:tr>
-    </w:tbl>
-    <w:p>
-      <w:pPr>
-        <w:spacing w:after="40"/>
-      </w:pPr>
-    </w:p>
-    <w:p>
-      <w:pPr>
-        <w:pStyle w:val="Heading2"/>
-        <w:keepNext/>
-        <w:spacing w:before="240" w:after="160"/>
-      </w:pPr>
-      <w:r>
-        <w:rPr>
-          <w:rFonts w:ascii="PingFang SC" w:hAnsi="PingFang SC" w:eastAsia="PingFang SC"/>
-          <w:b/>
-          <w:color w:val="26322D"/>
-          <w:sz w:val="28"/>
-        </w:rPr>
-        <w:t>三层能力</w:t>
-      </w:r>
-    </w:p>
-    <w:p>
-      <w:pPr>
-        <w:spacing w:after="100" w:line="300" w:lineRule="auto"/>
-        <w:ind w:left="340" w:hanging="255"/>
-      </w:pPr>
-      <w:r>
-        <w:rPr>
-          <w:rFonts w:ascii="Arial Unicode MS" w:hAnsi="Arial Unicode MS" w:eastAsia="Arial Unicode MS"/>
-          <w:color w:val="26322D"/>
-          <w:sz w:val="20"/>
-        </w:rPr>
-        <w:t>1. 低门槛采集  按一下硬件珠珠开始或结束 灯光 震动和提示音让状态可感知 无手机也能先保存。</w:t>
-      </w:r>
-    </w:p>
-    <w:p>
-      <w:pPr>
-        <w:spacing w:after="100" w:line="300" w:lineRule="auto"/>
-        <w:ind w:left="340" w:hanging="255"/>
-      </w:pPr>
-      <w:r>
-        <w:rPr>
-          <w:rFonts w:ascii="Arial Unicode MS" w:hAnsi="Arial Unicode MS" w:eastAsia="Arial Unicode MS"/>
-          <w:color w:val="26322D"/>
-          <w:sz w:val="20"/>
-        </w:rPr>
-        <w:t>2. AI 自动整理  原声进入个人记忆库 AI 提取人物 地点 事件和来源证据 相似片段自动补充而不覆盖旧原声。</w:t>
-      </w:r>
-    </w:p>
-    <w:p>
-      <w:pPr>
-        <w:spacing w:after="100" w:line="300" w:lineRule="auto"/>
-        <w:ind w:left="340" w:hanging="255"/>
-      </w:pPr>
-      <w:r>
-        <w:rPr>
-          <w:rFonts w:ascii="Arial Unicode MS" w:hAnsi="Arial Unicode MS" w:eastAsia="Arial Unicode MS"/>
-          <w:color w:val="26322D"/>
-          <w:sz w:val="20"/>
-        </w:rPr>
-        <w:t>3. 家庭共编  用户选择后故事才进入家庭空间 家人可以继续补充照片 文字和新原声。</w:t>
-      </w:r>
-    </w:p>
-    <w:p>
-      <w:pPr>
-        <w:pStyle w:val="Heading2"/>
-        <w:keepNext/>
-        <w:spacing w:before="240" w:after="160"/>
-      </w:pPr>
-      <w:r>
-        <w:rPr>
-          <w:rFonts w:ascii="PingFang SC" w:hAnsi="PingFang SC" w:eastAsia="PingFang SC"/>
-          <w:b/>
-          <w:color w:val="26322D"/>
-          <w:sz w:val="28"/>
-        </w:rPr>
-        <w:t>记忆工作方式</w:t>
-      </w:r>
-    </w:p>
-    <w:tbl>
-      <w:tblPr>
-        <w:tblW w:type="auto" w:w="0"/>
-        <w:jc w:val="center"/>
-        <w:tblLayout w:type="fixed"/>
-        <w:tblLook w:firstColumn="1" w:firstRow="1" w:lastColumn="0" w:lastRow="0" w:noHBand="0" w:noVBand="1" w:val="04A0"/>
-      </w:tblPr>
-      <w:tblGrid>
-        <w:gridCol w:w="3249"/>
-        <w:gridCol w:w="3249"/>
-        <w:gridCol w:w="3249"/>
-      </w:tblGrid>
-      <w:tr>
+        <w:trPr>
+          <w:tblHeader w:val="true"/>
+        </w:trPr>
         <w:tc>
           <w:tcPr>
             <w:tcW w:type="dxa" w:w="1814"/>
@@ -1194,31 +111,31 @@
               <w:insideV w:val="single" w:sz="6" w:color="D9D9D9"/>
             </w:tcBorders>
             <w:tcMar>
-              <w:top w:w="120" w:type="dxa"/>
+              <w:top w:w="110" w:type="dxa"/>
               <w:start w:w="130" w:type="dxa"/>
-              <w:bottom w:w="120" w:type="dxa"/>
+              <w:bottom w:w="110" w:type="dxa"/>
               <w:end w:w="130" w:type="dxa"/>
             </w:tcMar>
-            <w:shd w:fill="55705E"/>
+            <w:shd w:fill="244A5A"/>
           </w:tcPr>
           <w:p>
             <w:pPr>
-              <w:spacing w:after="0" w:line="276" w:lineRule="auto"/>
+              <w:spacing w:after="0" w:line="283" w:lineRule="auto"/>
             </w:pPr>
             <w:r>
               <w:rPr>
                 <w:rFonts w:ascii="Arial Unicode MS" w:hAnsi="Arial Unicode MS" w:eastAsia="Arial Unicode MS"/>
                 <w:b/>
                 <w:color w:val="FFFFFF"/>
-                <w:sz w:val="18"/>
+                <w:sz w:val="19"/>
               </w:rPr>
-              <w:t>阶段</w:t>
+              <w:t>项目</w:t>
             </w:r>
           </w:p>
         </w:tc>
         <w:tc>
           <w:tcPr>
-            <w:tcW w:type="dxa" w:w="4139"/>
+            <w:tcW w:type="dxa" w:w="7540"/>
             <w:vAlign w:val="center"/>
             <w:tcBorders>
               <w:top w:val="single" w:sz="6" w:color="D9D9D9"/>
@@ -1229,60 +146,25 @@
               <w:insideV w:val="single" w:sz="6" w:color="D9D9D9"/>
             </w:tcBorders>
             <w:tcMar>
-              <w:top w:w="120" w:type="dxa"/>
+              <w:top w:w="110" w:type="dxa"/>
               <w:start w:w="130" w:type="dxa"/>
-              <w:bottom w:w="120" w:type="dxa"/>
+              <w:bottom w:w="110" w:type="dxa"/>
               <w:end w:w="130" w:type="dxa"/>
             </w:tcMar>
-            <w:shd w:fill="55705E"/>
+            <w:shd w:fill="244A5A"/>
           </w:tcPr>
           <w:p>
             <w:pPr>
-              <w:spacing w:after="0" w:line="276" w:lineRule="auto"/>
+              <w:spacing w:after="0" w:line="283" w:lineRule="auto"/>
             </w:pPr>
             <w:r>
               <w:rPr>
                 <w:rFonts w:ascii="Arial Unicode MS" w:hAnsi="Arial Unicode MS" w:eastAsia="Arial Unicode MS"/>
                 <w:b/>
                 <w:color w:val="FFFFFF"/>
-                <w:sz w:val="18"/>
+                <w:sz w:val="19"/>
               </w:rPr>
-              <w:t>内容</w:t>
-            </w:r>
-          </w:p>
-        </w:tc>
-        <w:tc>
-          <w:tcPr>
-            <w:tcW w:type="dxa" w:w="2721"/>
-            <w:vAlign w:val="center"/>
-            <w:tcBorders>
-              <w:top w:val="single" w:sz="6" w:color="D9D9D9"/>
-              <w:left w:val="single" w:sz="6" w:color="D9D9D9"/>
-              <w:bottom w:val="single" w:sz="6" w:color="D9D9D9"/>
-              <w:right w:val="single" w:sz="6" w:color="D9D9D9"/>
-              <w:insideH w:val="single" w:sz="6" w:color="D9D9D9"/>
-              <w:insideV w:val="single" w:sz="6" w:color="D9D9D9"/>
-            </w:tcBorders>
-            <w:tcMar>
-              <w:top w:w="120" w:type="dxa"/>
-              <w:start w:w="130" w:type="dxa"/>
-              <w:bottom w:w="120" w:type="dxa"/>
-              <w:end w:w="130" w:type="dxa"/>
-            </w:tcMar>
-            <w:shd w:fill="55705E"/>
-          </w:tcPr>
-          <w:p>
-            <w:pPr>
-              <w:spacing w:after="0" w:line="276" w:lineRule="auto"/>
-            </w:pPr>
-            <w:r>
-              <w:rPr>
-                <w:rFonts w:ascii="Arial Unicode MS" w:hAnsi="Arial Unicode MS" w:eastAsia="Arial Unicode MS"/>
-                <w:b/>
-                <w:color w:val="FFFFFF"/>
-                <w:sz w:val="18"/>
-              </w:rPr>
-              <w:t>用户控制</w:t>
+              <w:t>填写内容</w:t>
             </w:r>
           </w:p>
         </w:tc>
@@ -1301,30 +183,30 @@
               <w:insideV w:val="single" w:sz="6" w:color="D9D9D9"/>
             </w:tcBorders>
             <w:tcMar>
-              <w:top w:w="120" w:type="dxa"/>
+              <w:top w:w="110" w:type="dxa"/>
               <w:start w:w="130" w:type="dxa"/>
-              <w:bottom w:w="120" w:type="dxa"/>
+              <w:bottom w:w="110" w:type="dxa"/>
               <w:end w:w="130" w:type="dxa"/>
             </w:tcMar>
           </w:tcPr>
           <w:p>
             <w:pPr>
-              <w:spacing w:after="0" w:line="276" w:lineRule="auto"/>
+              <w:spacing w:after="0" w:line="283" w:lineRule="auto"/>
             </w:pPr>
             <w:r>
               <w:rPr>
                 <w:rFonts w:ascii="Arial Unicode MS" w:hAnsi="Arial Unicode MS" w:eastAsia="Arial Unicode MS"/>
                 <w:b w:val="0"/>
-                <w:color w:val="26322D"/>
-                <w:sz w:val="18"/>
+                <w:color w:val="202124"/>
+                <w:sz w:val="19"/>
               </w:rPr>
-              <w:t>原声片段</w:t>
+              <w:t>队名</w:t>
             </w:r>
           </w:p>
         </w:tc>
         <w:tc>
           <w:tcPr>
-            <w:tcW w:type="dxa" w:w="4139"/>
+            <w:tcW w:type="dxa" w:w="7540"/>
             <w:vAlign w:val="center"/>
             <w:tcBorders>
               <w:top w:val="single" w:sz="6" w:color="D9D9D9"/>
@@ -1335,58 +217,24 @@
               <w:insideV w:val="single" w:sz="6" w:color="D9D9D9"/>
             </w:tcBorders>
             <w:tcMar>
-              <w:top w:w="120" w:type="dxa"/>
+              <w:top w:w="110" w:type="dxa"/>
               <w:start w:w="130" w:type="dxa"/>
-              <w:bottom w:w="120" w:type="dxa"/>
+              <w:bottom w:w="110" w:type="dxa"/>
               <w:end w:w="130" w:type="dxa"/>
             </w:tcMar>
           </w:tcPr>
           <w:p>
             <w:pPr>
-              <w:spacing w:after="0" w:line="276" w:lineRule="auto"/>
+              <w:spacing w:after="0" w:line="283" w:lineRule="auto"/>
             </w:pPr>
             <w:r>
               <w:rPr>
                 <w:rFonts w:ascii="Arial Unicode MS" w:hAnsi="Arial Unicode MS" w:eastAsia="Arial Unicode MS"/>
                 <w:b w:val="0"/>
-                <w:color w:val="26322D"/>
-                <w:sz w:val="18"/>
+                <w:color w:val="202124"/>
+                <w:sz w:val="19"/>
               </w:rPr>
-              <w:t>录音 转写 时间与地点线索</w:t>
-            </w:r>
-          </w:p>
-        </w:tc>
-        <w:tc>
-          <w:tcPr>
-            <w:tcW w:type="dxa" w:w="2721"/>
-            <w:vAlign w:val="center"/>
-            <w:tcBorders>
-              <w:top w:val="single" w:sz="6" w:color="D9D9D9"/>
-              <w:left w:val="single" w:sz="6" w:color="D9D9D9"/>
-              <w:bottom w:val="single" w:sz="6" w:color="D9D9D9"/>
-              <w:right w:val="single" w:sz="6" w:color="D9D9D9"/>
-              <w:insideH w:val="single" w:sz="6" w:color="D9D9D9"/>
-              <w:insideV w:val="single" w:sz="6" w:color="D9D9D9"/>
-            </w:tcBorders>
-            <w:tcMar>
-              <w:top w:w="120" w:type="dxa"/>
-              <w:start w:w="130" w:type="dxa"/>
-              <w:bottom w:w="120" w:type="dxa"/>
-              <w:end w:w="130" w:type="dxa"/>
-            </w:tcMar>
-          </w:tcPr>
-          <w:p>
-            <w:pPr>
-              <w:spacing w:after="0" w:line="276" w:lineRule="auto"/>
-            </w:pPr>
-            <w:r>
-              <w:rPr>
-                <w:rFonts w:ascii="Arial Unicode MS" w:hAnsi="Arial Unicode MS" w:eastAsia="Arial Unicode MS"/>
-                <w:b w:val="0"/>
-                <w:color w:val="26322D"/>
-                <w:sz w:val="18"/>
-              </w:rPr>
-              <w:t>可回听 可删除 地点可关闭</w:t>
+              <w:t>【待填写队名】</w:t>
             </w:r>
           </w:p>
         </w:tc>
@@ -1405,31 +253,31 @@
               <w:insideV w:val="single" w:sz="6" w:color="D9D9D9"/>
             </w:tcBorders>
             <w:tcMar>
-              <w:top w:w="120" w:type="dxa"/>
+              <w:top w:w="110" w:type="dxa"/>
               <w:start w:w="130" w:type="dxa"/>
-              <w:bottom w:w="120" w:type="dxa"/>
+              <w:bottom w:w="110" w:type="dxa"/>
               <w:end w:w="130" w:type="dxa"/>
             </w:tcMar>
-            <w:shd w:fill="F7F7F5"/>
+            <w:shd w:fill="F7F8F8"/>
           </w:tcPr>
           <w:p>
             <w:pPr>
-              <w:spacing w:after="0" w:line="276" w:lineRule="auto"/>
+              <w:spacing w:after="0" w:line="283" w:lineRule="auto"/>
             </w:pPr>
             <w:r>
               <w:rPr>
                 <w:rFonts w:ascii="Arial Unicode MS" w:hAnsi="Arial Unicode MS" w:eastAsia="Arial Unicode MS"/>
                 <w:b w:val="0"/>
-                <w:color w:val="26322D"/>
-                <w:sz w:val="18"/>
+                <w:color w:val="202124"/>
+                <w:sz w:val="19"/>
               </w:rPr>
-              <w:t>个人长期记忆</w:t>
+              <w:t>意向赛道</w:t>
             </w:r>
           </w:p>
         </w:tc>
         <w:tc>
           <w:tcPr>
-            <w:tcW w:type="dxa" w:w="4139"/>
+            <w:tcW w:type="dxa" w:w="7540"/>
             <w:vAlign w:val="center"/>
             <w:tcBorders>
               <w:top w:val="single" w:sz="6" w:color="D9D9D9"/>
@@ -1440,60 +288,25 @@
               <w:insideV w:val="single" w:sz="6" w:color="D9D9D9"/>
             </w:tcBorders>
             <w:tcMar>
-              <w:top w:w="120" w:type="dxa"/>
+              <w:top w:w="110" w:type="dxa"/>
               <w:start w:w="130" w:type="dxa"/>
-              <w:bottom w:w="120" w:type="dxa"/>
+              <w:bottom w:w="110" w:type="dxa"/>
               <w:end w:w="130" w:type="dxa"/>
             </w:tcMar>
-            <w:shd w:fill="F7F7F5"/>
+            <w:shd w:fill="F7F8F8"/>
           </w:tcPr>
           <w:p>
             <w:pPr>
-              <w:spacing w:after="0" w:line="276" w:lineRule="auto"/>
+              <w:spacing w:after="0" w:line="283" w:lineRule="auto"/>
             </w:pPr>
             <w:r>
               <w:rPr>
                 <w:rFonts w:ascii="Arial Unicode MS" w:hAnsi="Arial Unicode MS" w:eastAsia="Arial Unicode MS"/>
                 <w:b w:val="0"/>
-                <w:color w:val="26322D"/>
-                <w:sz w:val="18"/>
+                <w:color w:val="202124"/>
+                <w:sz w:val="19"/>
               </w:rPr>
-              <w:t>人物 事件 故事 来源与版本</w:t>
-            </w:r>
-          </w:p>
-        </w:tc>
-        <w:tc>
-          <w:tcPr>
-            <w:tcW w:type="dxa" w:w="2721"/>
-            <w:vAlign w:val="center"/>
-            <w:tcBorders>
-              <w:top w:val="single" w:sz="6" w:color="D9D9D9"/>
-              <w:left w:val="single" w:sz="6" w:color="D9D9D9"/>
-              <w:bottom w:val="single" w:sz="6" w:color="D9D9D9"/>
-              <w:right w:val="single" w:sz="6" w:color="D9D9D9"/>
-              <w:insideH w:val="single" w:sz="6" w:color="D9D9D9"/>
-              <w:insideV w:val="single" w:sz="6" w:color="D9D9D9"/>
-            </w:tcBorders>
-            <w:tcMar>
-              <w:top w:w="120" w:type="dxa"/>
-              <w:start w:w="130" w:type="dxa"/>
-              <w:bottom w:w="120" w:type="dxa"/>
-              <w:end w:w="130" w:type="dxa"/>
-            </w:tcMar>
-            <w:shd w:fill="F7F7F5"/>
-          </w:tcPr>
-          <w:p>
-            <w:pPr>
-              <w:spacing w:after="0" w:line="276" w:lineRule="auto"/>
-            </w:pPr>
-            <w:r>
-              <w:rPr>
-                <w:rFonts w:ascii="Arial Unicode MS" w:hAnsi="Arial Unicode MS" w:eastAsia="Arial Unicode MS"/>
-                <w:b w:val="0"/>
-                <w:color w:val="26322D"/>
-                <w:sz w:val="18"/>
-              </w:rPr>
-              <w:t>自动沉淀 默认仅自己可见</w:t>
+              <w:t>智能录音</w:t>
             </w:r>
           </w:p>
         </w:tc>
@@ -1512,30 +325,30 @@
               <w:insideV w:val="single" w:sz="6" w:color="D9D9D9"/>
             </w:tcBorders>
             <w:tcMar>
-              <w:top w:w="120" w:type="dxa"/>
+              <w:top w:w="110" w:type="dxa"/>
               <w:start w:w="130" w:type="dxa"/>
-              <w:bottom w:w="120" w:type="dxa"/>
+              <w:bottom w:w="110" w:type="dxa"/>
               <w:end w:w="130" w:type="dxa"/>
             </w:tcMar>
           </w:tcPr>
           <w:p>
             <w:pPr>
-              <w:spacing w:after="0" w:line="276" w:lineRule="auto"/>
+              <w:spacing w:after="0" w:line="283" w:lineRule="auto"/>
             </w:pPr>
             <w:r>
               <w:rPr>
                 <w:rFonts w:ascii="Arial Unicode MS" w:hAnsi="Arial Unicode MS" w:eastAsia="Arial Unicode MS"/>
                 <w:b w:val="0"/>
-                <w:color w:val="26322D"/>
-                <w:sz w:val="18"/>
+                <w:color w:val="202124"/>
+                <w:sz w:val="19"/>
               </w:rPr>
-              <w:t>家庭共忆</w:t>
+              <w:t>一句话摘要</w:t>
             </w:r>
           </w:p>
         </w:tc>
         <w:tc>
           <w:tcPr>
-            <w:tcW w:type="dxa" w:w="4139"/>
+            <w:tcW w:type="dxa" w:w="7540"/>
             <w:vAlign w:val="center"/>
             <w:tcBorders>
               <w:top w:val="single" w:sz="6" w:color="D9D9D9"/>
@@ -1546,30 +359,32 @@
               <w:insideV w:val="single" w:sz="6" w:color="D9D9D9"/>
             </w:tcBorders>
             <w:tcMar>
-              <w:top w:w="120" w:type="dxa"/>
+              <w:top w:w="110" w:type="dxa"/>
               <w:start w:w="130" w:type="dxa"/>
-              <w:bottom w:w="120" w:type="dxa"/>
+              <w:bottom w:w="110" w:type="dxa"/>
               <w:end w:w="130" w:type="dxa"/>
             </w:tcMar>
           </w:tcPr>
           <w:p>
             <w:pPr>
-              <w:spacing w:after="0" w:line="276" w:lineRule="auto"/>
+              <w:spacing w:after="0" w:line="283" w:lineRule="auto"/>
             </w:pPr>
             <w:r>
               <w:rPr>
                 <w:rFonts w:ascii="Arial Unicode MS" w:hAnsi="Arial Unicode MS" w:eastAsia="Arial Unicode MS"/>
                 <w:b w:val="0"/>
-                <w:color w:val="26322D"/>
-                <w:sz w:val="18"/>
+                <w:color w:val="202124"/>
+                <w:sz w:val="19"/>
               </w:rPr>
-              <w:t>相关故事 开放式追问 继续讲述</w:t>
+              <w:t>寻忆是一枚面向老人及家庭的地点感知式声音记忆挂坠，用真实原声和 AI 长期记忆，把零散讲述整理成可回听、可共忆、可传承的生命故事。</w:t>
             </w:r>
           </w:p>
         </w:tc>
+      </w:tr>
+      <w:tr>
         <w:tc>
           <w:tcPr>
-            <w:tcW w:type="dxa" w:w="2721"/>
+            <w:tcW w:type="dxa" w:w="1814"/>
             <w:vAlign w:val="center"/>
             <w:tcBorders>
               <w:top w:val="single" w:sz="6" w:color="D9D9D9"/>
@@ -1580,24 +395,130 @@
               <w:insideV w:val="single" w:sz="6" w:color="D9D9D9"/>
             </w:tcBorders>
             <w:tcMar>
-              <w:top w:w="120" w:type="dxa"/>
+              <w:top w:w="110" w:type="dxa"/>
               <w:start w:w="130" w:type="dxa"/>
-              <w:bottom w:w="120" w:type="dxa"/>
+              <w:bottom w:w="110" w:type="dxa"/>
+              <w:end w:w="130" w:type="dxa"/>
+            </w:tcMar>
+            <w:shd w:fill="F7F8F8"/>
+          </w:tcPr>
+          <w:p>
+            <w:pPr>
+              <w:spacing w:after="0" w:line="283" w:lineRule="auto"/>
+            </w:pPr>
+            <w:r>
+              <w:rPr>
+                <w:rFonts w:ascii="Arial Unicode MS" w:hAnsi="Arial Unicode MS" w:eastAsia="Arial Unicode MS"/>
+                <w:b w:val="0"/>
+                <w:color w:val="202124"/>
+                <w:sz w:val="19"/>
+              </w:rPr>
+              <w:t>队长信息</w:t>
+            </w:r>
+          </w:p>
+        </w:tc>
+        <w:tc>
+          <w:tcPr>
+            <w:tcW w:type="dxa" w:w="7540"/>
+            <w:vAlign w:val="center"/>
+            <w:tcBorders>
+              <w:top w:val="single" w:sz="6" w:color="D9D9D9"/>
+              <w:left w:val="single" w:sz="6" w:color="D9D9D9"/>
+              <w:bottom w:val="single" w:sz="6" w:color="D9D9D9"/>
+              <w:right w:val="single" w:sz="6" w:color="D9D9D9"/>
+              <w:insideH w:val="single" w:sz="6" w:color="D9D9D9"/>
+              <w:insideV w:val="single" w:sz="6" w:color="D9D9D9"/>
+            </w:tcBorders>
+            <w:tcMar>
+              <w:top w:w="110" w:type="dxa"/>
+              <w:start w:w="130" w:type="dxa"/>
+              <w:bottom w:w="110" w:type="dxa"/>
+              <w:end w:w="130" w:type="dxa"/>
+            </w:tcMar>
+            <w:shd w:fill="F7F8F8"/>
+          </w:tcPr>
+          <w:p>
+            <w:pPr>
+              <w:spacing w:after="0" w:line="283" w:lineRule="auto"/>
+            </w:pPr>
+            <w:r>
+              <w:rPr>
+                <w:rFonts w:ascii="Arial Unicode MS" w:hAnsi="Arial Unicode MS" w:eastAsia="Arial Unicode MS"/>
+                <w:b w:val="0"/>
+                <w:color w:val="202124"/>
+                <w:sz w:val="19"/>
+              </w:rPr>
+              <w:t>【待填写：姓名 / 邮箱 / 手机号】</w:t>
+            </w:r>
+          </w:p>
+        </w:tc>
+      </w:tr>
+      <w:tr>
+        <w:tc>
+          <w:tcPr>
+            <w:tcW w:type="dxa" w:w="1814"/>
+            <w:vAlign w:val="center"/>
+            <w:tcBorders>
+              <w:top w:val="single" w:sz="6" w:color="D9D9D9"/>
+              <w:left w:val="single" w:sz="6" w:color="D9D9D9"/>
+              <w:bottom w:val="single" w:sz="6" w:color="D9D9D9"/>
+              <w:right w:val="single" w:sz="6" w:color="D9D9D9"/>
+              <w:insideH w:val="single" w:sz="6" w:color="D9D9D9"/>
+              <w:insideV w:val="single" w:sz="6" w:color="D9D9D9"/>
+            </w:tcBorders>
+            <w:tcMar>
+              <w:top w:w="110" w:type="dxa"/>
+              <w:start w:w="130" w:type="dxa"/>
+              <w:bottom w:w="110" w:type="dxa"/>
               <w:end w:w="130" w:type="dxa"/>
             </w:tcMar>
           </w:tcPr>
           <w:p>
             <w:pPr>
-              <w:spacing w:after="0" w:line="276" w:lineRule="auto"/>
+              <w:spacing w:after="0" w:line="283" w:lineRule="auto"/>
             </w:pPr>
             <w:r>
               <w:rPr>
                 <w:rFonts w:ascii="Arial Unicode MS" w:hAnsi="Arial Unicode MS" w:eastAsia="Arial Unicode MS"/>
                 <w:b w:val="0"/>
-                <w:color w:val="26322D"/>
-                <w:sz w:val="18"/>
+                <w:color w:val="202124"/>
+                <w:sz w:val="19"/>
               </w:rPr>
-              <w:t>主动加入 可撤回分享</w:t>
+              <w:t>成员介绍 &amp; 分工</w:t>
+            </w:r>
+          </w:p>
+        </w:tc>
+        <w:tc>
+          <w:tcPr>
+            <w:tcW w:type="dxa" w:w="7540"/>
+            <w:vAlign w:val="center"/>
+            <w:tcBorders>
+              <w:top w:val="single" w:sz="6" w:color="D9D9D9"/>
+              <w:left w:val="single" w:sz="6" w:color="D9D9D9"/>
+              <w:bottom w:val="single" w:sz="6" w:color="D9D9D9"/>
+              <w:right w:val="single" w:sz="6" w:color="D9D9D9"/>
+              <w:insideH w:val="single" w:sz="6" w:color="D9D9D9"/>
+              <w:insideV w:val="single" w:sz="6" w:color="D9D9D9"/>
+            </w:tcBorders>
+            <w:tcMar>
+              <w:top w:w="110" w:type="dxa"/>
+              <w:start w:w="130" w:type="dxa"/>
+              <w:bottom w:w="110" w:type="dxa"/>
+              <w:end w:w="130" w:type="dxa"/>
+            </w:tcMar>
+          </w:tcPr>
+          <w:p>
+            <w:pPr>
+              <w:spacing w:after="0" w:line="283" w:lineRule="auto"/>
+            </w:pPr>
+            <w:r>
+              <w:rPr>
+                <w:rFonts w:ascii="Arial Unicode MS" w:hAnsi="Arial Unicode MS" w:eastAsia="Arial Unicode MS"/>
+                <w:b w:val="0"/>
+                <w:color w:val="202124"/>
+                <w:sz w:val="19"/>
+              </w:rPr>
+              <w:t>【待填写：2-4 人（含队长）的姓名、邮箱及分工】</w:t>
             </w:r>
           </w:p>
         </w:tc>
@@ -1605,155 +526,186 @@
     </w:tbl>
     <w:p>
       <w:pPr>
-        <w:spacing w:after="40"/>
+        <w:spacing w:after="20"/>
       </w:pPr>
     </w:p>
     <w:p>
       <w:pPr>
         <w:pStyle w:val="Heading1"/>
         <w:keepNext/>
-        <w:spacing w:before="360" w:after="160"/>
+        <w:spacing w:before="320" w:after="120"/>
       </w:pPr>
       <w:r>
         <w:rPr>
-          <w:rFonts w:ascii="PingFang SC" w:hAnsi="PingFang SC" w:eastAsia="PingFang SC"/>
+          <w:rFonts w:ascii="Arial Unicode MS" w:hAnsi="Arial Unicode MS" w:eastAsia="Arial Unicode MS"/>
           <w:b/>
-          <w:color w:val="26322D"/>
-          <w:sz w:val="36"/>
+          <w:color w:val="000000"/>
+          <w:sz w:val="34"/>
         </w:rPr>
-        <w:t>四 核心体验</w:t>
+        <w:t>二、方案成果展示【必须包含】</w:t>
       </w:r>
     </w:p>
     <w:p>
       <w:pPr>
         <w:pStyle w:val="Heading2"/>
         <w:keepNext/>
-        <w:spacing w:before="240" w:after="160"/>
+        <w:spacing w:before="220" w:after="120"/>
       </w:pPr>
       <w:r>
         <w:rPr>
-          <w:rFonts w:ascii="PingFang SC" w:hAnsi="PingFang SC" w:eastAsia="PingFang SC"/>
+          <w:rFonts w:ascii="Arial Unicode MS" w:hAnsi="Arial Unicode MS" w:eastAsia="Arial Unicode MS"/>
           <w:b/>
-          <w:color w:val="26322D"/>
-          <w:sz w:val="28"/>
+          <w:color w:val="000000"/>
+          <w:sz w:val="26"/>
         </w:rPr>
-        <w:t>声音从硬件回到手机</w:t>
+        <w:t>赛题理解</w:t>
       </w:r>
     </w:p>
     <w:p>
       <w:pPr>
-        <w:spacing w:after="140" w:line="331" w:lineRule="auto"/>
+        <w:spacing w:after="120" w:line="324" w:lineRule="auto"/>
       </w:pPr>
       <w:r>
         <w:rPr>
           <w:rFonts w:ascii="Arial Unicode MS" w:hAnsi="Arial Unicode MS" w:eastAsia="Arial Unicode MS"/>
-          <w:color w:val="26322D"/>
+          <w:b/>
+          <w:color w:val="202124"/>
           <w:sz w:val="21"/>
         </w:rPr>
-        <w:t>录音只由硬件珠珠的实体按键触发。App 不直接收音 而是呈现珠珠带回的原声 地点线索和整理结果。</w:t>
+        <w:t>对赛道命题的理解：</w:t>
+      </w:r>
+      <w:r>
+        <w:rPr>
+          <w:rFonts w:ascii="Arial Unicode MS" w:hAnsi="Arial Unicode MS" w:eastAsia="Arial Unicode MS"/>
+          <w:b w:val="0"/>
+          <w:color w:val="202124"/>
+          <w:sz w:val="21"/>
+        </w:rPr>
+        <w:t>智能录音不应只停留在「录音-转写-摘要」。在家庭场景中，更难保存的是老人散步、探亲或聊天时突然想起的一句话。如果只做单次摘要，就无法形成可长期理解、可再次回到的家庭记忆。</w:t>
+      </w:r>
+    </w:p>
+    <w:p>
+      <w:pPr>
+        <w:spacing w:after="120" w:line="324" w:lineRule="auto"/>
+      </w:pPr>
+      <w:r>
+        <w:rPr>
+          <w:rFonts w:ascii="Arial Unicode MS" w:hAnsi="Arial Unicode MS" w:eastAsia="Arial Unicode MS"/>
+          <w:b/>
+          <w:color w:val="202124"/>
+          <w:sz w:val="21"/>
+        </w:rPr>
+        <w:t>目标用户：</w:t>
+      </w:r>
+      <w:r>
+        <w:rPr>
+          <w:rFonts w:ascii="Arial Unicode MS" w:hAnsi="Arial Unicode MS" w:eastAsia="Arial Unicode MS"/>
+          <w:b w:val="0"/>
+          <w:color w:val="202124"/>
+          <w:sz w:val="21"/>
+        </w:rPr>
+        <w:t>60 岁以上、需要低门槛操作的老人；以及购买设备、陪伴回忆、整理和回听故事的子女与家庭成员。</w:t>
+      </w:r>
+    </w:p>
+    <w:p>
+      <w:pPr>
+        <w:spacing w:after="120" w:line="324" w:lineRule="auto"/>
+      </w:pPr>
+      <w:r>
+        <w:rPr>
+          <w:rFonts w:ascii="Arial Unicode MS" w:hAnsi="Arial Unicode MS" w:eastAsia="Arial Unicode MS"/>
+          <w:b/>
+          <w:color w:val="202124"/>
+          <w:sz w:val="21"/>
+        </w:rPr>
+        <w:t>核心矛盾：</w:t>
+      </w:r>
+      <w:r>
+        <w:rPr>
+          <w:rFonts w:ascii="Arial Unicode MS" w:hAnsi="Arial Unicode MS" w:eastAsia="Arial Unicode MS"/>
+          <w:b w:val="0"/>
+          <w:color w:val="202124"/>
+          <w:sz w:val="21"/>
+        </w:rPr>
+        <w:t>珍贵讲述最难留下的时刻，往往也是老人最不愿意学习复杂操作的时刻。子女想留住故事，但既不能实时陪伴，也很难从大量录音中持续整理。</w:t>
+      </w:r>
+    </w:p>
+    <w:p>
+      <w:pPr>
+        <w:pStyle w:val="ListBullet"/>
+        <w:spacing w:after="80" w:line="312" w:lineRule="auto"/>
+        <w:ind w:left="312" w:hanging="142"/>
+      </w:pPr>
+      <w:r>
+        <w:rPr>
+          <w:rFonts w:ascii="Arial Unicode MS" w:hAnsi="Arial Unicode MS" w:eastAsia="Arial Unicode MS"/>
+          <w:b w:val="0"/>
+          <w:color w:val="202124"/>
+          <w:sz w:val="20"/>
+        </w:rPr>
+        <w:t>老人端：App 录音步骤多，手机未常驻身边，想起的话容易错过。</w:t>
+      </w:r>
+    </w:p>
+    <w:p>
+      <w:pPr>
+        <w:pStyle w:val="ListBullet"/>
+        <w:spacing w:after="80" w:line="312" w:lineRule="auto"/>
+        <w:ind w:left="312" w:hanging="142"/>
+      </w:pPr>
+      <w:r>
+        <w:rPr>
+          <w:rFonts w:ascii="Arial Unicode MS" w:hAnsi="Arial Unicode MS" w:eastAsia="Arial Unicode MS"/>
+          <w:b w:val="0"/>
+          <w:color w:val="202124"/>
+          <w:sz w:val="20"/>
+        </w:rPr>
+        <w:t>家人端：单次转写只有文字，不知道它与哪个人、地方和往事有关。</w:t>
+      </w:r>
+    </w:p>
+    <w:p>
+      <w:pPr>
+        <w:pStyle w:val="ListBullet"/>
+        <w:spacing w:after="80" w:line="312" w:lineRule="auto"/>
+        <w:ind w:left="312" w:hanging="142"/>
+      </w:pPr>
+      <w:r>
+        <w:rPr>
+          <w:rFonts w:ascii="Arial Unicode MS" w:hAnsi="Arial Unicode MS" w:eastAsia="Arial Unicode MS"/>
+          <w:b w:val="0"/>
+          <w:color w:val="202124"/>
+          <w:sz w:val="20"/>
+        </w:rPr>
+        <w:t>体验端：过度追问容易让回忆变成考试；AI 补写还可能混淆真实原声。</w:t>
       </w:r>
     </w:p>
     <w:p>
       <w:pPr>
         <w:pStyle w:val="Heading2"/>
         <w:keepNext/>
-        <w:spacing w:before="240" w:after="160"/>
+        <w:spacing w:before="220" w:after="120"/>
       </w:pPr>
       <w:r>
         <w:rPr>
-          <w:rFonts w:ascii="PingFang SC" w:hAnsi="PingFang SC" w:eastAsia="PingFang SC"/>
+          <w:rFonts w:ascii="Arial Unicode MS" w:hAnsi="Arial Unicode MS" w:eastAsia="Arial Unicode MS"/>
           <w:b/>
-          <w:color w:val="26322D"/>
-          <w:sz w:val="28"/>
+          <w:color w:val="000000"/>
+          <w:sz w:val="26"/>
         </w:rPr>
-        <w:t>故事逐步浮现</w:t>
+        <w:t>具体方案说明（突出 AI 能力）</w:t>
       </w:r>
     </w:p>
     <w:p>
       <w:pPr>
-        <w:spacing w:after="140" w:line="331" w:lineRule="auto"/>
+        <w:spacing w:after="120" w:line="324" w:lineRule="auto"/>
       </w:pPr>
       <w:r>
         <w:rPr>
           <w:rFonts w:ascii="Arial Unicode MS" w:hAnsi="Arial Unicode MS" w:eastAsia="Arial Unicode MS"/>
-          <w:color w:val="26322D"/>
+          <w:b w:val="0"/>
+          <w:color w:val="202124"/>
           <w:sz w:val="21"/>
         </w:rPr>
-        <w:t>用户点击收下这段声音后 地点 人物和旧片段分阶段出现 最后与已有故事相认。这个过程既展示 AI 的价值 又避免把能力直接写成功能清单。</w:t>
-      </w:r>
-    </w:p>
-    <w:p>
-      <w:pPr>
-        <w:pStyle w:val="Heading2"/>
-        <w:keepNext/>
-        <w:spacing w:before="240" w:after="160"/>
-      </w:pPr>
-      <w:r>
-        <w:rPr>
-          <w:rFonts w:ascii="PingFang SC" w:hAnsi="PingFang SC" w:eastAsia="PingFang SC"/>
-          <w:b/>
-          <w:color w:val="26322D"/>
-          <w:sz w:val="28"/>
-        </w:rPr>
-        <w:t>每句话都能回到原声</w:t>
-      </w:r>
-    </w:p>
-    <w:p>
-      <w:pPr>
-        <w:spacing w:after="140" w:line="331" w:lineRule="auto"/>
-      </w:pPr>
-      <w:r>
-        <w:rPr>
-          <w:rFonts w:ascii="Arial Unicode MS" w:hAnsi="Arial Unicode MS" w:eastAsia="Arial Unicode MS"/>
-          <w:color w:val="26322D"/>
-          <w:sz w:val="21"/>
-        </w:rPr>
-        <w:t>故事页支持播放真实原声 并展开查看每条信息来自哪次讲述。无法确认的年份与人物关系明确显示不确定 AI 不猜测。</w:t>
-      </w:r>
-    </w:p>
-    <w:p>
-      <w:pPr>
-        <w:pStyle w:val="Heading2"/>
-        <w:keepNext/>
-        <w:spacing w:before="240" w:after="160"/>
-      </w:pPr>
-      <w:r>
-        <w:rPr>
-          <w:rFonts w:ascii="PingFang SC" w:hAnsi="PingFang SC" w:eastAsia="PingFang SC"/>
-          <w:b/>
-          <w:color w:val="26322D"/>
-          <w:sz w:val="28"/>
-        </w:rPr>
-        <w:t>家人先听再问</w:t>
-      </w:r>
-    </w:p>
-    <w:p>
-      <w:pPr>
-        <w:spacing w:after="140" w:line="331" w:lineRule="auto"/>
-      </w:pPr>
-      <w:r>
-        <w:rPr>
-          <w:rFonts w:ascii="Arial Unicode MS" w:hAnsi="Arial Unicode MS" w:eastAsia="Arial Unicode MS"/>
-          <w:color w:val="26322D"/>
-          <w:sz w:val="21"/>
-        </w:rPr>
-        <w:t>一起听模式先让家人听老人说完。谈话出现停顿后 系统才递出一句可忽略 可切换的开放式追问。AI 是倾听的第三方 不是考问者。</w:t>
-      </w:r>
-    </w:p>
-    <w:p>
-      <w:pPr>
-        <w:pStyle w:val="Heading2"/>
-        <w:keepNext/>
-        <w:spacing w:before="240" w:after="160"/>
-      </w:pPr>
-      <w:r>
-        <w:rPr>
-          <w:rFonts w:ascii="PingFang SC" w:hAnsi="PingFang SC" w:eastAsia="PingFang SC"/>
-          <w:b/>
-          <w:color w:val="26322D"/>
-          <w:sz w:val="28"/>
-        </w:rPr>
-        <w:t>示例故事</w:t>
+        <w:t>寻忆在安克录音豆的可穿戴录音基础上，把「记录一次谈话」升级为「连接一生故事」。录音由手机挂绳上的单颗记忆珠发起，App 只负责接收、整理、回听与家庭共忆。</w:t>
       </w:r>
     </w:p>
     <w:tbl>
@@ -1764,13 +716,18 @@
         <w:tblLook w:firstColumn="1" w:firstRow="1" w:lastColumn="0" w:lastRow="0" w:noHBand="0" w:noVBand="1" w:val="04A0"/>
       </w:tblPr>
       <w:tblGrid>
-        <w:gridCol w:w="4873"/>
-        <w:gridCol w:w="4873"/>
+        <w:gridCol w:w="2493"/>
+        <w:gridCol w:w="2493"/>
+        <w:gridCol w:w="2493"/>
+        <w:gridCol w:w="2493"/>
       </w:tblGrid>
       <w:tr>
+        <w:trPr>
+          <w:tblHeader w:val="true"/>
+        </w:trPr>
         <w:tc>
           <w:tcPr>
-            <w:tcW w:type="dxa" w:w="1984"/>
+            <w:tcW w:type="dxa" w:w="2324"/>
             <w:vAlign w:val="center"/>
             <w:tcBorders>
               <w:top w:val="single" w:sz="6" w:color="D9D9D9"/>
@@ -1781,16 +738,16 @@
               <w:insideV w:val="single" w:sz="6" w:color="D9D9D9"/>
             </w:tcBorders>
             <w:tcMar>
-              <w:top w:w="120" w:type="dxa"/>
+              <w:top w:w="110" w:type="dxa"/>
               <w:start w:w="130" w:type="dxa"/>
-              <w:bottom w:w="120" w:type="dxa"/>
+              <w:bottom w:w="110" w:type="dxa"/>
               <w:end w:w="130" w:type="dxa"/>
             </w:tcMar>
-            <w:shd w:fill="B75B48"/>
+            <w:shd w:fill="244A5A"/>
           </w:tcPr>
           <w:p>
             <w:pPr>
-              <w:spacing w:after="0" w:line="276" w:lineRule="auto"/>
+              <w:spacing w:after="0" w:line="283" w:lineRule="auto"/>
             </w:pPr>
             <w:r>
               <w:rPr>
@@ -1799,13 +756,13 @@
                 <w:color w:val="FFFFFF"/>
                 <w:sz w:val="18"/>
               </w:rPr>
-              <w:t>字段</w:t>
+              <w:t>真实原声</w:t>
             </w:r>
           </w:p>
         </w:tc>
         <w:tc>
           <w:tcPr>
-            <w:tcW w:type="dxa" w:w="6690"/>
+            <w:tcW w:type="dxa" w:w="2324"/>
             <w:vAlign w:val="center"/>
             <w:tcBorders>
               <w:top w:val="single" w:sz="6" w:color="D9D9D9"/>
@@ -1816,16 +773,16 @@
               <w:insideV w:val="single" w:sz="6" w:color="D9D9D9"/>
             </w:tcBorders>
             <w:tcMar>
-              <w:top w:w="120" w:type="dxa"/>
+              <w:top w:w="110" w:type="dxa"/>
               <w:start w:w="130" w:type="dxa"/>
-              <w:bottom w:w="120" w:type="dxa"/>
+              <w:bottom w:w="110" w:type="dxa"/>
               <w:end w:w="130" w:type="dxa"/>
             </w:tcMar>
-            <w:shd w:fill="B75B48"/>
+            <w:shd w:fill="244A5A"/>
           </w:tcPr>
           <w:p>
             <w:pPr>
-              <w:spacing w:after="0" w:line="276" w:lineRule="auto"/>
+              <w:spacing w:after="0" w:line="283" w:lineRule="auto"/>
             </w:pPr>
             <w:r>
               <w:rPr>
@@ -1834,15 +791,13 @@
                 <w:color w:val="FFFFFF"/>
                 <w:sz w:val="18"/>
               </w:rPr>
-              <w:t>内容</w:t>
+              <w:t>语义与地点线索</w:t>
             </w:r>
           </w:p>
         </w:tc>
-      </w:tr>
-      <w:tr>
         <w:tc>
           <w:tcPr>
-            <w:tcW w:type="dxa" w:w="1984"/>
+            <w:tcW w:type="dxa" w:w="2324"/>
             <w:vAlign w:val="center"/>
             <w:tcBorders>
               <w:top w:val="single" w:sz="6" w:color="D9D9D9"/>
@@ -1853,30 +808,31 @@
               <w:insideV w:val="single" w:sz="6" w:color="D9D9D9"/>
             </w:tcBorders>
             <w:tcMar>
-              <w:top w:w="120" w:type="dxa"/>
+              <w:top w:w="110" w:type="dxa"/>
               <w:start w:w="130" w:type="dxa"/>
-              <w:bottom w:w="120" w:type="dxa"/>
+              <w:bottom w:w="110" w:type="dxa"/>
               <w:end w:w="130" w:type="dxa"/>
             </w:tcMar>
+            <w:shd w:fill="244A5A"/>
           </w:tcPr>
           <w:p>
             <w:pPr>
-              <w:spacing w:after="0" w:line="276" w:lineRule="auto"/>
+              <w:spacing w:after="0" w:line="283" w:lineRule="auto"/>
             </w:pPr>
             <w:r>
               <w:rPr>
                 <w:rFonts w:ascii="Arial Unicode MS" w:hAnsi="Arial Unicode MS" w:eastAsia="Arial Unicode MS"/>
-                <w:b w:val="0"/>
-                <w:color w:val="26322D"/>
+                <w:b/>
+                <w:color w:val="FFFFFF"/>
                 <w:sz w:val="18"/>
               </w:rPr>
-              <w:t>故事标题</w:t>
+              <w:t>AI 长期记忆</w:t>
             </w:r>
           </w:p>
         </w:tc>
         <w:tc>
           <w:tcPr>
-            <w:tcW w:type="dxa" w:w="6690"/>
+            <w:tcW w:type="dxa" w:w="2324"/>
             <w:vAlign w:val="center"/>
             <w:tcBorders>
               <w:top w:val="single" w:sz="6" w:color="D9D9D9"/>
@@ -1887,24 +843,25 @@
               <w:insideV w:val="single" w:sz="6" w:color="D9D9D9"/>
             </w:tcBorders>
             <w:tcMar>
-              <w:top w:w="120" w:type="dxa"/>
+              <w:top w:w="110" w:type="dxa"/>
               <w:start w:w="130" w:type="dxa"/>
-              <w:bottom w:w="120" w:type="dxa"/>
+              <w:bottom w:w="110" w:type="dxa"/>
               <w:end w:w="130" w:type="dxa"/>
             </w:tcMar>
+            <w:shd w:fill="244A5A"/>
           </w:tcPr>
           <w:p>
             <w:pPr>
-              <w:spacing w:after="0" w:line="276" w:lineRule="auto"/>
+              <w:spacing w:after="0" w:line="283" w:lineRule="auto"/>
             </w:pPr>
             <w:r>
               <w:rPr>
                 <w:rFonts w:ascii="Arial Unicode MS" w:hAnsi="Arial Unicode MS" w:eastAsia="Arial Unicode MS"/>
-                <w:b w:val="0"/>
-                <w:color w:val="26322D"/>
+                <w:b/>
+                <w:color w:val="FFFFFF"/>
                 <w:sz w:val="18"/>
               </w:rPr>
-              <w:t>第一次和爷爷看电影</w:t>
+              <w:t>家庭共忆</w:t>
             </w:r>
           </w:p>
         </w:tc>
@@ -1912,7 +869,7 @@
       <w:tr>
         <w:tc>
           <w:tcPr>
-            <w:tcW w:type="dxa" w:w="1984"/>
+            <w:tcW w:type="dxa" w:w="2324"/>
             <w:vAlign w:val="center"/>
             <w:tcBorders>
               <w:top w:val="single" w:sz="6" w:color="D9D9D9"/>
@@ -1923,31 +880,32 @@
               <w:insideV w:val="single" w:sz="6" w:color="D9D9D9"/>
             </w:tcBorders>
             <w:tcMar>
-              <w:top w:w="120" w:type="dxa"/>
+              <w:top w:w="110" w:type="dxa"/>
               <w:start w:w="130" w:type="dxa"/>
-              <w:bottom w:w="120" w:type="dxa"/>
+              <w:bottom w:w="110" w:type="dxa"/>
               <w:end w:w="130" w:type="dxa"/>
             </w:tcMar>
-            <w:shd w:fill="F7F7F5"/>
           </w:tcPr>
           <w:p>
             <w:pPr>
-              <w:spacing w:after="0" w:line="276" w:lineRule="auto"/>
+              <w:spacing w:after="0" w:line="283" w:lineRule="auto"/>
             </w:pPr>
             <w:r>
               <w:rPr>
                 <w:rFonts w:ascii="Arial Unicode MS" w:hAnsi="Arial Unicode MS" w:eastAsia="Arial Unicode MS"/>
                 <w:b w:val="0"/>
-                <w:color w:val="26322D"/>
+                <w:color w:val="202124"/>
                 <w:sz w:val="18"/>
               </w:rPr>
-              <w:t>人物</w:t>
+              <w:t>珠珠一键录音</w:t>
+              <w:br/>
+              <w:t>离线保存</w:t>
             </w:r>
           </w:p>
         </w:tc>
         <w:tc>
           <w:tcPr>
-            <w:tcW w:type="dxa" w:w="6690"/>
+            <w:tcW w:type="dxa" w:w="2324"/>
             <w:vAlign w:val="center"/>
             <w:tcBorders>
               <w:top w:val="single" w:sz="6" w:color="D9D9D9"/>
@@ -1958,33 +916,32 @@
               <w:insideV w:val="single" w:sz="6" w:color="D9D9D9"/>
             </w:tcBorders>
             <w:tcMar>
-              <w:top w:w="120" w:type="dxa"/>
+              <w:top w:w="110" w:type="dxa"/>
               <w:start w:w="130" w:type="dxa"/>
-              <w:bottom w:w="120" w:type="dxa"/>
+              <w:bottom w:w="110" w:type="dxa"/>
               <w:end w:w="130" w:type="dxa"/>
             </w:tcMar>
-            <w:shd w:fill="F7F7F5"/>
           </w:tcPr>
           <w:p>
             <w:pPr>
-              <w:spacing w:after="0" w:line="276" w:lineRule="auto"/>
+              <w:spacing w:after="0" w:line="283" w:lineRule="auto"/>
             </w:pPr>
             <w:r>
               <w:rPr>
                 <w:rFonts w:ascii="Arial Unicode MS" w:hAnsi="Arial Unicode MS" w:eastAsia="Arial Unicode MS"/>
                 <w:b w:val="0"/>
-                <w:color w:val="26322D"/>
+                <w:color w:val="202124"/>
                 <w:sz w:val="18"/>
               </w:rPr>
-              <w:t>奶奶 爷爷</w:t>
+              <w:t>转写</w:t>
+              <w:br/>
+              <w:t>时间 + 可选地点</w:t>
             </w:r>
           </w:p>
         </w:tc>
-      </w:tr>
-      <w:tr>
         <w:tc>
           <w:tcPr>
-            <w:tcW w:type="dxa" w:w="1984"/>
+            <w:tcW w:type="dxa" w:w="2324"/>
             <w:vAlign w:val="center"/>
             <w:tcBorders>
               <w:top w:val="single" w:sz="6" w:color="D9D9D9"/>
@@ -1995,30 +952,32 @@
               <w:insideV w:val="single" w:sz="6" w:color="D9D9D9"/>
             </w:tcBorders>
             <w:tcMar>
-              <w:top w:w="120" w:type="dxa"/>
+              <w:top w:w="110" w:type="dxa"/>
               <w:start w:w="130" w:type="dxa"/>
-              <w:bottom w:w="120" w:type="dxa"/>
+              <w:bottom w:w="110" w:type="dxa"/>
               <w:end w:w="130" w:type="dxa"/>
             </w:tcMar>
           </w:tcPr>
           <w:p>
             <w:pPr>
-              <w:spacing w:after="0" w:line="276" w:lineRule="auto"/>
+              <w:spacing w:after="0" w:line="283" w:lineRule="auto"/>
             </w:pPr>
             <w:r>
               <w:rPr>
                 <w:rFonts w:ascii="Arial Unicode MS" w:hAnsi="Arial Unicode MS" w:eastAsia="Arial Unicode MS"/>
                 <w:b w:val="0"/>
-                <w:color w:val="26322D"/>
+                <w:color w:val="202124"/>
                 <w:sz w:val="18"/>
               </w:rPr>
-              <w:t>地点</w:t>
+              <w:t>人物 事件 地点</w:t>
+              <w:br/>
+              <w:t>片段自动聚合</w:t>
             </w:r>
           </w:p>
         </w:tc>
         <w:tc>
           <w:tcPr>
-            <w:tcW w:type="dxa" w:w="6690"/>
+            <w:tcW w:type="dxa" w:w="2324"/>
             <w:vAlign w:val="center"/>
             <w:tcBorders>
               <w:top w:val="single" w:sz="6" w:color="D9D9D9"/>
@@ -2029,32 +988,537 @@
               <w:insideV w:val="single" w:sz="6" w:color="D9D9D9"/>
             </w:tcBorders>
             <w:tcMar>
-              <w:top w:w="120" w:type="dxa"/>
+              <w:top w:w="110" w:type="dxa"/>
               <w:start w:w="130" w:type="dxa"/>
-              <w:bottom w:w="120" w:type="dxa"/>
+              <w:bottom w:w="110" w:type="dxa"/>
               <w:end w:w="130" w:type="dxa"/>
             </w:tcMar>
           </w:tcPr>
           <w:p>
             <w:pPr>
-              <w:spacing w:after="0" w:line="276" w:lineRule="auto"/>
+              <w:spacing w:after="0" w:line="283" w:lineRule="auto"/>
             </w:pPr>
             <w:r>
               <w:rPr>
                 <w:rFonts w:ascii="Arial Unicode MS" w:hAnsi="Arial Unicode MS" w:eastAsia="Arial Unicode MS"/>
                 <w:b w:val="0"/>
-                <w:color w:val="26322D"/>
+                <w:color w:val="202124"/>
                 <w:sz w:val="18"/>
               </w:rPr>
-              <w:t>旧电影院附近</w:t>
+              <w:t>播放原声</w:t>
+              <w:br/>
+              <w:t>一条开放式追问</w:t>
             </w:r>
           </w:p>
         </w:tc>
       </w:tr>
+    </w:tbl>
+    <w:p>
+      <w:pPr>
+        <w:spacing w:after="20"/>
+      </w:pPr>
+    </w:p>
+    <w:p>
+      <w:pPr>
+        <w:keepNext/>
+        <w:spacing w:before="180" w:after="80"/>
+      </w:pPr>
+      <w:r>
+        <w:rPr>
+          <w:rFonts w:ascii="Arial Unicode MS" w:hAnsi="Arial Unicode MS" w:eastAsia="Arial Unicode MS"/>
+          <w:b/>
+          <w:color w:val="244A5A"/>
+          <w:sz w:val="24"/>
+        </w:rPr>
+        <w:t>01  低门槛真声采集</w:t>
+      </w:r>
+    </w:p>
+    <w:p>
+      <w:pPr>
+        <w:spacing w:after="60" w:line="324" w:lineRule="auto"/>
+      </w:pPr>
+      <w:r>
+        <w:rPr>
+          <w:rFonts w:ascii="Arial Unicode MS" w:hAnsi="Arial Unicode MS" w:eastAsia="Arial Unicode MS"/>
+          <w:b/>
+          <w:color w:val="202124"/>
+          <w:sz w:val="21"/>
+        </w:rPr>
+        <w:t>做什么：</w:t>
+      </w:r>
+      <w:r>
+        <w:rPr>
+          <w:rFonts w:ascii="Arial Unicode MS" w:hAnsi="Arial Unicode MS" w:eastAsia="Arial Unicode MS"/>
+          <w:b w:val="0"/>
+          <w:color w:val="202124"/>
+          <w:sz w:val="21"/>
+        </w:rPr>
+        <w:t>老人在散步、见友或突然想起往事时，直接按下手机挂坠大小的记忆珠录音。</w:t>
+      </w:r>
+    </w:p>
+    <w:p>
+      <w:pPr>
+        <w:spacing w:after="60" w:line="324" w:lineRule="auto"/>
+      </w:pPr>
+      <w:r>
+        <w:rPr>
+          <w:rFonts w:ascii="Arial Unicode MS" w:hAnsi="Arial Unicode MS" w:eastAsia="Arial Unicode MS"/>
+          <w:b/>
+          <w:color w:val="202124"/>
+          <w:sz w:val="21"/>
+        </w:rPr>
+        <w:t>怎么做：</w:t>
+      </w:r>
+      <w:r>
+        <w:rPr>
+          <w:rFonts w:ascii="Arial Unicode MS" w:hAnsi="Arial Unicode MS" w:eastAsia="Arial Unicode MS"/>
+          <w:b w:val="0"/>
+          <w:color w:val="202124"/>
+          <w:sz w:val="21"/>
+        </w:rPr>
+        <w:t>单键开始/结束，灯光、震动和提示音反馈状态；无手机时离线保存，回到手机后再同步。地点按次授权，可关闭。</w:t>
+      </w:r>
+    </w:p>
+    <w:p>
+      <w:pPr>
+        <w:spacing w:after="60" w:line="324" w:lineRule="auto"/>
+      </w:pPr>
+      <w:r>
+        <w:rPr>
+          <w:rFonts w:ascii="Arial Unicode MS" w:hAnsi="Arial Unicode MS" w:eastAsia="Arial Unicode MS"/>
+          <w:b/>
+          <w:color w:val="202124"/>
+          <w:sz w:val="21"/>
+        </w:rPr>
+        <w:t>AI 作用：</w:t>
+      </w:r>
+      <w:r>
+        <w:rPr>
+          <w:rFonts w:ascii="Arial Unicode MS" w:hAnsi="Arial Unicode MS" w:eastAsia="Arial Unicode MS"/>
+          <w:b w:val="0"/>
+          <w:color w:val="202124"/>
+          <w:sz w:val="21"/>
+        </w:rPr>
+        <w:t>同步后进行语音识别和片段分段，但不在讲述中主动打断。</w:t>
+      </w:r>
+    </w:p>
+    <w:p>
+      <w:pPr>
+        <w:spacing w:after="60" w:line="324" w:lineRule="auto"/>
+      </w:pPr>
+      <w:r>
+        <w:rPr>
+          <w:rFonts w:ascii="Arial Unicode MS" w:hAnsi="Arial Unicode MS" w:eastAsia="Arial Unicode MS"/>
+          <w:b/>
+          <w:color w:val="202124"/>
+          <w:sz w:val="21"/>
+        </w:rPr>
+        <w:t>为什么这样做：</w:t>
+      </w:r>
+      <w:r>
+        <w:rPr>
+          <w:rFonts w:ascii="Arial Unicode MS" w:hAnsi="Arial Unicode MS" w:eastAsia="Arial Unicode MS"/>
+          <w:b w:val="0"/>
+          <w:color w:val="202124"/>
+          <w:sz w:val="21"/>
+        </w:rPr>
+        <w:t>把操作压缩到一个硬件动作，才能接住稍纵即逝的讲述。</w:t>
+      </w:r>
+    </w:p>
+    <w:p>
+      <w:pPr>
+        <w:jc w:val="center"/>
+      </w:pPr>
+      <w:r>
+        <w:drawing>
+          <wp:inline xmlns:a="http://schemas.openxmlformats.org/drawingml/2006/main" xmlns:pic="http://schemas.openxmlformats.org/drawingml/2006/picture">
+            <wp:extent cx="3024000" cy="2763549"/>
+            <wp:docPr id="1" name="Picture 1"/>
+            <wp:cNvGraphicFramePr>
+              <a:graphicFrameLocks noChangeAspect="1"/>
+            </wp:cNvGraphicFramePr>
+            <a:graphic>
+              <a:graphicData uri="http://schemas.openxmlformats.org/drawingml/2006/picture">
+                <pic:pic>
+                  <pic:nvPicPr>
+                    <pic:cNvPr id="0" name="xunyi-bean-product.png"/>
+                    <pic:cNvPicPr/>
+                  </pic:nvPicPr>
+                  <pic:blipFill>
+                    <a:blip r:embed="rId10"/>
+                    <a:stretch>
+                      <a:fillRect/>
+                    </a:stretch>
+                  </pic:blipFill>
+                  <pic:spPr>
+                    <a:xfrm>
+                      <a:off x="0" y="0"/>
+                      <a:ext cx="3024000" cy="2763549"/>
+                    </a:xfrm>
+                    <a:prstGeom prst="rect"/>
+                  </pic:spPr>
+                </pic:pic>
+              </a:graphicData>
+            </a:graphic>
+          </wp:inline>
+        </w:drawing>
+      </w:r>
+    </w:p>
+    <w:p>
+      <w:pPr>
+        <w:spacing w:after="80"/>
+        <w:jc w:val="center"/>
+      </w:pPr>
+      <w:r>
+        <w:rPr>
+          <w:rFonts w:ascii="Arial Unicode MS" w:hAnsi="Arial Unicode MS" w:eastAsia="Arial Unicode MS"/>
+          <w:b w:val="0"/>
+          <w:color w:val="5F6368"/>
+          <w:sz w:val="17"/>
+        </w:rPr>
+        <w:t>图 1  寻忆声音记忆珠概念图：单颗手机挂坠形态，而非额外的大块设备</w:t>
+      </w:r>
+    </w:p>
+    <w:p>
+      <w:pPr>
+        <w:keepNext/>
+        <w:spacing w:before="180" w:after="80"/>
+      </w:pPr>
+      <w:r>
+        <w:rPr>
+          <w:rFonts w:ascii="Arial Unicode MS" w:hAnsi="Arial Unicode MS" w:eastAsia="Arial Unicode MS"/>
+          <w:b/>
+          <w:color w:val="244A5A"/>
+          <w:sz w:val="24"/>
+        </w:rPr>
+        <w:t>02  AI 长期记忆自动沉淀</w:t>
+      </w:r>
+    </w:p>
+    <w:p>
+      <w:pPr>
+        <w:spacing w:after="60" w:line="324" w:lineRule="auto"/>
+      </w:pPr>
+      <w:r>
+        <w:rPr>
+          <w:rFonts w:ascii="Arial Unicode MS" w:hAnsi="Arial Unicode MS" w:eastAsia="Arial Unicode MS"/>
+          <w:b/>
+          <w:color w:val="202124"/>
+          <w:sz w:val="21"/>
+        </w:rPr>
+        <w:t>做什么：</w:t>
+      </w:r>
+      <w:r>
+        <w:rPr>
+          <w:rFonts w:ascii="Arial Unicode MS" w:hAnsi="Arial Unicode MS" w:eastAsia="Arial Unicode MS"/>
+          <w:b w:val="0"/>
+          <w:color w:val="202124"/>
+          <w:sz w:val="21"/>
+        </w:rPr>
+        <w:t>多次零散讲述被持续整理成人物、事件、地点、故事卡和来源证据，新片段自动补充旧故事。</w:t>
+      </w:r>
+    </w:p>
+    <w:p>
+      <w:pPr>
+        <w:spacing w:after="60" w:line="324" w:lineRule="auto"/>
+      </w:pPr>
+      <w:r>
+        <w:rPr>
+          <w:rFonts w:ascii="Arial Unicode MS" w:hAnsi="Arial Unicode MS" w:eastAsia="Arial Unicode MS"/>
+          <w:b/>
+          <w:color w:val="202124"/>
+          <w:sz w:val="21"/>
+        </w:rPr>
+        <w:t>怎么做：</w:t>
+      </w:r>
+      <w:r>
+        <w:rPr>
+          <w:rFonts w:ascii="Arial Unicode MS" w:hAnsi="Arial Unicode MS" w:eastAsia="Arial Unicode MS"/>
+          <w:b w:val="0"/>
+          <w:color w:val="202124"/>
+          <w:sz w:val="21"/>
+        </w:rPr>
+        <w:t>保留「原声片段层-个人长期记忆层-家庭共忆层」。新片段通过人物、语义、时间和可选地点与历史片段关联；冲突信息并列保留。</w:t>
+      </w:r>
+    </w:p>
+    <w:p>
+      <w:pPr>
+        <w:spacing w:after="60" w:line="324" w:lineRule="auto"/>
+      </w:pPr>
+      <w:r>
+        <w:rPr>
+          <w:rFonts w:ascii="Arial Unicode MS" w:hAnsi="Arial Unicode MS" w:eastAsia="Arial Unicode MS"/>
+          <w:b/>
+          <w:color w:val="202124"/>
+          <w:sz w:val="21"/>
+        </w:rPr>
+        <w:t>AI 作用：</w:t>
+      </w:r>
+      <w:r>
+        <w:rPr>
+          <w:rFonts w:ascii="Arial Unicode MS" w:hAnsi="Arial Unicode MS" w:eastAsia="Arial Unicode MS"/>
+          <w:b w:val="0"/>
+          <w:color w:val="202124"/>
+          <w:sz w:val="21"/>
+        </w:rPr>
+        <w:t>执行实体提取、记忆聚合、跨时间检索和故事草稿组织。自动沉淀只发生在个人记忆空间，不等于自动分享。</w:t>
+      </w:r>
+    </w:p>
+    <w:p>
+      <w:pPr>
+        <w:spacing w:after="60" w:line="324" w:lineRule="auto"/>
+      </w:pPr>
+      <w:r>
+        <w:rPr>
+          <w:rFonts w:ascii="Arial Unicode MS" w:hAnsi="Arial Unicode MS" w:eastAsia="Arial Unicode MS"/>
+          <w:b/>
+          <w:color w:val="202124"/>
+          <w:sz w:val="21"/>
+        </w:rPr>
+        <w:t>为什么这样做：</w:t>
+      </w:r>
+      <w:r>
+        <w:rPr>
+          <w:rFonts w:ascii="Arial Unicode MS" w:hAnsi="Arial Unicode MS" w:eastAsia="Arial Unicode MS"/>
+          <w:b w:val="0"/>
+          <w:color w:val="202124"/>
+          <w:sz w:val="21"/>
+        </w:rPr>
+        <w:t>家庭需要的不是更多录音文件，而是能回到原声、会持续生长的生命故事。</w:t>
+      </w:r>
+    </w:p>
+    <w:p>
+      <w:pPr>
+        <w:keepNext/>
+        <w:spacing w:before="180" w:after="80"/>
+      </w:pPr>
+      <w:r>
+        <w:rPr>
+          <w:rFonts w:ascii="Arial Unicode MS" w:hAnsi="Arial Unicode MS" w:eastAsia="Arial Unicode MS"/>
+          <w:b/>
+          <w:color w:val="244A5A"/>
+          <w:sz w:val="24"/>
+        </w:rPr>
+        <w:t>03  家庭共忆与非诱导追问</w:t>
+      </w:r>
+    </w:p>
+    <w:p>
+      <w:pPr>
+        <w:spacing w:after="60" w:line="324" w:lineRule="auto"/>
+      </w:pPr>
+      <w:r>
+        <w:rPr>
+          <w:rFonts w:ascii="Arial Unicode MS" w:hAnsi="Arial Unicode MS" w:eastAsia="Arial Unicode MS"/>
+          <w:b/>
+          <w:color w:val="202124"/>
+          <w:sz w:val="21"/>
+        </w:rPr>
+        <w:t>做什么：</w:t>
+      </w:r>
+      <w:r>
+        <w:rPr>
+          <w:rFonts w:ascii="Arial Unicode MS" w:hAnsi="Arial Unicode MS" w:eastAsia="Arial Unicode MS"/>
+          <w:b w:val="0"/>
+          <w:color w:val="202124"/>
+          <w:sz w:val="21"/>
+        </w:rPr>
+        <w:t>子女和老人一起回听时，系统先播放真实原声；只在谈话停顿后，给子女一条可忽略、可切换的开放式追问。</w:t>
+      </w:r>
+    </w:p>
+    <w:p>
+      <w:pPr>
+        <w:spacing w:after="60" w:line="324" w:lineRule="auto"/>
+      </w:pPr>
+      <w:r>
+        <w:rPr>
+          <w:rFonts w:ascii="Arial Unicode MS" w:hAnsi="Arial Unicode MS" w:eastAsia="Arial Unicode MS"/>
+          <w:b/>
+          <w:color w:val="202124"/>
+          <w:sz w:val="21"/>
+        </w:rPr>
+        <w:t>怎么做：</w:t>
+      </w:r>
+      <w:r>
+        <w:rPr>
+          <w:rFonts w:ascii="Arial Unicode MS" w:hAnsi="Arial Unicode MS" w:eastAsia="Arial Unicode MS"/>
+          <w:b w:val="0"/>
+          <w:color w:val="202124"/>
+          <w:sz w:val="21"/>
+        </w:rPr>
+        <w:t>根据当前讲述和已授权记忆，召回相关地点、人物或旧片段；新内容由用户选择后才进入家庭空间。</w:t>
+      </w:r>
+    </w:p>
+    <w:p>
+      <w:pPr>
+        <w:spacing w:after="60" w:line="324" w:lineRule="auto"/>
+      </w:pPr>
+      <w:r>
+        <w:rPr>
+          <w:rFonts w:ascii="Arial Unicode MS" w:hAnsi="Arial Unicode MS" w:eastAsia="Arial Unicode MS"/>
+          <w:b/>
+          <w:color w:val="202124"/>
+          <w:sz w:val="21"/>
+        </w:rPr>
+        <w:t>AI 作用：</w:t>
+      </w:r>
+      <w:r>
+        <w:rPr>
+          <w:rFonts w:ascii="Arial Unicode MS" w:hAnsi="Arial Unicode MS" w:eastAsia="Arial Unicode MS"/>
+          <w:b w:val="0"/>
+          <w:color w:val="202124"/>
+          <w:sz w:val="21"/>
+        </w:rPr>
+        <w:t>将长期上下文转换为非诱导问题，不猜测年份、人物关系或事实。</w:t>
+      </w:r>
+    </w:p>
+    <w:p>
+      <w:pPr>
+        <w:spacing w:after="60" w:line="324" w:lineRule="auto"/>
+      </w:pPr>
+      <w:r>
+        <w:rPr>
+          <w:rFonts w:ascii="Arial Unicode MS" w:hAnsi="Arial Unicode MS" w:eastAsia="Arial Unicode MS"/>
+          <w:b/>
+          <w:color w:val="202124"/>
+          <w:sz w:val="21"/>
+        </w:rPr>
+        <w:t>为什么这样做：</w:t>
+      </w:r>
+      <w:r>
+        <w:rPr>
+          <w:rFonts w:ascii="Arial Unicode MS" w:hAnsi="Arial Unicode MS" w:eastAsia="Arial Unicode MS"/>
+          <w:b w:val="0"/>
+          <w:color w:val="202124"/>
+          <w:sz w:val="21"/>
+        </w:rPr>
+        <w:t>AI 是帮家人「更会听」的第三者，而不是对老人进行记忆测试的主持人。</w:t>
+      </w:r>
+    </w:p>
+    <w:p>
+      <w:pPr>
+        <w:pStyle w:val="Heading2"/>
+        <w:keepNext/>
+        <w:spacing w:before="220" w:after="120"/>
+      </w:pPr>
+      <w:r>
+        <w:rPr>
+          <w:rFonts w:ascii="Arial Unicode MS" w:hAnsi="Arial Unicode MS" w:eastAsia="Arial Unicode MS"/>
+          <w:b/>
+          <w:color w:val="000000"/>
+          <w:sz w:val="26"/>
+        </w:rPr>
+        <w:t>方案价值与预期效果</w:t>
+      </w:r>
+    </w:p>
+    <w:p>
+      <w:pPr>
+        <w:spacing w:after="120" w:line="324" w:lineRule="auto"/>
+      </w:pPr>
+      <w:r>
+        <w:rPr>
+          <w:rFonts w:ascii="Arial Unicode MS" w:hAnsi="Arial Unicode MS" w:eastAsia="Arial Unicode MS"/>
+          <w:b/>
+          <w:color w:val="202124"/>
+          <w:sz w:val="21"/>
+        </w:rPr>
+        <w:t>用户价值：</w:t>
+      </w:r>
+      <w:r>
+        <w:rPr>
+          <w:rFonts w:ascii="Arial Unicode MS" w:hAnsi="Arial Unicode MS" w:eastAsia="Arial Unicode MS"/>
+          <w:b w:val="0"/>
+          <w:color w:val="202124"/>
+          <w:sz w:val="21"/>
+        </w:rPr>
+        <w:t>老人只需一个实体动作就能保留原声；子女无需手动翻找数小时录音，可从故事卡、人生时间线和记忆地图进入，并一键回到原声。</w:t>
+      </w:r>
+    </w:p>
+    <w:p>
+      <w:pPr>
+        <w:spacing w:after="120" w:line="324" w:lineRule="auto"/>
+      </w:pPr>
+      <w:r>
+        <w:rPr>
+          <w:rFonts w:ascii="Arial Unicode MS" w:hAnsi="Arial Unicode MS" w:eastAsia="Arial Unicode MS"/>
+          <w:b/>
+          <w:color w:val="202124"/>
+          <w:sz w:val="21"/>
+        </w:rPr>
+        <w:t>产品价值：</w:t>
+      </w:r>
+      <w:r>
+        <w:rPr>
+          <w:rFonts w:ascii="Arial Unicode MS" w:hAnsi="Arial Unicode MS" w:eastAsia="Arial Unicode MS"/>
+          <w:b w:val="0"/>
+          <w:color w:val="202124"/>
+          <w:sz w:val="21"/>
+        </w:rPr>
+        <w:t>把录音豆从会议/访谈效率工具，拓展为具有长期陪伴和家庭内容沉淀价值的声音入口，形成设备、App 和 AI 记忆的持续使用闭环。</w:t>
+      </w:r>
+    </w:p>
+    <w:p>
+      <w:pPr>
+        <w:spacing w:after="120" w:line="324" w:lineRule="auto"/>
+      </w:pPr>
+      <w:r>
+        <w:rPr>
+          <w:rFonts w:ascii="Arial Unicode MS" w:hAnsi="Arial Unicode MS" w:eastAsia="Arial Unicode MS"/>
+          <w:b/>
+          <w:color w:val="202124"/>
+          <w:sz w:val="21"/>
+        </w:rPr>
+        <w:t>首轮验证目标（非已实现结果）：</w:t>
+      </w:r>
+      <w:r>
+        <w:rPr>
+          <w:rFonts w:ascii="Arial Unicode MS" w:hAnsi="Arial Unicode MS" w:eastAsia="Arial Unicode MS"/>
+          <w:b w:val="0"/>
+          <w:color w:val="202124"/>
+          <w:sz w:val="21"/>
+        </w:rPr>
+        <w:t>用 5-8 组老人与子女家庭进行可用性测试，观察一键录音完成率、故事卡可理解度、回听/继续讲述意愿，以及对自动沉淀和家庭分享边界的理解。</w:t>
+      </w:r>
+    </w:p>
+    <w:p>
+      <w:pPr>
+        <w:spacing w:after="120" w:line="324" w:lineRule="auto"/>
+      </w:pPr>
+      <w:r>
+        <w:rPr>
+          <w:rFonts w:ascii="Arial Unicode MS" w:hAnsi="Arial Unicode MS" w:eastAsia="Arial Unicode MS"/>
+          <w:b/>
+          <w:color w:val="202124"/>
+          <w:sz w:val="21"/>
+        </w:rPr>
+        <w:t>24 小时内可演示原型：</w:t>
+      </w:r>
+      <w:r>
+        <w:rPr>
+          <w:rFonts w:ascii="Arial Unicode MS" w:hAnsi="Arial Unicode MS" w:eastAsia="Arial Unicode MS"/>
+          <w:b w:val="0"/>
+          <w:color w:val="202124"/>
+          <w:sz w:val="21"/>
+        </w:rPr>
+      </w:r>
+    </w:p>
+    <w:tbl>
+      <w:tblPr>
+        <w:tblW w:type="auto" w:w="0"/>
+        <w:jc w:val="center"/>
+        <w:tblLayout w:type="fixed"/>
+        <w:tblLook w:firstColumn="1" w:firstRow="1" w:lastColumn="0" w:lastRow="0" w:noHBand="0" w:noVBand="1" w:val="04A0"/>
+      </w:tblPr>
+      <w:tblGrid>
+        <w:gridCol w:w="3324"/>
+        <w:gridCol w:w="3324"/>
+        <w:gridCol w:w="3324"/>
+      </w:tblGrid>
       <w:tr>
+        <w:trPr>
+          <w:tblHeader w:val="true"/>
+        </w:trPr>
         <w:tc>
           <w:tcPr>
-            <w:tcW w:type="dxa" w:w="1984"/>
+            <w:tcW w:type="dxa" w:w="3118"/>
             <w:vAlign w:val="center"/>
             <w:tcBorders>
               <w:top w:val="single" w:sz="6" w:color="D9D9D9"/>
@@ -2065,31 +1529,31 @@
               <w:insideV w:val="single" w:sz="6" w:color="D9D9D9"/>
             </w:tcBorders>
             <w:tcMar>
-              <w:top w:w="120" w:type="dxa"/>
+              <w:top w:w="110" w:type="dxa"/>
               <w:start w:w="130" w:type="dxa"/>
-              <w:bottom w:w="120" w:type="dxa"/>
+              <w:bottom w:w="110" w:type="dxa"/>
               <w:end w:w="130" w:type="dxa"/>
             </w:tcMar>
-            <w:shd w:fill="F7F7F5"/>
+            <w:shd w:fill="244A5A"/>
           </w:tcPr>
           <w:p>
             <w:pPr>
-              <w:spacing w:after="0" w:line="276" w:lineRule="auto"/>
+              <w:spacing w:after="0" w:line="283" w:lineRule="auto"/>
             </w:pPr>
             <w:r>
               <w:rPr>
                 <w:rFonts w:ascii="Arial Unicode MS" w:hAnsi="Arial Unicode MS" w:eastAsia="Arial Unicode MS"/>
-                <w:b w:val="0"/>
-                <w:color w:val="26322D"/>
+                <w:b/>
+                <w:color w:val="FFFFFF"/>
                 <w:sz w:val="18"/>
               </w:rPr>
-              <w:t>时间</w:t>
+              <w:t>现在做（可演示）</w:t>
             </w:r>
           </w:p>
         </w:tc>
         <w:tc>
           <w:tcPr>
-            <w:tcW w:type="dxa" w:w="6690"/>
+            <w:tcW w:type="dxa" w:w="3118"/>
             <w:vAlign w:val="center"/>
             <w:tcBorders>
               <w:top w:val="single" w:sz="6" w:color="D9D9D9"/>
@@ -2100,350 +1564,16 @@
               <w:insideV w:val="single" w:sz="6" w:color="D9D9D9"/>
             </w:tcBorders>
             <w:tcMar>
-              <w:top w:w="120" w:type="dxa"/>
+              <w:top w:w="110" w:type="dxa"/>
               <w:start w:w="130" w:type="dxa"/>
-              <w:bottom w:w="120" w:type="dxa"/>
+              <w:bottom w:w="110" w:type="dxa"/>
               <w:end w:w="130" w:type="dxa"/>
             </w:tcMar>
-            <w:shd w:fill="F7F7F5"/>
+            <w:shd w:fill="244A5A"/>
           </w:tcPr>
           <w:p>
             <w:pPr>
-              <w:spacing w:after="0" w:line="276" w:lineRule="auto"/>
-            </w:pPr>
-            <w:r>
-              <w:rPr>
-                <w:rFonts w:ascii="Arial Unicode MS" w:hAnsi="Arial Unicode MS" w:eastAsia="Arial Unicode MS"/>
-                <w:b w:val="0"/>
-                <w:color w:val="26322D"/>
-                <w:sz w:val="18"/>
-              </w:rPr>
-              <w:t>未记录 不猜测</w:t>
-            </w:r>
-          </w:p>
-        </w:tc>
-      </w:tr>
-      <w:tr>
-        <w:tc>
-          <w:tcPr>
-            <w:tcW w:type="dxa" w:w="1984"/>
-            <w:vAlign w:val="center"/>
-            <w:tcBorders>
-              <w:top w:val="single" w:sz="6" w:color="D9D9D9"/>
-              <w:left w:val="single" w:sz="6" w:color="D9D9D9"/>
-              <w:bottom w:val="single" w:sz="6" w:color="D9D9D9"/>
-              <w:right w:val="single" w:sz="6" w:color="D9D9D9"/>
-              <w:insideH w:val="single" w:sz="6" w:color="D9D9D9"/>
-              <w:insideV w:val="single" w:sz="6" w:color="D9D9D9"/>
-            </w:tcBorders>
-            <w:tcMar>
-              <w:top w:w="120" w:type="dxa"/>
-              <w:start w:w="130" w:type="dxa"/>
-              <w:bottom w:w="120" w:type="dxa"/>
-              <w:end w:w="130" w:type="dxa"/>
-            </w:tcMar>
-          </w:tcPr>
-          <w:p>
-            <w:pPr>
-              <w:spacing w:after="0" w:line="276" w:lineRule="auto"/>
-            </w:pPr>
-            <w:r>
-              <w:rPr>
-                <w:rFonts w:ascii="Arial Unicode MS" w:hAnsi="Arial Unicode MS" w:eastAsia="Arial Unicode MS"/>
-                <w:b w:val="0"/>
-                <w:color w:val="26322D"/>
-                <w:sz w:val="18"/>
-              </w:rPr>
-              <w:t>原声证据</w:t>
-            </w:r>
-          </w:p>
-        </w:tc>
-        <w:tc>
-          <w:tcPr>
-            <w:tcW w:type="dxa" w:w="6690"/>
-            <w:vAlign w:val="center"/>
-            <w:tcBorders>
-              <w:top w:val="single" w:sz="6" w:color="D9D9D9"/>
-              <w:left w:val="single" w:sz="6" w:color="D9D9D9"/>
-              <w:bottom w:val="single" w:sz="6" w:color="D9D9D9"/>
-              <w:right w:val="single" w:sz="6" w:color="D9D9D9"/>
-              <w:insideH w:val="single" w:sz="6" w:color="D9D9D9"/>
-              <w:insideV w:val="single" w:sz="6" w:color="D9D9D9"/>
-            </w:tcBorders>
-            <w:tcMar>
-              <w:top w:w="120" w:type="dxa"/>
-              <w:start w:w="130" w:type="dxa"/>
-              <w:bottom w:w="120" w:type="dxa"/>
-              <w:end w:w="130" w:type="dxa"/>
-            </w:tcMar>
-          </w:tcPr>
-          <w:p>
-            <w:pPr>
-              <w:spacing w:after="0" w:line="276" w:lineRule="auto"/>
-            </w:pPr>
-            <w:r>
-              <w:rPr>
-                <w:rFonts w:ascii="Arial Unicode MS" w:hAnsi="Arial Unicode MS" w:eastAsia="Arial Unicode MS"/>
-                <w:b w:val="0"/>
-                <w:color w:val="26322D"/>
-                <w:sz w:val="18"/>
-              </w:rPr>
-              <w:t>我第一次和你爷爷看电影 就是在这里</w:t>
-            </w:r>
-          </w:p>
-        </w:tc>
-      </w:tr>
-      <w:tr>
-        <w:tc>
-          <w:tcPr>
-            <w:tcW w:type="dxa" w:w="1984"/>
-            <w:vAlign w:val="center"/>
-            <w:tcBorders>
-              <w:top w:val="single" w:sz="6" w:color="D9D9D9"/>
-              <w:left w:val="single" w:sz="6" w:color="D9D9D9"/>
-              <w:bottom w:val="single" w:sz="6" w:color="D9D9D9"/>
-              <w:right w:val="single" w:sz="6" w:color="D9D9D9"/>
-              <w:insideH w:val="single" w:sz="6" w:color="D9D9D9"/>
-              <w:insideV w:val="single" w:sz="6" w:color="D9D9D9"/>
-            </w:tcBorders>
-            <w:tcMar>
-              <w:top w:w="120" w:type="dxa"/>
-              <w:start w:w="130" w:type="dxa"/>
-              <w:bottom w:w="120" w:type="dxa"/>
-              <w:end w:w="130" w:type="dxa"/>
-            </w:tcMar>
-            <w:shd w:fill="F7F7F5"/>
-          </w:tcPr>
-          <w:p>
-            <w:pPr>
-              <w:spacing w:after="0" w:line="276" w:lineRule="auto"/>
-            </w:pPr>
-            <w:r>
-              <w:rPr>
-                <w:rFonts w:ascii="Arial Unicode MS" w:hAnsi="Arial Unicode MS" w:eastAsia="Arial Unicode MS"/>
-                <w:b w:val="0"/>
-                <w:color w:val="26322D"/>
-                <w:sz w:val="18"/>
-              </w:rPr>
-              <w:t>状态</w:t>
-            </w:r>
-          </w:p>
-        </w:tc>
-        <w:tc>
-          <w:tcPr>
-            <w:tcW w:type="dxa" w:w="6690"/>
-            <w:vAlign w:val="center"/>
-            <w:tcBorders>
-              <w:top w:val="single" w:sz="6" w:color="D9D9D9"/>
-              <w:left w:val="single" w:sz="6" w:color="D9D9D9"/>
-              <w:bottom w:val="single" w:sz="6" w:color="D9D9D9"/>
-              <w:right w:val="single" w:sz="6" w:color="D9D9D9"/>
-              <w:insideH w:val="single" w:sz="6" w:color="D9D9D9"/>
-              <w:insideV w:val="single" w:sz="6" w:color="D9D9D9"/>
-            </w:tcBorders>
-            <w:tcMar>
-              <w:top w:w="120" w:type="dxa"/>
-              <w:start w:w="130" w:type="dxa"/>
-              <w:bottom w:w="120" w:type="dxa"/>
-              <w:end w:w="130" w:type="dxa"/>
-            </w:tcMar>
-            <w:shd w:fill="F7F7F5"/>
-          </w:tcPr>
-          <w:p>
-            <w:pPr>
-              <w:spacing w:after="0" w:line="276" w:lineRule="auto"/>
-            </w:pPr>
-            <w:r>
-              <w:rPr>
-                <w:rFonts w:ascii="Arial Unicode MS" w:hAnsi="Arial Unicode MS" w:eastAsia="Arial Unicode MS"/>
-                <w:b w:val="0"/>
-                <w:color w:val="26322D"/>
-                <w:sz w:val="18"/>
-              </w:rPr>
-              <w:t>已在个人空间自动沉淀 可播放 修改 分享或彻底删除</w:t>
-            </w:r>
-          </w:p>
-        </w:tc>
-      </w:tr>
-    </w:tbl>
-    <w:p>
-      <w:pPr>
-        <w:spacing w:after="40"/>
-      </w:pPr>
-    </w:p>
-    <w:p>
-      <w:pPr>
-        <w:pStyle w:val="Heading1"/>
-        <w:keepNext/>
-        <w:spacing w:before="360" w:after="160"/>
-      </w:pPr>
-      <w:r>
-        <w:rPr>
-          <w:rFonts w:ascii="PingFang SC" w:hAnsi="PingFang SC" w:eastAsia="PingFang SC"/>
-          <w:b/>
-          <w:color w:val="26322D"/>
-          <w:sz w:val="36"/>
-        </w:rPr>
-        <w:t>五 创新与价值</w:t>
-      </w:r>
-    </w:p>
-    <w:p>
-      <w:pPr>
-        <w:spacing w:after="100" w:line="300" w:lineRule="auto"/>
-        <w:ind w:left="340" w:hanging="255"/>
-      </w:pPr>
-      <w:r>
-        <w:rPr>
-          <w:rFonts w:ascii="Arial Unicode MS" w:hAnsi="Arial Unicode MS" w:eastAsia="Arial Unicode MS"/>
-          <w:color w:val="26322D"/>
-          <w:sz w:val="20"/>
-        </w:rPr>
-        <w:t>1. 从一次谈话到一生故事  跨时间 跨录音 跨家庭成员组织记忆。</w:t>
-      </w:r>
-    </w:p>
-    <w:p>
-      <w:pPr>
-        <w:spacing w:after="100" w:line="300" w:lineRule="auto"/>
-        <w:ind w:left="340" w:hanging="255"/>
-      </w:pPr>
-      <w:r>
-        <w:rPr>
-          <w:rFonts w:ascii="Arial Unicode MS" w:hAnsi="Arial Unicode MS" w:eastAsia="Arial Unicode MS"/>
-          <w:color w:val="26322D"/>
-          <w:sz w:val="20"/>
-        </w:rPr>
-        <w:t>2. 从单次摘要到自动生长  新片段自动补充和召回 第二次讲述不必从零开始。</w:t>
-      </w:r>
-    </w:p>
-    <w:p>
-      <w:pPr>
-        <w:spacing w:after="100" w:line="300" w:lineRule="auto"/>
-        <w:ind w:left="340" w:hanging="255"/>
-      </w:pPr>
-      <w:r>
-        <w:rPr>
-          <w:rFonts w:ascii="Arial Unicode MS" w:hAnsi="Arial Unicode MS" w:eastAsia="Arial Unicode MS"/>
-          <w:color w:val="26322D"/>
-          <w:sz w:val="20"/>
-        </w:rPr>
-        <w:t>3. 真声可追溯  任何摘要都能回到原声证据 AI 不覆盖原始表达。</w:t>
-      </w:r>
-    </w:p>
-    <w:p>
-      <w:pPr>
-        <w:spacing w:after="100" w:line="300" w:lineRule="auto"/>
-        <w:ind w:left="340" w:hanging="255"/>
-      </w:pPr>
-      <w:r>
-        <w:rPr>
-          <w:rFonts w:ascii="Arial Unicode MS" w:hAnsi="Arial Unicode MS" w:eastAsia="Arial Unicode MS"/>
-          <w:color w:val="26322D"/>
-          <w:sz w:val="20"/>
-        </w:rPr>
-        <w:t>4. 地点是记忆索引而不是监控  一次性地点锚点可关闭 不保存完整行动轨迹。</w:t>
-      </w:r>
-    </w:p>
-    <w:p>
-      <w:pPr>
-        <w:spacing w:after="100" w:line="300" w:lineRule="auto"/>
-        <w:ind w:left="340" w:hanging="255"/>
-      </w:pPr>
-      <w:r>
-        <w:rPr>
-          <w:rFonts w:ascii="Arial Unicode MS" w:hAnsi="Arial Unicode MS" w:eastAsia="Arial Unicode MS"/>
-          <w:color w:val="26322D"/>
-          <w:sz w:val="20"/>
-        </w:rPr>
-        <w:t>5. 硬件愿意被长期携带  缩小为手机挂绳上的一颗珠珠 像平安挂件而不是额外设备。</w:t>
-      </w:r>
-    </w:p>
-    <w:p>
-      <w:pPr>
-        <w:pStyle w:val="Heading1"/>
-        <w:keepNext/>
-        <w:spacing w:before="360" w:after="160"/>
-      </w:pPr>
-      <w:r>
-        <w:rPr>
-          <w:rFonts w:ascii="PingFang SC" w:hAnsi="PingFang SC" w:eastAsia="PingFang SC"/>
-          <w:b/>
-          <w:color w:val="26322D"/>
-          <w:sz w:val="36"/>
-        </w:rPr>
-        <w:t>六 MVP 范围</w:t>
-      </w:r>
-    </w:p>
-    <w:tbl>
-      <w:tblPr>
-        <w:tblW w:type="auto" w:w="0"/>
-        <w:jc w:val="center"/>
-        <w:tblLayout w:type="fixed"/>
-        <w:tblLook w:firstColumn="1" w:firstRow="1" w:lastColumn="0" w:lastRow="0" w:noHBand="0" w:noVBand="1" w:val="04A0"/>
-      </w:tblPr>
-      <w:tblGrid>
-        <w:gridCol w:w="3249"/>
-        <w:gridCol w:w="3249"/>
-        <w:gridCol w:w="3249"/>
-      </w:tblGrid>
-      <w:tr>
-        <w:tc>
-          <w:tcPr>
-            <w:tcW w:type="dxa" w:w="2891"/>
-            <w:vAlign w:val="center"/>
-            <w:tcBorders>
-              <w:top w:val="single" w:sz="6" w:color="D9D9D9"/>
-              <w:left w:val="single" w:sz="6" w:color="D9D9D9"/>
-              <w:bottom w:val="single" w:sz="6" w:color="D9D9D9"/>
-              <w:right w:val="single" w:sz="6" w:color="D9D9D9"/>
-              <w:insideH w:val="single" w:sz="6" w:color="D9D9D9"/>
-              <w:insideV w:val="single" w:sz="6" w:color="D9D9D9"/>
-            </w:tcBorders>
-            <w:tcMar>
-              <w:top w:w="120" w:type="dxa"/>
-              <w:start w:w="130" w:type="dxa"/>
-              <w:bottom w:w="120" w:type="dxa"/>
-              <w:end w:w="130" w:type="dxa"/>
-            </w:tcMar>
-            <w:shd w:fill="55705E"/>
-          </w:tcPr>
-          <w:p>
-            <w:pPr>
-              <w:spacing w:after="0" w:line="276" w:lineRule="auto"/>
-            </w:pPr>
-            <w:r>
-              <w:rPr>
-                <w:rFonts w:ascii="Arial Unicode MS" w:hAnsi="Arial Unicode MS" w:eastAsia="Arial Unicode MS"/>
-                <w:b/>
-                <w:color w:val="FFFFFF"/>
-                <w:sz w:val="18"/>
-              </w:rPr>
-              <w:t>现在做</w:t>
-            </w:r>
-          </w:p>
-        </w:tc>
-        <w:tc>
-          <w:tcPr>
-            <w:tcW w:type="dxa" w:w="2891"/>
-            <w:vAlign w:val="center"/>
-            <w:tcBorders>
-              <w:top w:val="single" w:sz="6" w:color="D9D9D9"/>
-              <w:left w:val="single" w:sz="6" w:color="D9D9D9"/>
-              <w:bottom w:val="single" w:sz="6" w:color="D9D9D9"/>
-              <w:right w:val="single" w:sz="6" w:color="D9D9D9"/>
-              <w:insideH w:val="single" w:sz="6" w:color="D9D9D9"/>
-              <w:insideV w:val="single" w:sz="6" w:color="D9D9D9"/>
-            </w:tcBorders>
-            <w:tcMar>
-              <w:top w:w="120" w:type="dxa"/>
-              <w:start w:w="130" w:type="dxa"/>
-              <w:bottom w:w="120" w:type="dxa"/>
-              <w:end w:w="130" w:type="dxa"/>
-            </w:tcMar>
-            <w:shd w:fill="55705E"/>
-          </w:tcPr>
-          <w:p>
-            <w:pPr>
-              <w:spacing w:after="0" w:line="276" w:lineRule="auto"/>
+              <w:spacing w:after="0" w:line="283" w:lineRule="auto"/>
             </w:pPr>
             <w:r>
               <w:rPr>
@@ -2458,7 +1588,7 @@
         </w:tc>
         <w:tc>
           <w:tcPr>
-            <w:tcW w:type="dxa" w:w="2891"/>
+            <w:tcW w:type="dxa" w:w="3118"/>
             <w:vAlign w:val="center"/>
             <w:tcBorders>
               <w:top w:val="single" w:sz="6" w:color="D9D9D9"/>
@@ -2469,16 +1599,16 @@
               <w:insideV w:val="single" w:sz="6" w:color="D9D9D9"/>
             </w:tcBorders>
             <w:tcMar>
-              <w:top w:w="120" w:type="dxa"/>
+              <w:top w:w="110" w:type="dxa"/>
               <w:start w:w="130" w:type="dxa"/>
-              <w:bottom w:w="120" w:type="dxa"/>
+              <w:bottom w:w="110" w:type="dxa"/>
               <w:end w:w="130" w:type="dxa"/>
             </w:tcMar>
-            <w:shd w:fill="55705E"/>
+            <w:shd w:fill="244A5A"/>
           </w:tcPr>
           <w:p>
             <w:pPr>
-              <w:spacing w:after="0" w:line="276" w:lineRule="auto"/>
+              <w:spacing w:after="0" w:line="283" w:lineRule="auto"/>
             </w:pPr>
             <w:r>
               <w:rPr>
@@ -2495,7 +1625,7 @@
       <w:tr>
         <w:tc>
           <w:tcPr>
-            <w:tcW w:type="dxa" w:w="2891"/>
+            <w:tcW w:type="dxa" w:w="3118"/>
             <w:vAlign w:val="center"/>
             <w:tcBorders>
               <w:top w:val="single" w:sz="6" w:color="D9D9D9"/>
@@ -2506,30 +1636,40 @@
               <w:insideV w:val="single" w:sz="6" w:color="D9D9D9"/>
             </w:tcBorders>
             <w:tcMar>
-              <w:top w:w="120" w:type="dxa"/>
+              <w:top w:w="110" w:type="dxa"/>
               <w:start w:w="130" w:type="dxa"/>
-              <w:bottom w:w="120" w:type="dxa"/>
+              <w:bottom w:w="110" w:type="dxa"/>
               <w:end w:w="130" w:type="dxa"/>
             </w:tcMar>
           </w:tcPr>
           <w:p>
             <w:pPr>
-              <w:spacing w:after="0" w:line="276" w:lineRule="auto"/>
+              <w:spacing w:after="0" w:line="283" w:lineRule="auto"/>
             </w:pPr>
             <w:r>
               <w:rPr>
                 <w:rFonts w:ascii="Arial Unicode MS" w:hAnsi="Arial Unicode MS" w:eastAsia="Arial Unicode MS"/>
                 <w:b w:val="0"/>
-                <w:color w:val="26322D"/>
+                <w:color w:val="202124"/>
                 <w:sz w:val="18"/>
               </w:rPr>
-              <w:t>一键录音 离线保存 时间与可选地点锚点 手机同步 转写摘要 片段聚合 选择性家庭分享</w:t>
+              <w:t>硬件录音触发模拟</w:t>
+              <w:br/>
+              <w:t>待同步原声</w:t>
+              <w:br/>
+              <w:t>线索浮现</w:t>
+              <w:br/>
+              <w:t>记忆片段聚合</w:t>
+              <w:br/>
+              <w:t>原声追溯</w:t>
+              <w:br/>
+              <w:t>家庭共忆追问</w:t>
             </w:r>
           </w:p>
         </w:tc>
         <w:tc>
           <w:tcPr>
-            <w:tcW w:type="dxa" w:w="2891"/>
+            <w:tcW w:type="dxa" w:w="3118"/>
             <w:vAlign w:val="center"/>
             <w:tcBorders>
               <w:top w:val="single" w:sz="6" w:color="D9D9D9"/>
@@ -2540,30 +1680,38 @@
               <w:insideV w:val="single" w:sz="6" w:color="D9D9D9"/>
             </w:tcBorders>
             <w:tcMar>
-              <w:top w:w="120" w:type="dxa"/>
+              <w:top w:w="110" w:type="dxa"/>
               <w:start w:w="130" w:type="dxa"/>
-              <w:bottom w:w="120" w:type="dxa"/>
+              <w:bottom w:w="110" w:type="dxa"/>
               <w:end w:w="130" w:type="dxa"/>
             </w:tcMar>
           </w:tcPr>
           <w:p>
             <w:pPr>
-              <w:spacing w:after="0" w:line="276" w:lineRule="auto"/>
+              <w:spacing w:after="0" w:line="283" w:lineRule="auto"/>
             </w:pPr>
             <w:r>
               <w:rPr>
                 <w:rFonts w:ascii="Arial Unicode MS" w:hAnsi="Arial Unicode MS" w:eastAsia="Arial Unicode MS"/>
                 <w:b w:val="0"/>
-                <w:color w:val="26322D"/>
+                <w:color w:val="202124"/>
                 <w:sz w:val="18"/>
               </w:rPr>
-              <w:t>实时追问 人物识别 那年今日 照片与文字补充 音频回忆录</w:t>
+              <w:t>实时转写与追问</w:t>
+              <w:br/>
+              <w:t>人物识别</w:t>
+              <w:br/>
+              <w:t>那年今日</w:t>
+              <w:br/>
+              <w:t>照片/文字补充</w:t>
+              <w:br/>
+              <w:t>声音回忆录</w:t>
             </w:r>
           </w:p>
         </w:tc>
         <w:tc>
           <w:tcPr>
-            <w:tcW w:type="dxa" w:w="2891"/>
+            <w:tcW w:type="dxa" w:w="3118"/>
             <w:vAlign w:val="center"/>
             <w:tcBorders>
               <w:top w:val="single" w:sz="6" w:color="D9D9D9"/>
@@ -2574,24 +1722,30 @@
               <w:insideV w:val="single" w:sz="6" w:color="D9D9D9"/>
             </w:tcBorders>
             <w:tcMar>
-              <w:top w:w="120" w:type="dxa"/>
+              <w:top w:w="110" w:type="dxa"/>
               <w:start w:w="130" w:type="dxa"/>
-              <w:bottom w:w="120" w:type="dxa"/>
+              <w:bottom w:w="110" w:type="dxa"/>
               <w:end w:w="130" w:type="dxa"/>
             </w:tcMar>
           </w:tcPr>
           <w:p>
             <w:pPr>
-              <w:spacing w:after="0" w:line="276" w:lineRule="auto"/>
+              <w:spacing w:after="0" w:line="283" w:lineRule="auto"/>
             </w:pPr>
             <w:r>
               <w:rPr>
                 <w:rFonts w:ascii="Arial Unicode MS" w:hAnsi="Arial Unicode MS" w:eastAsia="Arial Unicode MS"/>
                 <w:b w:val="0"/>
-                <w:color w:val="26322D"/>
+                <w:color w:val="202124"/>
                 <w:sz w:val="18"/>
               </w:rPr>
-              <w:t>公共声音地图 旅游社区 长时间 AI 闲聊 硬件摄像头</w:t>
+              <w:t>公共声音地图</w:t>
+              <w:br/>
+              <w:t>泛文旅社区</w:t>
+              <w:br/>
+              <w:t>老人独自与云端 AI 长时间对话</w:t>
+              <w:br/>
+              <w:t>硬件摄像头</w:t>
             </w:r>
           </w:p>
         </w:tc>
@@ -2599,36 +1753,221 @@
     </w:tbl>
     <w:p>
       <w:pPr>
-        <w:spacing w:after="40"/>
+        <w:spacing w:after="20"/>
       </w:pPr>
+    </w:p>
+    <w:p>
+      <w:pPr>
+        <w:pStyle w:val="Heading2"/>
+        <w:keepNext/>
+        <w:spacing w:before="220" w:after="120"/>
+      </w:pPr>
+      <w:r>
+        <w:rPr>
+          <w:rFonts w:ascii="Arial Unicode MS" w:hAnsi="Arial Unicode MS" w:eastAsia="Arial Unicode MS"/>
+          <w:b/>
+          <w:color w:val="000000"/>
+          <w:sz w:val="26"/>
+        </w:rPr>
+        <w:t>方案优势 / 创新点</w:t>
+      </w:r>
+    </w:p>
+    <w:p>
+      <w:pPr>
+        <w:pStyle w:val="ListBullet"/>
+        <w:spacing w:after="80" w:line="312" w:lineRule="auto"/>
+        <w:ind w:left="312" w:hanging="142"/>
+      </w:pPr>
+      <w:r>
+        <w:rPr>
+          <w:rFonts w:ascii="Arial Unicode MS" w:hAnsi="Arial Unicode MS" w:eastAsia="Arial Unicode MS"/>
+          <w:b w:val="0"/>
+          <w:color w:val="202124"/>
+          <w:sz w:val="20"/>
+        </w:rPr>
+        <w:t>从单次摘要到会生长的长期记忆：AI 跨时间聚合多次讲述，新片段自动补充旧故事，但始终保留可追溯的原声底座。</w:t>
+      </w:r>
+    </w:p>
+    <w:p>
+      <w:pPr>
+        <w:pStyle w:val="ListBullet"/>
+        <w:spacing w:after="80" w:line="312" w:lineRule="auto"/>
+        <w:ind w:left="312" w:hanging="142"/>
+      </w:pPr>
+      <w:r>
+        <w:rPr>
+          <w:rFonts w:ascii="Arial Unicode MS" w:hAnsi="Arial Unicode MS" w:eastAsia="Arial Unicode MS"/>
+          <w:b w:val="0"/>
+          <w:color w:val="202124"/>
+          <w:sz w:val="20"/>
+        </w:rPr>
+        <w:t>从 App 开始录音到硬件自然采集：单颗手机挂坠形态更像吉祥小物，降低老人学习和携带负担。</w:t>
+      </w:r>
+    </w:p>
+    <w:p>
+      <w:pPr>
+        <w:pStyle w:val="ListBullet"/>
+        <w:spacing w:after="80" w:line="312" w:lineRule="auto"/>
+        <w:ind w:left="312" w:hanging="142"/>
+      </w:pPr>
+      <w:r>
+        <w:rPr>
+          <w:rFonts w:ascii="Arial Unicode MS" w:hAnsi="Arial Unicode MS" w:eastAsia="Arial Unicode MS"/>
+          <w:b w:val="0"/>
+          <w:color w:val="202124"/>
+          <w:sz w:val="20"/>
+        </w:rPr>
+        <w:t>从 AI 替人叙事到真声优先：任何摘要都能回到原声证据，不确定信息明确标记，不让 AI 猜测。</w:t>
+      </w:r>
+    </w:p>
+    <w:p>
+      <w:pPr>
+        <w:pStyle w:val="ListBullet"/>
+        <w:spacing w:after="80" w:line="312" w:lineRule="auto"/>
+        <w:ind w:left="312" w:hanging="142"/>
+      </w:pPr>
+      <w:r>
+        <w:rPr>
+          <w:rFonts w:ascii="Arial Unicode MS" w:hAnsi="Arial Unicode MS" w:eastAsia="Arial Unicode MS"/>
+          <w:b w:val="0"/>
+          <w:color w:val="202124"/>
+          <w:sz w:val="20"/>
+        </w:rPr>
+        <w:t>从自动沉淀到用户主权：AI 自动整理个人记忆，家庭分享需要单独授权；用户可修改、撤回、导出或让系统忘记。</w:t>
+      </w:r>
     </w:p>
     <w:p>
       <w:pPr>
         <w:pStyle w:val="Heading1"/>
         <w:keepNext/>
-        <w:spacing w:before="360" w:after="160"/>
+        <w:spacing w:before="320" w:after="120"/>
       </w:pPr>
       <w:r>
         <w:rPr>
-          <w:rFonts w:ascii="PingFang SC" w:hAnsi="PingFang SC" w:eastAsia="PingFang SC"/>
+          <w:rFonts w:ascii="Arial Unicode MS" w:hAnsi="Arial Unicode MS" w:eastAsia="Arial Unicode MS"/>
           <w:b/>
-          <w:color w:val="26322D"/>
-          <w:sz w:val="36"/>
+          <w:color w:val="000000"/>
+          <w:sz w:val="34"/>
         </w:rPr>
-        <w:t>七 硬件概念</w:t>
+        <w:t>三、自由展示区【可选 · 加分项】</w:t>
       </w:r>
     </w:p>
     <w:p>
       <w:pPr>
-        <w:spacing w:after="140" w:line="331" w:lineRule="auto"/>
+        <w:pStyle w:val="Heading2"/>
+        <w:keepNext/>
+        <w:spacing w:before="220" w:after="120"/>
       </w:pPr>
       <w:r>
         <w:rPr>
           <w:rFonts w:ascii="Arial Unicode MS" w:hAnsi="Arial Unicode MS" w:eastAsia="Arial Unicode MS"/>
-          <w:color w:val="26322D"/>
+          <w:b/>
+          <w:color w:val="000000"/>
+          <w:sz w:val="26"/>
+        </w:rPr>
+        <w:t>产品原型与演示路径</w:t>
+      </w:r>
+    </w:p>
+    <w:p>
+      <w:pPr>
+        <w:spacing w:after="120" w:line="324" w:lineRule="auto"/>
+      </w:pPr>
+      <w:r>
+        <w:rPr>
+          <w:rFonts w:ascii="Arial Unicode MS" w:hAnsi="Arial Unicode MS" w:eastAsia="Arial Unicode MS"/>
+          <w:b w:val="0"/>
+          <w:color w:val="202124"/>
           <w:sz w:val="21"/>
         </w:rPr>
-        <w:t>寻忆珠珠借鉴安克 AI 录音豆的可穿戴录音逻辑 进一步缩小为手机挂绳上的单颗珠珠。它以温润玉白外壳 编织挂绳和极小状态灯呈现 更像日常随身物件。</w:t>
+        <w:t>交互原型围绕「硬件录音-App 接收-AI 记忆浮现-回听原声-家庭共忆」的最小闭环展开。App 不提供录音按钮，只展示珠珠状态、待同步原声和整理结果。</w:t>
+      </w:r>
+    </w:p>
+    <w:p>
+      <w:pPr>
+        <w:pStyle w:val="ListBullet"/>
+        <w:spacing w:after="80" w:line="312" w:lineRule="auto"/>
+        <w:ind w:left="312" w:hanging="142"/>
+      </w:pPr>
+      <w:r>
+        <w:rPr>
+          <w:rFonts w:ascii="Arial Unicode MS" w:hAnsi="Arial Unicode MS" w:eastAsia="Arial Unicode MS"/>
+          <w:b w:val="0"/>
+          <w:color w:val="202124"/>
+          <w:sz w:val="20"/>
+        </w:rPr>
+        <w:t>1. 老人按下记忆珠，录下「我第一次和你爷爷看电影，就是在这里」。</w:t>
+      </w:r>
+    </w:p>
+    <w:p>
+      <w:pPr>
+        <w:pStyle w:val="ListBullet"/>
+        <w:spacing w:after="80" w:line="312" w:lineRule="auto"/>
+        <w:ind w:left="312" w:hanging="142"/>
+      </w:pPr>
+      <w:r>
+        <w:rPr>
+          <w:rFonts w:ascii="Arial Unicode MS" w:hAnsi="Arial Unicode MS" w:eastAsia="Arial Unicode MS"/>
+          <w:b w:val="0"/>
+          <w:color w:val="202124"/>
+          <w:sz w:val="20"/>
+        </w:rPr>
+        <w:t>2. App 收到待整理声音，地点、人物和相关旧片段依次浮现。</w:t>
+      </w:r>
+    </w:p>
+    <w:p>
+      <w:pPr>
+        <w:pStyle w:val="ListBullet"/>
+        <w:spacing w:after="80" w:line="312" w:lineRule="auto"/>
+        <w:ind w:left="312" w:hanging="142"/>
+      </w:pPr>
+      <w:r>
+        <w:rPr>
+          <w:rFonts w:ascii="Arial Unicode MS" w:hAnsi="Arial Unicode MS" w:eastAsia="Arial Unicode MS"/>
+          <w:b w:val="0"/>
+          <w:color w:val="202124"/>
+          <w:sz w:val="20"/>
+        </w:rPr>
+        <w:t>3. 故事页保留原声播放和来源追溯；家人进入「一起听」后可继续讲述。</w:t>
+      </w:r>
+    </w:p>
+    <w:p>
+      <w:pPr>
+        <w:spacing w:after="100"/>
+      </w:pPr>
+      <w:r>
+        <w:rPr>
+          <w:rFonts w:ascii="Arial Unicode MS" w:hAnsi="Arial Unicode MS" w:eastAsia="Arial Unicode MS"/>
+          <w:b/>
+          <w:color w:val="202124"/>
+          <w:sz w:val="21"/>
+        </w:rPr>
+        <w:t>GitHub 仓库：</w:t>
+      </w:r>
+      <w:hyperlink r:id="rId11">
+        <w:r>
+          <w:rPr>
+            <w:rFonts w:ascii="Arial Unicode MS" w:eastAsia="Arial Unicode MS"/>
+            <w:color w:val="B84D3E"/>
+            <w:u w:val="single"/>
+          </w:rPr>
+          <w:t>github.com/tulip627722-byte/anker-hanker</w:t>
+        </w:r>
+      </w:hyperlink>
+    </w:p>
+    <w:p>
+      <w:pPr>
+        <w:pStyle w:val="Heading2"/>
+        <w:keepNext/>
+        <w:spacing w:before="220" w:after="120"/>
+      </w:pPr>
+      <w:r>
+        <w:rPr>
+          <w:rFonts w:ascii="Arial Unicode MS" w:hAnsi="Arial Unicode MS" w:eastAsia="Arial Unicode MS"/>
+          <w:b/>
+          <w:color w:val="000000"/>
+          <w:sz w:val="26"/>
+        </w:rPr>
+        <w:t>硬件概念与产品边界</w:t>
       </w:r>
     </w:p>
     <w:p>
@@ -2638,7 +1977,7 @@
       <w:r>
         <w:drawing>
           <wp:inline xmlns:a="http://schemas.openxmlformats.org/drawingml/2006/main" xmlns:pic="http://schemas.openxmlformats.org/drawingml/2006/picture">
-            <wp:extent cx="4140000" cy="3783430"/>
+            <wp:extent cx="3384000" cy="2256000"/>
             <wp:docPr id="2" name="Picture 2"/>
             <wp:cNvGraphicFramePr>
               <a:graphicFrameLocks noChangeAspect="1"/>
@@ -2647,11 +1986,11 @@
               <a:graphicData uri="http://schemas.openxmlformats.org/drawingml/2006/picture">
                 <pic:pic>
                   <pic:nvPicPr>
-                    <pic:cNvPr id="0" name="xunyi-bean-product.png"/>
+                    <pic:cNvPr id="0" name="xunyi-bean-exploded.png"/>
                     <pic:cNvPicPr/>
                   </pic:nvPicPr>
                   <pic:blipFill>
-                    <a:blip r:embed="rId9"/>
+                    <a:blip r:embed="rId12"/>
                     <a:stretch>
                       <a:fillRect/>
                     </a:stretch>
@@ -2659,7 +1998,7 @@
                   <pic:spPr>
                     <a:xfrm>
                       <a:off x="0" y="0"/>
-                      <a:ext cx="4140000" cy="3783430"/>
+                      <a:ext cx="3384000" cy="2256000"/>
                     </a:xfrm>
                     <a:prstGeom prst="rect"/>
                   </pic:spPr>
@@ -2672,67 +2011,17 @@
     </w:p>
     <w:p>
       <w:pPr>
+        <w:spacing w:after="100"/>
         <w:jc w:val="center"/>
       </w:pPr>
       <w:r>
         <w:rPr>
           <w:rFonts w:ascii="Arial Unicode MS" w:hAnsi="Arial Unicode MS" w:eastAsia="Arial Unicode MS"/>
-          <w:color w:val="777777"/>
-          <w:sz w:val="18"/>
+          <w:b w:val="0"/>
+          <w:color w:val="5F6368"/>
+          <w:sz w:val="17"/>
         </w:rPr>
-        <w:t>图 1  寻忆声音记忆珠产品概念</w:t>
-      </w:r>
-    </w:p>
-    <w:p>
-      <w:pPr>
-        <w:jc w:val="center"/>
-      </w:pPr>
-      <w:r>
-        <w:drawing>
-          <wp:inline xmlns:a="http://schemas.openxmlformats.org/drawingml/2006/main" xmlns:pic="http://schemas.openxmlformats.org/drawingml/2006/picture">
-            <wp:extent cx="4500000" cy="3000000"/>
-            <wp:docPr id="3" name="Picture 3"/>
-            <wp:cNvGraphicFramePr>
-              <a:graphicFrameLocks noChangeAspect="1"/>
-            </wp:cNvGraphicFramePr>
-            <a:graphic>
-              <a:graphicData uri="http://schemas.openxmlformats.org/drawingml/2006/picture">
-                <pic:pic>
-                  <pic:nvPicPr>
-                    <pic:cNvPr id="0" name="xunyi-bean-exploded.png"/>
-                    <pic:cNvPicPr/>
-                  </pic:nvPicPr>
-                  <pic:blipFill>
-                    <a:blip r:embed="rId10"/>
-                    <a:stretch>
-                      <a:fillRect/>
-                    </a:stretch>
-                  </pic:blipFill>
-                  <pic:spPr>
-                    <a:xfrm>
-                      <a:off x="0" y="0"/>
-                      <a:ext cx="4500000" cy="3000000"/>
-                    </a:xfrm>
-                    <a:prstGeom prst="rect"/>
-                  </pic:spPr>
-                </pic:pic>
-              </a:graphicData>
-            </a:graphic>
-          </wp:inline>
-        </w:drawing>
-      </w:r>
-    </w:p>
-    <w:p>
-      <w:pPr>
-        <w:jc w:val="center"/>
-      </w:pPr>
-      <w:r>
-        <w:rPr>
-          <w:rFonts w:ascii="Arial Unicode MS" w:hAnsi="Arial Unicode MS" w:eastAsia="Arial Unicode MS"/>
-          <w:color w:val="777777"/>
-          <w:sz w:val="18"/>
-        </w:rPr>
-        <w:t>图 2  概念拆解图 不含摄像头 地点由手机授权提供</w:t>
+        <w:t>图 2  概念拆解：外壳、按键/状态灯、麦克风、主板、电池与挂绳环；不含摄像头</w:t>
       </w:r>
     </w:p>
     <w:tbl>
@@ -2743,13 +2032,16 @@
         <w:tblLook w:firstColumn="1" w:firstRow="1" w:lastColumn="0" w:lastRow="0" w:noHBand="0" w:noVBand="1" w:val="04A0"/>
       </w:tblPr>
       <w:tblGrid>
-        <w:gridCol w:w="4873"/>
-        <w:gridCol w:w="4873"/>
+        <w:gridCol w:w="4986"/>
+        <w:gridCol w:w="4986"/>
       </w:tblGrid>
       <w:tr>
+        <w:trPr>
+          <w:tblHeader w:val="true"/>
+        </w:trPr>
         <w:tc>
           <w:tcPr>
-            <w:tcW w:type="dxa" w:w="1928"/>
+            <w:tcW w:type="dxa" w:w="1757"/>
             <w:vAlign w:val="center"/>
             <w:tcBorders>
               <w:top w:val="single" w:sz="6" w:color="D9D9D9"/>
@@ -2760,16 +2052,16 @@
               <w:insideV w:val="single" w:sz="6" w:color="D9D9D9"/>
             </w:tcBorders>
             <w:tcMar>
-              <w:top w:w="120" w:type="dxa"/>
+              <w:top w:w="110" w:type="dxa"/>
               <w:start w:w="130" w:type="dxa"/>
-              <w:bottom w:w="120" w:type="dxa"/>
+              <w:bottom w:w="110" w:type="dxa"/>
               <w:end w:w="130" w:type="dxa"/>
             </w:tcMar>
-            <w:shd w:fill="55705E"/>
+            <w:shd w:fill="244A5A"/>
           </w:tcPr>
           <w:p>
             <w:pPr>
-              <w:spacing w:after="0" w:line="276" w:lineRule="auto"/>
+              <w:spacing w:after="0" w:line="283" w:lineRule="auto"/>
             </w:pPr>
             <w:r>
               <w:rPr>
@@ -2778,13 +2070,13 @@
                 <w:color w:val="FFFFFF"/>
                 <w:sz w:val="18"/>
               </w:rPr>
-              <w:t>设计判断</w:t>
+              <w:t>边界</w:t>
             </w:r>
           </w:p>
         </w:tc>
         <w:tc>
           <w:tcPr>
-            <w:tcW w:type="dxa" w:w="6746"/>
+            <w:tcW w:type="dxa" w:w="7597"/>
             <w:vAlign w:val="center"/>
             <w:tcBorders>
               <w:top w:val="single" w:sz="6" w:color="D9D9D9"/>
@@ -2795,16 +2087,16 @@
               <w:insideV w:val="single" w:sz="6" w:color="D9D9D9"/>
             </w:tcBorders>
             <w:tcMar>
-              <w:top w:w="120" w:type="dxa"/>
+              <w:top w:w="110" w:type="dxa"/>
               <w:start w:w="130" w:type="dxa"/>
-              <w:bottom w:w="120" w:type="dxa"/>
+              <w:bottom w:w="110" w:type="dxa"/>
               <w:end w:w="130" w:type="dxa"/>
             </w:tcMar>
-            <w:shd w:fill="55705E"/>
+            <w:shd w:fill="244A5A"/>
           </w:tcPr>
           <w:p>
             <w:pPr>
-              <w:spacing w:after="0" w:line="276" w:lineRule="auto"/>
+              <w:spacing w:after="0" w:line="283" w:lineRule="auto"/>
             </w:pPr>
             <w:r>
               <w:rPr>
@@ -2813,7 +2105,7 @@
                 <w:color w:val="FFFFFF"/>
                 <w:sz w:val="18"/>
               </w:rPr>
-              <w:t>说明</w:t>
+              <w:t>设计原则</w:t>
             </w:r>
           </w:p>
         </w:tc>
@@ -2821,7 +2113,7 @@
       <w:tr>
         <w:tc>
           <w:tcPr>
-            <w:tcW w:type="dxa" w:w="1928"/>
+            <w:tcW w:type="dxa" w:w="1757"/>
             <w:vAlign w:val="center"/>
             <w:tcBorders>
               <w:top w:val="single" w:sz="6" w:color="D9D9D9"/>
@@ -2832,30 +2124,30 @@
               <w:insideV w:val="single" w:sz="6" w:color="D9D9D9"/>
             </w:tcBorders>
             <w:tcMar>
-              <w:top w:w="120" w:type="dxa"/>
+              <w:top w:w="110" w:type="dxa"/>
               <w:start w:w="130" w:type="dxa"/>
-              <w:bottom w:w="120" w:type="dxa"/>
+              <w:bottom w:w="110" w:type="dxa"/>
               <w:end w:w="130" w:type="dxa"/>
             </w:tcMar>
           </w:tcPr>
           <w:p>
             <w:pPr>
-              <w:spacing w:after="0" w:line="276" w:lineRule="auto"/>
+              <w:spacing w:after="0" w:line="283" w:lineRule="auto"/>
             </w:pPr>
             <w:r>
               <w:rPr>
                 <w:rFonts w:ascii="Arial Unicode MS" w:hAnsi="Arial Unicode MS" w:eastAsia="Arial Unicode MS"/>
                 <w:b w:val="0"/>
-                <w:color w:val="26322D"/>
+                <w:color w:val="202124"/>
                 <w:sz w:val="18"/>
               </w:rPr>
-              <w:t>体量</w:t>
+              <w:t>真声与 AI</w:t>
             </w:r>
           </w:p>
         </w:tc>
         <w:tc>
           <w:tcPr>
-            <w:tcW w:type="dxa" w:w="6746"/>
+            <w:tcW w:type="dxa" w:w="7597"/>
             <w:vAlign w:val="center"/>
             <w:tcBorders>
               <w:top w:val="single" w:sz="6" w:color="D9D9D9"/>
@@ -2866,24 +2158,24 @@
               <w:insideV w:val="single" w:sz="6" w:color="D9D9D9"/>
             </w:tcBorders>
             <w:tcMar>
-              <w:top w:w="120" w:type="dxa"/>
+              <w:top w:w="110" w:type="dxa"/>
               <w:start w:w="130" w:type="dxa"/>
-              <w:bottom w:w="120" w:type="dxa"/>
+              <w:bottom w:w="110" w:type="dxa"/>
               <w:end w:w="130" w:type="dxa"/>
             </w:tcMar>
           </w:tcPr>
           <w:p>
             <w:pPr>
-              <w:spacing w:after="0" w:line="276" w:lineRule="auto"/>
+              <w:spacing w:after="0" w:line="283" w:lineRule="auto"/>
             </w:pPr>
             <w:r>
               <w:rPr>
                 <w:rFonts w:ascii="Arial Unicode MS" w:hAnsi="Arial Unicode MS" w:eastAsia="Arial Unicode MS"/>
                 <w:b w:val="0"/>
-                <w:color w:val="26322D"/>
+                <w:color w:val="202124"/>
                 <w:sz w:val="18"/>
               </w:rPr>
-              <w:t>单颗珠珠 挂在手机或包上 不做大块设备</w:t>
+              <w:t>原声、转写和 AI 记忆分开展示；AI 不覆盖原始表达。</w:t>
             </w:r>
           </w:p>
         </w:tc>
@@ -2891,7 +2183,7 @@
       <w:tr>
         <w:tc>
           <w:tcPr>
-            <w:tcW w:type="dxa" w:w="1928"/>
+            <w:tcW w:type="dxa" w:w="1757"/>
             <w:vAlign w:val="center"/>
             <w:tcBorders>
               <w:top w:val="single" w:sz="6" w:color="D9D9D9"/>
@@ -2902,31 +2194,31 @@
               <w:insideV w:val="single" w:sz="6" w:color="D9D9D9"/>
             </w:tcBorders>
             <w:tcMar>
-              <w:top w:w="120" w:type="dxa"/>
+              <w:top w:w="110" w:type="dxa"/>
               <w:start w:w="130" w:type="dxa"/>
-              <w:bottom w:w="120" w:type="dxa"/>
+              <w:bottom w:w="110" w:type="dxa"/>
               <w:end w:w="130" w:type="dxa"/>
             </w:tcMar>
-            <w:shd w:fill="F7F7F5"/>
+            <w:shd w:fill="F7F8F8"/>
           </w:tcPr>
           <w:p>
             <w:pPr>
-              <w:spacing w:after="0" w:line="276" w:lineRule="auto"/>
+              <w:spacing w:after="0" w:line="283" w:lineRule="auto"/>
             </w:pPr>
             <w:r>
               <w:rPr>
                 <w:rFonts w:ascii="Arial Unicode MS" w:hAnsi="Arial Unicode MS" w:eastAsia="Arial Unicode MS"/>
                 <w:b w:val="0"/>
-                <w:color w:val="26322D"/>
+                <w:color w:val="202124"/>
                 <w:sz w:val="18"/>
               </w:rPr>
-              <w:t>交互</w:t>
+              <w:t>位置与隐私</w:t>
             </w:r>
           </w:p>
         </w:tc>
         <w:tc>
           <w:tcPr>
-            <w:tcW w:type="dxa" w:w="6746"/>
+            <w:tcW w:type="dxa" w:w="7597"/>
             <w:vAlign w:val="center"/>
             <w:tcBorders>
               <w:top w:val="single" w:sz="6" w:color="D9D9D9"/>
@@ -2937,25 +2229,25 @@
               <w:insideV w:val="single" w:sz="6" w:color="D9D9D9"/>
             </w:tcBorders>
             <w:tcMar>
-              <w:top w:w="120" w:type="dxa"/>
+              <w:top w:w="110" w:type="dxa"/>
               <w:start w:w="130" w:type="dxa"/>
-              <w:bottom w:w="120" w:type="dxa"/>
+              <w:bottom w:w="110" w:type="dxa"/>
               <w:end w:w="130" w:type="dxa"/>
             </w:tcMar>
-            <w:shd w:fill="F7F7F5"/>
+            <w:shd w:fill="F7F8F8"/>
           </w:tcPr>
           <w:p>
             <w:pPr>
-              <w:spacing w:after="0" w:line="276" w:lineRule="auto"/>
+              <w:spacing w:after="0" w:line="283" w:lineRule="auto"/>
             </w:pPr>
             <w:r>
               <w:rPr>
                 <w:rFonts w:ascii="Arial Unicode MS" w:hAnsi="Arial Unicode MS" w:eastAsia="Arial Unicode MS"/>
                 <w:b w:val="0"/>
-                <w:color w:val="26322D"/>
+                <w:color w:val="202124"/>
                 <w:sz w:val="18"/>
               </w:rPr>
-              <w:t>一键开始或结束 灯光 震动和提示音反馈</w:t>
+              <w:t>地点按次记录或关闭，不保存完整行动轨迹；录音状态可感知。</w:t>
             </w:r>
           </w:p>
         </w:tc>
@@ -2963,7 +2255,7 @@
       <w:tr>
         <w:tc>
           <w:tcPr>
-            <w:tcW w:type="dxa" w:w="1928"/>
+            <w:tcW w:type="dxa" w:w="1757"/>
             <w:vAlign w:val="center"/>
             <w:tcBorders>
               <w:top w:val="single" w:sz="6" w:color="D9D9D9"/>
@@ -2974,30 +2266,30 @@
               <w:insideV w:val="single" w:sz="6" w:color="D9D9D9"/>
             </w:tcBorders>
             <w:tcMar>
-              <w:top w:w="120" w:type="dxa"/>
+              <w:top w:w="110" w:type="dxa"/>
               <w:start w:w="130" w:type="dxa"/>
-              <w:bottom w:w="120" w:type="dxa"/>
+              <w:bottom w:w="110" w:type="dxa"/>
               <w:end w:w="130" w:type="dxa"/>
             </w:tcMar>
           </w:tcPr>
           <w:p>
             <w:pPr>
-              <w:spacing w:after="0" w:line="276" w:lineRule="auto"/>
+              <w:spacing w:after="0" w:line="283" w:lineRule="auto"/>
             </w:pPr>
             <w:r>
               <w:rPr>
                 <w:rFonts w:ascii="Arial Unicode MS" w:hAnsi="Arial Unicode MS" w:eastAsia="Arial Unicode MS"/>
                 <w:b w:val="0"/>
-                <w:color w:val="26322D"/>
+                <w:color w:val="202124"/>
                 <w:sz w:val="18"/>
               </w:rPr>
-              <w:t>隐私</w:t>
+              <w:t>记忆主权</w:t>
             </w:r>
           </w:p>
         </w:tc>
         <w:tc>
           <w:tcPr>
-            <w:tcW w:type="dxa" w:w="6746"/>
+            <w:tcW w:type="dxa" w:w="7597"/>
             <w:vAlign w:val="center"/>
             <w:tcBorders>
               <w:top w:val="single" w:sz="6" w:color="D9D9D9"/>
@@ -3008,24 +2300,24 @@
               <w:insideV w:val="single" w:sz="6" w:color="D9D9D9"/>
             </w:tcBorders>
             <w:tcMar>
-              <w:top w:w="120" w:type="dxa"/>
+              <w:top w:w="110" w:type="dxa"/>
               <w:start w:w="130" w:type="dxa"/>
-              <w:bottom w:w="120" w:type="dxa"/>
+              <w:bottom w:w="110" w:type="dxa"/>
               <w:end w:w="130" w:type="dxa"/>
             </w:tcMar>
           </w:tcPr>
           <w:p>
             <w:pPr>
-              <w:spacing w:after="0" w:line="276" w:lineRule="auto"/>
+              <w:spacing w:after="0" w:line="283" w:lineRule="auto"/>
             </w:pPr>
             <w:r>
               <w:rPr>
                 <w:rFonts w:ascii="Arial Unicode MS" w:hAnsi="Arial Unicode MS" w:eastAsia="Arial Unicode MS"/>
                 <w:b w:val="0"/>
-                <w:color w:val="26322D"/>
+                <w:color w:val="202124"/>
                 <w:sz w:val="18"/>
               </w:rPr>
-              <w:t>录音状态可感知 地点可关闭 原声 转写和 AI 记忆分开展示</w:t>
+              <w:t>老人拥有原声与故事，可修改、分享、撤回、导出和彻底删除。</w:t>
             </w:r>
           </w:p>
         </w:tc>
@@ -3033,7 +2325,7 @@
       <w:tr>
         <w:tc>
           <w:tcPr>
-            <w:tcW w:type="dxa" w:w="1928"/>
+            <w:tcW w:type="dxa" w:w="1757"/>
             <w:vAlign w:val="center"/>
             <w:tcBorders>
               <w:top w:val="single" w:sz="6" w:color="D9D9D9"/>
@@ -3044,31 +2336,31 @@
               <w:insideV w:val="single" w:sz="6" w:color="D9D9D9"/>
             </w:tcBorders>
             <w:tcMar>
-              <w:top w:w="120" w:type="dxa"/>
+              <w:top w:w="110" w:type="dxa"/>
               <w:start w:w="130" w:type="dxa"/>
-              <w:bottom w:w="120" w:type="dxa"/>
+              <w:bottom w:w="110" w:type="dxa"/>
               <w:end w:w="130" w:type="dxa"/>
             </w:tcMar>
-            <w:shd w:fill="F7F7F5"/>
+            <w:shd w:fill="F7F8F8"/>
           </w:tcPr>
           <w:p>
             <w:pPr>
-              <w:spacing w:after="0" w:line="276" w:lineRule="auto"/>
+              <w:spacing w:after="0" w:line="283" w:lineRule="auto"/>
             </w:pPr>
             <w:r>
               <w:rPr>
                 <w:rFonts w:ascii="Arial Unicode MS" w:hAnsi="Arial Unicode MS" w:eastAsia="Arial Unicode MS"/>
                 <w:b w:val="0"/>
-                <w:color w:val="26322D"/>
+                <w:color w:val="202124"/>
                 <w:sz w:val="18"/>
               </w:rPr>
-              <w:t>记忆主权</w:t>
+              <w:t>产品定位</w:t>
             </w:r>
           </w:p>
         </w:tc>
         <w:tc>
           <w:tcPr>
-            <w:tcW w:type="dxa" w:w="6746"/>
+            <w:tcW w:type="dxa" w:w="7597"/>
             <w:vAlign w:val="center"/>
             <w:tcBorders>
               <w:top w:val="single" w:sz="6" w:color="D9D9D9"/>
@@ -3079,25 +2371,25 @@
               <w:insideV w:val="single" w:sz="6" w:color="D9D9D9"/>
             </w:tcBorders>
             <w:tcMar>
-              <w:top w:w="120" w:type="dxa"/>
+              <w:top w:w="110" w:type="dxa"/>
               <w:start w:w="130" w:type="dxa"/>
-              <w:bottom w:w="120" w:type="dxa"/>
+              <w:bottom w:w="110" w:type="dxa"/>
               <w:end w:w="130" w:type="dxa"/>
             </w:tcMar>
-            <w:shd w:fill="F7F7F5"/>
+            <w:shd w:fill="F7F8F8"/>
           </w:tcPr>
           <w:p>
             <w:pPr>
-              <w:spacing w:after="0" w:line="276" w:lineRule="auto"/>
+              <w:spacing w:after="0" w:line="283" w:lineRule="auto"/>
             </w:pPr>
             <w:r>
               <w:rPr>
                 <w:rFonts w:ascii="Arial Unicode MS" w:hAnsi="Arial Unicode MS" w:eastAsia="Arial Unicode MS"/>
                 <w:b w:val="0"/>
-                <w:color w:val="26322D"/>
+                <w:color w:val="202124"/>
                 <w:sz w:val="18"/>
               </w:rPr>
-              <w:t>老人拥有原声与故事 可修改 分享 撤回 导出和删除</w:t>
+              <w:t>家庭回忆与数字生命故事工具；不做记忆测试、认知评估、医疗诊断或治疗承诺。</w:t>
             </w:r>
           </w:p>
         </w:tc>
@@ -3105,255 +2397,467 @@
     </w:tbl>
     <w:p>
       <w:pPr>
-        <w:spacing w:after="40"/>
+        <w:spacing w:after="20"/>
       </w:pPr>
     </w:p>
     <w:p>
       <w:pPr>
-        <w:pStyle w:val="Heading1"/>
+        <w:pStyle w:val="Heading2"/>
         <w:keepNext/>
-        <w:spacing w:before="360" w:after="160"/>
-      </w:pPr>
-      <w:r>
-        <w:rPr>
-          <w:rFonts w:ascii="PingFang SC" w:hAnsi="PingFang SC" w:eastAsia="PingFang SC"/>
-          <w:b/>
-          <w:color w:val="26322D"/>
-          <w:sz w:val="36"/>
-        </w:rPr>
-        <w:t>八 Demo 演示</w:t>
-      </w:r>
-    </w:p>
-    <w:p>
-      <w:pPr>
-        <w:spacing w:after="100" w:line="300" w:lineRule="auto"/>
-        <w:ind w:left="340" w:hanging="255"/>
-      </w:pPr>
-      <w:r>
-        <w:rPr>
-          <w:rFonts w:ascii="Arial Unicode MS" w:hAnsi="Arial Unicode MS" w:eastAsia="Arial Unicode MS"/>
-          <w:color w:val="26322D"/>
-          <w:sz w:val="20"/>
-        </w:rPr>
-        <w:t>1. 老人按下声音记忆珠 录下一段自然讲述。</w:t>
-      </w:r>
-    </w:p>
-    <w:p>
-      <w:pPr>
-        <w:spacing w:after="100" w:line="300" w:lineRule="auto"/>
-        <w:ind w:left="340" w:hanging="255"/>
-      </w:pPr>
-      <w:r>
-        <w:rPr>
-          <w:rFonts w:ascii="Arial Unicode MS" w:hAnsi="Arial Unicode MS" w:eastAsia="Arial Unicode MS"/>
-          <w:color w:val="26322D"/>
-          <w:sz w:val="20"/>
-        </w:rPr>
-        <w:t>2. 回到手机后 首页提示有一段声音想带你回到一个地方 用户轻触收下这段声音。</w:t>
-      </w:r>
-    </w:p>
-    <w:p>
-      <w:pPr>
-        <w:spacing w:after="100" w:line="300" w:lineRule="auto"/>
-        <w:ind w:left="340" w:hanging="255"/>
-      </w:pPr>
-      <w:r>
-        <w:rPr>
-          <w:rFonts w:ascii="Arial Unicode MS" w:hAnsi="Arial Unicode MS" w:eastAsia="Arial Unicode MS"/>
-          <w:color w:val="26322D"/>
-          <w:sz w:val="20"/>
-        </w:rPr>
-        <w:t>3. 地点 人物和旧片段分阶段浮现 最后与第一次和爷爷看电影的旧故事相认。</w:t>
-      </w:r>
-    </w:p>
-    <w:p>
-      <w:pPr>
-        <w:spacing w:after="100" w:line="300" w:lineRule="auto"/>
-        <w:ind w:left="340" w:hanging="255"/>
-      </w:pPr>
-      <w:r>
-        <w:rPr>
-          <w:rFonts w:ascii="Arial Unicode MS" w:hAnsi="Arial Unicode MS" w:eastAsia="Arial Unicode MS"/>
-          <w:color w:val="26322D"/>
-          <w:sz w:val="20"/>
-        </w:rPr>
-        <w:t>4. 用户进入故事页播放真实原声 并展开查看每一段故事来自哪次讲述。</w:t>
-      </w:r>
-    </w:p>
-    <w:p>
-      <w:pPr>
-        <w:spacing w:after="100" w:line="300" w:lineRule="auto"/>
-        <w:ind w:left="340" w:hanging="255"/>
-      </w:pPr>
-      <w:r>
-        <w:rPr>
-          <w:rFonts w:ascii="Arial Unicode MS" w:hAnsi="Arial Unicode MS" w:eastAsia="Arial Unicode MS"/>
-          <w:color w:val="26322D"/>
-          <w:sz w:val="20"/>
-        </w:rPr>
-        <w:t>5. 家人进入一起听 先听老人说完 停顿后系统才递来一句可切换的开放式追问。</w:t>
-      </w:r>
-    </w:p>
-    <w:p>
-      <w:pPr>
-        <w:spacing w:after="140" w:line="331" w:lineRule="auto"/>
-      </w:pPr>
-      <w:r>
-        <w:rPr>
-          <w:rFonts w:ascii="Arial Unicode MS" w:hAnsi="Arial Unicode MS" w:eastAsia="Arial Unicode MS"/>
-          <w:color w:val="26322D"/>
-          <w:sz w:val="21"/>
-        </w:rPr>
-        <w:t>Demo 使用脚本化数据展示产品闭环 不代表已经接入量产硬件或线上 AI 模型。</w:t>
-      </w:r>
-    </w:p>
-    <w:p>
-      <w:pPr>
-        <w:pStyle w:val="Heading1"/>
-        <w:keepNext/>
-        <w:spacing w:before="360" w:after="160"/>
-      </w:pPr>
-      <w:r>
-        <w:rPr>
-          <w:rFonts w:ascii="PingFang SC" w:hAnsi="PingFang SC" w:eastAsia="PingFang SC"/>
-          <w:b/>
-          <w:color w:val="26322D"/>
-          <w:sz w:val="36"/>
-        </w:rPr>
-        <w:t>九 隐私与伦理边界</w:t>
-      </w:r>
-    </w:p>
-    <w:p>
-      <w:pPr>
-        <w:pStyle w:val="ListBullet"/>
-        <w:spacing w:after="80" w:line="307" w:lineRule="auto"/>
-        <w:ind w:left="283" w:hanging="142"/>
-      </w:pPr>
-      <w:r>
-        <w:rPr>
-          <w:rFonts w:ascii="Arial Unicode MS" w:hAnsi="Arial Unicode MS" w:eastAsia="Arial Unicode MS"/>
-          <w:color w:val="26322D"/>
-          <w:sz w:val="20"/>
-        </w:rPr>
-        <w:t>录音状态可感知 位置按次记录或关闭。</w:t>
-      </w:r>
-    </w:p>
-    <w:p>
-      <w:pPr>
-        <w:pStyle w:val="ListBullet"/>
-        <w:spacing w:after="80" w:line="307" w:lineRule="auto"/>
-        <w:ind w:left="283" w:hanging="142"/>
-      </w:pPr>
-      <w:r>
-        <w:rPr>
-          <w:rFonts w:ascii="Arial Unicode MS" w:hAnsi="Arial Unicode MS" w:eastAsia="Arial Unicode MS"/>
-          <w:color w:val="26322D"/>
-          <w:sz w:val="20"/>
-        </w:rPr>
-        <w:t>原声 转写和 AI 记忆分开展示。</w:t>
-      </w:r>
-    </w:p>
-    <w:p>
-      <w:pPr>
-        <w:pStyle w:val="ListBullet"/>
-        <w:spacing w:after="80" w:line="307" w:lineRule="auto"/>
-        <w:ind w:left="283" w:hanging="142"/>
-      </w:pPr>
-      <w:r>
-        <w:rPr>
-          <w:rFonts w:ascii="Arial Unicode MS" w:hAnsi="Arial Unicode MS" w:eastAsia="Arial Unicode MS"/>
-          <w:color w:val="26322D"/>
-          <w:sz w:val="20"/>
-        </w:rPr>
-        <w:t>自动沉淀不等于自动分享 家庭可见范围单独控制。</w:t>
-      </w:r>
-    </w:p>
-    <w:p>
-      <w:pPr>
-        <w:pStyle w:val="ListBullet"/>
-        <w:spacing w:after="80" w:line="307" w:lineRule="auto"/>
-        <w:ind w:left="283" w:hanging="142"/>
-      </w:pPr>
-      <w:r>
-        <w:rPr>
-          <w:rFonts w:ascii="Arial Unicode MS" w:hAnsi="Arial Unicode MS" w:eastAsia="Arial Unicode MS"/>
-          <w:color w:val="26322D"/>
-          <w:sz w:val="20"/>
-        </w:rPr>
-        <w:t>用户可以修改 让系统忘记 或彻底删除原声及衍生内容。</w:t>
-      </w:r>
-    </w:p>
-    <w:p>
-      <w:pPr>
-        <w:pStyle w:val="ListBullet"/>
-        <w:spacing w:after="80" w:line="307" w:lineRule="auto"/>
-        <w:ind w:left="283" w:hanging="142"/>
-      </w:pPr>
-      <w:r>
-        <w:rPr>
-          <w:rFonts w:ascii="Arial Unicode MS" w:hAnsi="Arial Unicode MS" w:eastAsia="Arial Unicode MS"/>
-          <w:color w:val="26322D"/>
-          <w:sz w:val="20"/>
-        </w:rPr>
-        <w:t>不纠正老人主观记忆 不进行认知评估 健康诊断或治疗承诺。</w:t>
-      </w:r>
-    </w:p>
-    <w:p>
-      <w:pPr>
-        <w:pStyle w:val="Heading1"/>
-        <w:keepNext/>
-        <w:spacing w:before="360" w:after="160"/>
-      </w:pPr>
-      <w:r>
-        <w:rPr>
-          <w:rFonts w:ascii="PingFang SC" w:hAnsi="PingFang SC" w:eastAsia="PingFang SC"/>
-          <w:b/>
-          <w:color w:val="26322D"/>
-          <w:sz w:val="36"/>
-        </w:rPr>
-        <w:t>十 项目链接</w:t>
-      </w:r>
-    </w:p>
-    <w:p>
-      <w:pPr>
-        <w:spacing w:after="160"/>
+        <w:spacing w:before="220" w:after="120"/>
       </w:pPr>
       <w:r>
         <w:rPr>
           <w:rFonts w:ascii="Arial Unicode MS" w:hAnsi="Arial Unicode MS" w:eastAsia="Arial Unicode MS"/>
           <w:b/>
-          <w:color w:val="26322D"/>
-          <w:sz w:val="21"/>
+          <w:color w:val="000000"/>
+          <w:sz w:val="26"/>
         </w:rPr>
-        <w:t xml:space="preserve">GitHub 仓库  </w:t>
-      </w:r>
-      <w:hyperlink r:id="rId11">
-        <w:r>
-          <w:rPr>
-            <w:color w:val="B75B48"/>
-            <w:u w:val="single"/>
-          </w:rPr>
-          <w:t>github.com/tulip627722-byte/anker-hanker</w:t>
-        </w:r>
-      </w:hyperlink>
-    </w:p>
-    <w:p>
-      <w:pPr>
-        <w:spacing w:after="140" w:line="331" w:lineRule="auto"/>
-      </w:pPr>
-      <w:r>
-        <w:rPr>
-          <w:rFonts w:ascii="Arial Unicode MS" w:hAnsi="Arial Unicode MS" w:eastAsia="Arial Unicode MS"/>
-          <w:color w:val="26322D"/>
-          <w:sz w:val="21"/>
-        </w:rPr>
-        <w:t>仓库包含交互 Demo 产品图 硬件拆解图 README 与本预赛材料。</w:t>
+        <w:t>技术路径与实现边界</w:t>
       </w:r>
     </w:p>
+    <w:tbl>
+      <w:tblPr>
+        <w:tblW w:type="auto" w:w="0"/>
+        <w:jc w:val="center"/>
+        <w:tblLayout w:type="fixed"/>
+        <w:tblLook w:firstColumn="1" w:firstRow="1" w:lastColumn="0" w:lastRow="0" w:noHBand="0" w:noVBand="1" w:val="04A0"/>
+      </w:tblPr>
+      <w:tblGrid>
+        <w:gridCol w:w="3324"/>
+        <w:gridCol w:w="3324"/>
+        <w:gridCol w:w="3324"/>
+      </w:tblGrid>
+      <w:tr>
+        <w:trPr>
+          <w:tblHeader w:val="true"/>
+        </w:trPr>
+        <w:tc>
+          <w:tcPr>
+            <w:tcW w:type="dxa" w:w="1587"/>
+            <w:vAlign w:val="center"/>
+            <w:tcBorders>
+              <w:top w:val="single" w:sz="6" w:color="D9D9D9"/>
+              <w:left w:val="single" w:sz="6" w:color="D9D9D9"/>
+              <w:bottom w:val="single" w:sz="6" w:color="D9D9D9"/>
+              <w:right w:val="single" w:sz="6" w:color="D9D9D9"/>
+              <w:insideH w:val="single" w:sz="6" w:color="D9D9D9"/>
+              <w:insideV w:val="single" w:sz="6" w:color="D9D9D9"/>
+            </w:tcBorders>
+            <w:tcMar>
+              <w:top w:w="110" w:type="dxa"/>
+              <w:start w:w="130" w:type="dxa"/>
+              <w:bottom w:w="110" w:type="dxa"/>
+              <w:end w:w="130" w:type="dxa"/>
+            </w:tcMar>
+            <w:shd w:fill="244A5A"/>
+          </w:tcPr>
+          <w:p>
+            <w:pPr>
+              <w:spacing w:after="0" w:line="283" w:lineRule="auto"/>
+            </w:pPr>
+            <w:r>
+              <w:rPr>
+                <w:rFonts w:ascii="Arial Unicode MS" w:hAnsi="Arial Unicode MS" w:eastAsia="Arial Unicode MS"/>
+                <w:b/>
+                <w:color w:val="FFFFFF"/>
+                <w:sz w:val="17"/>
+              </w:rPr>
+              <w:t>模块</w:t>
+            </w:r>
+          </w:p>
+        </w:tc>
+        <w:tc>
+          <w:tcPr>
+            <w:tcW w:type="dxa" w:w="3685"/>
+            <w:vAlign w:val="center"/>
+            <w:tcBorders>
+              <w:top w:val="single" w:sz="6" w:color="D9D9D9"/>
+              <w:left w:val="single" w:sz="6" w:color="D9D9D9"/>
+              <w:bottom w:val="single" w:sz="6" w:color="D9D9D9"/>
+              <w:right w:val="single" w:sz="6" w:color="D9D9D9"/>
+              <w:insideH w:val="single" w:sz="6" w:color="D9D9D9"/>
+              <w:insideV w:val="single" w:sz="6" w:color="D9D9D9"/>
+            </w:tcBorders>
+            <w:tcMar>
+              <w:top w:w="110" w:type="dxa"/>
+              <w:start w:w="130" w:type="dxa"/>
+              <w:bottom w:w="110" w:type="dxa"/>
+              <w:end w:w="130" w:type="dxa"/>
+            </w:tcMar>
+            <w:shd w:fill="244A5A"/>
+          </w:tcPr>
+          <w:p>
+            <w:pPr>
+              <w:spacing w:after="0" w:line="283" w:lineRule="auto"/>
+            </w:pPr>
+            <w:r>
+              <w:rPr>
+                <w:rFonts w:ascii="Arial Unicode MS" w:hAnsi="Arial Unicode MS" w:eastAsia="Arial Unicode MS"/>
+                <w:b/>
+                <w:color w:val="FFFFFF"/>
+                <w:sz w:val="17"/>
+              </w:rPr>
+              <w:t>24 小时原型实现</w:t>
+            </w:r>
+          </w:p>
+        </w:tc>
+        <w:tc>
+          <w:tcPr>
+            <w:tcW w:type="dxa" w:w="4082"/>
+            <w:vAlign w:val="center"/>
+            <w:tcBorders>
+              <w:top w:val="single" w:sz="6" w:color="D9D9D9"/>
+              <w:left w:val="single" w:sz="6" w:color="D9D9D9"/>
+              <w:bottom w:val="single" w:sz="6" w:color="D9D9D9"/>
+              <w:right w:val="single" w:sz="6" w:color="D9D9D9"/>
+              <w:insideH w:val="single" w:sz="6" w:color="D9D9D9"/>
+              <w:insideV w:val="single" w:sz="6" w:color="D9D9D9"/>
+            </w:tcBorders>
+            <w:tcMar>
+              <w:top w:w="110" w:type="dxa"/>
+              <w:start w:w="130" w:type="dxa"/>
+              <w:bottom w:w="110" w:type="dxa"/>
+              <w:end w:w="130" w:type="dxa"/>
+            </w:tcMar>
+            <w:shd w:fill="244A5A"/>
+          </w:tcPr>
+          <w:p>
+            <w:pPr>
+              <w:spacing w:after="0" w:line="283" w:lineRule="auto"/>
+            </w:pPr>
+            <w:r>
+              <w:rPr>
+                <w:rFonts w:ascii="Arial Unicode MS" w:hAnsi="Arial Unicode MS" w:eastAsia="Arial Unicode MS"/>
+                <w:b/>
+                <w:color w:val="FFFFFF"/>
+                <w:sz w:val="17"/>
+              </w:rPr>
+              <w:t>后续工程化</w:t>
+            </w:r>
+          </w:p>
+        </w:tc>
+      </w:tr>
+      <w:tr>
+        <w:tc>
+          <w:tcPr>
+            <w:tcW w:type="dxa" w:w="1587"/>
+            <w:vAlign w:val="center"/>
+            <w:tcBorders>
+              <w:top w:val="single" w:sz="6" w:color="D9D9D9"/>
+              <w:left w:val="single" w:sz="6" w:color="D9D9D9"/>
+              <w:bottom w:val="single" w:sz="6" w:color="D9D9D9"/>
+              <w:right w:val="single" w:sz="6" w:color="D9D9D9"/>
+              <w:insideH w:val="single" w:sz="6" w:color="D9D9D9"/>
+              <w:insideV w:val="single" w:sz="6" w:color="D9D9D9"/>
+            </w:tcBorders>
+            <w:tcMar>
+              <w:top w:w="110" w:type="dxa"/>
+              <w:start w:w="130" w:type="dxa"/>
+              <w:bottom w:w="110" w:type="dxa"/>
+              <w:end w:w="130" w:type="dxa"/>
+            </w:tcMar>
+          </w:tcPr>
+          <w:p>
+            <w:pPr>
+              <w:spacing w:after="0" w:line="283" w:lineRule="auto"/>
+            </w:pPr>
+            <w:r>
+              <w:rPr>
+                <w:rFonts w:ascii="Arial Unicode MS" w:hAnsi="Arial Unicode MS" w:eastAsia="Arial Unicode MS"/>
+                <w:b w:val="0"/>
+                <w:color w:val="202124"/>
+                <w:sz w:val="17"/>
+              </w:rPr>
+              <w:t>硬件</w:t>
+            </w:r>
+          </w:p>
+        </w:tc>
+        <w:tc>
+          <w:tcPr>
+            <w:tcW w:type="dxa" w:w="3685"/>
+            <w:vAlign w:val="center"/>
+            <w:tcBorders>
+              <w:top w:val="single" w:sz="6" w:color="D9D9D9"/>
+              <w:left w:val="single" w:sz="6" w:color="D9D9D9"/>
+              <w:bottom w:val="single" w:sz="6" w:color="D9D9D9"/>
+              <w:right w:val="single" w:sz="6" w:color="D9D9D9"/>
+              <w:insideH w:val="single" w:sz="6" w:color="D9D9D9"/>
+              <w:insideV w:val="single" w:sz="6" w:color="D9D9D9"/>
+            </w:tcBorders>
+            <w:tcMar>
+              <w:top w:w="110" w:type="dxa"/>
+              <w:start w:w="130" w:type="dxa"/>
+              <w:bottom w:w="110" w:type="dxa"/>
+              <w:end w:w="130" w:type="dxa"/>
+            </w:tcMar>
+          </w:tcPr>
+          <w:p>
+            <w:pPr>
+              <w:spacing w:after="0" w:line="283" w:lineRule="auto"/>
+            </w:pPr>
+            <w:r>
+              <w:rPr>
+                <w:rFonts w:ascii="Arial Unicode MS" w:hAnsi="Arial Unicode MS" w:eastAsia="Arial Unicode MS"/>
+                <w:b w:val="0"/>
+                <w:color w:val="202124"/>
+                <w:sz w:val="17"/>
+              </w:rPr>
+              <w:t>用页面状态模拟珠珠录音和同步事件</w:t>
+            </w:r>
+          </w:p>
+        </w:tc>
+        <w:tc>
+          <w:tcPr>
+            <w:tcW w:type="dxa" w:w="4082"/>
+            <w:vAlign w:val="center"/>
+            <w:tcBorders>
+              <w:top w:val="single" w:sz="6" w:color="D9D9D9"/>
+              <w:left w:val="single" w:sz="6" w:color="D9D9D9"/>
+              <w:bottom w:val="single" w:sz="6" w:color="D9D9D9"/>
+              <w:right w:val="single" w:sz="6" w:color="D9D9D9"/>
+              <w:insideH w:val="single" w:sz="6" w:color="D9D9D9"/>
+              <w:insideV w:val="single" w:sz="6" w:color="D9D9D9"/>
+            </w:tcBorders>
+            <w:tcMar>
+              <w:top w:w="110" w:type="dxa"/>
+              <w:start w:w="130" w:type="dxa"/>
+              <w:bottom w:w="110" w:type="dxa"/>
+              <w:end w:w="130" w:type="dxa"/>
+            </w:tcMar>
+          </w:tcPr>
+          <w:p>
+            <w:pPr>
+              <w:spacing w:after="0" w:line="283" w:lineRule="auto"/>
+            </w:pPr>
+            <w:r>
+              <w:rPr>
+                <w:rFonts w:ascii="Arial Unicode MS" w:hAnsi="Arial Unicode MS" w:eastAsia="Arial Unicode MS"/>
+                <w:b w:val="0"/>
+                <w:color w:val="202124"/>
+                <w:sz w:val="17"/>
+              </w:rPr>
+              <w:t>实体按键、麦克风、离线存储、蓝牙同步和状态反馈</w:t>
+            </w:r>
+          </w:p>
+        </w:tc>
+      </w:tr>
+      <w:tr>
+        <w:tc>
+          <w:tcPr>
+            <w:tcW w:type="dxa" w:w="1587"/>
+            <w:vAlign w:val="center"/>
+            <w:tcBorders>
+              <w:top w:val="single" w:sz="6" w:color="D9D9D9"/>
+              <w:left w:val="single" w:sz="6" w:color="D9D9D9"/>
+              <w:bottom w:val="single" w:sz="6" w:color="D9D9D9"/>
+              <w:right w:val="single" w:sz="6" w:color="D9D9D9"/>
+              <w:insideH w:val="single" w:sz="6" w:color="D9D9D9"/>
+              <w:insideV w:val="single" w:sz="6" w:color="D9D9D9"/>
+            </w:tcBorders>
+            <w:tcMar>
+              <w:top w:w="110" w:type="dxa"/>
+              <w:start w:w="130" w:type="dxa"/>
+              <w:bottom w:w="110" w:type="dxa"/>
+              <w:end w:w="130" w:type="dxa"/>
+            </w:tcMar>
+            <w:shd w:fill="F7F8F8"/>
+          </w:tcPr>
+          <w:p>
+            <w:pPr>
+              <w:spacing w:after="0" w:line="283" w:lineRule="auto"/>
+            </w:pPr>
+            <w:r>
+              <w:rPr>
+                <w:rFonts w:ascii="Arial Unicode MS" w:hAnsi="Arial Unicode MS" w:eastAsia="Arial Unicode MS"/>
+                <w:b w:val="0"/>
+                <w:color w:val="202124"/>
+                <w:sz w:val="17"/>
+              </w:rPr>
+              <w:t>AI 与记忆</w:t>
+            </w:r>
+          </w:p>
+        </w:tc>
+        <w:tc>
+          <w:tcPr>
+            <w:tcW w:type="dxa" w:w="3685"/>
+            <w:vAlign w:val="center"/>
+            <w:tcBorders>
+              <w:top w:val="single" w:sz="6" w:color="D9D9D9"/>
+              <w:left w:val="single" w:sz="6" w:color="D9D9D9"/>
+              <w:bottom w:val="single" w:sz="6" w:color="D9D9D9"/>
+              <w:right w:val="single" w:sz="6" w:color="D9D9D9"/>
+              <w:insideH w:val="single" w:sz="6" w:color="D9D9D9"/>
+              <w:insideV w:val="single" w:sz="6" w:color="D9D9D9"/>
+            </w:tcBorders>
+            <w:tcMar>
+              <w:top w:w="110" w:type="dxa"/>
+              <w:start w:w="130" w:type="dxa"/>
+              <w:bottom w:w="110" w:type="dxa"/>
+              <w:end w:w="130" w:type="dxa"/>
+            </w:tcMar>
+            <w:shd w:fill="F7F8F8"/>
+          </w:tcPr>
+          <w:p>
+            <w:pPr>
+              <w:spacing w:after="0" w:line="283" w:lineRule="auto"/>
+            </w:pPr>
+            <w:r>
+              <w:rPr>
+                <w:rFonts w:ascii="Arial Unicode MS" w:hAnsi="Arial Unicode MS" w:eastAsia="Arial Unicode MS"/>
+                <w:b w:val="0"/>
+                <w:color w:val="202124"/>
+                <w:sz w:val="17"/>
+              </w:rPr>
+              <w:t>用脚本化数据演示转写、实体提取、片段聚合和追问</w:t>
+            </w:r>
+          </w:p>
+        </w:tc>
+        <w:tc>
+          <w:tcPr>
+            <w:tcW w:type="dxa" w:w="4082"/>
+            <w:vAlign w:val="center"/>
+            <w:tcBorders>
+              <w:top w:val="single" w:sz="6" w:color="D9D9D9"/>
+              <w:left w:val="single" w:sz="6" w:color="D9D9D9"/>
+              <w:bottom w:val="single" w:sz="6" w:color="D9D9D9"/>
+              <w:right w:val="single" w:sz="6" w:color="D9D9D9"/>
+              <w:insideH w:val="single" w:sz="6" w:color="D9D9D9"/>
+              <w:insideV w:val="single" w:sz="6" w:color="D9D9D9"/>
+            </w:tcBorders>
+            <w:tcMar>
+              <w:top w:w="110" w:type="dxa"/>
+              <w:start w:w="130" w:type="dxa"/>
+              <w:bottom w:w="110" w:type="dxa"/>
+              <w:end w:w="130" w:type="dxa"/>
+            </w:tcMar>
+            <w:shd w:fill="F7F8F8"/>
+          </w:tcPr>
+          <w:p>
+            <w:pPr>
+              <w:spacing w:after="0" w:line="283" w:lineRule="auto"/>
+            </w:pPr>
+            <w:r>
+              <w:rPr>
+                <w:rFonts w:ascii="Arial Unicode MS" w:hAnsi="Arial Unicode MS" w:eastAsia="Arial Unicode MS"/>
+                <w:b w:val="0"/>
+                <w:color w:val="202124"/>
+                <w:sz w:val="17"/>
+              </w:rPr>
+              <w:t>ASR + 实体/事件抽取 + 向量检索/记忆图谱 + 可追溯生成</w:t>
+            </w:r>
+          </w:p>
+        </w:tc>
+      </w:tr>
+      <w:tr>
+        <w:tc>
+          <w:tcPr>
+            <w:tcW w:type="dxa" w:w="1587"/>
+            <w:vAlign w:val="center"/>
+            <w:tcBorders>
+              <w:top w:val="single" w:sz="6" w:color="D9D9D9"/>
+              <w:left w:val="single" w:sz="6" w:color="D9D9D9"/>
+              <w:bottom w:val="single" w:sz="6" w:color="D9D9D9"/>
+              <w:right w:val="single" w:sz="6" w:color="D9D9D9"/>
+              <w:insideH w:val="single" w:sz="6" w:color="D9D9D9"/>
+              <w:insideV w:val="single" w:sz="6" w:color="D9D9D9"/>
+            </w:tcBorders>
+            <w:tcMar>
+              <w:top w:w="110" w:type="dxa"/>
+              <w:start w:w="130" w:type="dxa"/>
+              <w:bottom w:w="110" w:type="dxa"/>
+              <w:end w:w="130" w:type="dxa"/>
+            </w:tcMar>
+          </w:tcPr>
+          <w:p>
+            <w:pPr>
+              <w:spacing w:after="0" w:line="283" w:lineRule="auto"/>
+            </w:pPr>
+            <w:r>
+              <w:rPr>
+                <w:rFonts w:ascii="Arial Unicode MS" w:hAnsi="Arial Unicode MS" w:eastAsia="Arial Unicode MS"/>
+                <w:b w:val="0"/>
+                <w:color w:val="202124"/>
+                <w:sz w:val="17"/>
+              </w:rPr>
+              <w:t>App</w:t>
+            </w:r>
+          </w:p>
+        </w:tc>
+        <w:tc>
+          <w:tcPr>
+            <w:tcW w:type="dxa" w:w="3685"/>
+            <w:vAlign w:val="center"/>
+            <w:tcBorders>
+              <w:top w:val="single" w:sz="6" w:color="D9D9D9"/>
+              <w:left w:val="single" w:sz="6" w:color="D9D9D9"/>
+              <w:bottom w:val="single" w:sz="6" w:color="D9D9D9"/>
+              <w:right w:val="single" w:sz="6" w:color="D9D9D9"/>
+              <w:insideH w:val="single" w:sz="6" w:color="D9D9D9"/>
+              <w:insideV w:val="single" w:sz="6" w:color="D9D9D9"/>
+            </w:tcBorders>
+            <w:tcMar>
+              <w:top w:w="110" w:type="dxa"/>
+              <w:start w:w="130" w:type="dxa"/>
+              <w:bottom w:w="110" w:type="dxa"/>
+              <w:end w:w="130" w:type="dxa"/>
+            </w:tcMar>
+          </w:tcPr>
+          <w:p>
+            <w:pPr>
+              <w:spacing w:after="0" w:line="283" w:lineRule="auto"/>
+            </w:pPr>
+            <w:r>
+              <w:rPr>
+                <w:rFonts w:ascii="Arial Unicode MS" w:hAnsi="Arial Unicode MS" w:eastAsia="Arial Unicode MS"/>
+                <w:b w:val="0"/>
+                <w:color w:val="202124"/>
+                <w:sz w:val="17"/>
+              </w:rPr>
+              <w:t>移动端交互 Demo，展示原声、故事卡、记忆足迹和共忆流程</w:t>
+            </w:r>
+          </w:p>
+        </w:tc>
+        <w:tc>
+          <w:tcPr>
+            <w:tcW w:type="dxa" w:w="4082"/>
+            <w:vAlign w:val="center"/>
+            <w:tcBorders>
+              <w:top w:val="single" w:sz="6" w:color="D9D9D9"/>
+              <w:left w:val="single" w:sz="6" w:color="D9D9D9"/>
+              <w:bottom w:val="single" w:sz="6" w:color="D9D9D9"/>
+              <w:right w:val="single" w:sz="6" w:color="D9D9D9"/>
+              <w:insideH w:val="single" w:sz="6" w:color="D9D9D9"/>
+              <w:insideV w:val="single" w:sz="6" w:color="D9D9D9"/>
+            </w:tcBorders>
+            <w:tcMar>
+              <w:top w:w="110" w:type="dxa"/>
+              <w:start w:w="130" w:type="dxa"/>
+              <w:bottom w:w="110" w:type="dxa"/>
+              <w:end w:w="130" w:type="dxa"/>
+            </w:tcMar>
+          </w:tcPr>
+          <w:p>
+            <w:pPr>
+              <w:spacing w:after="0" w:line="283" w:lineRule="auto"/>
+            </w:pPr>
+            <w:r>
+              <w:rPr>
+                <w:rFonts w:ascii="Arial Unicode MS" w:hAnsi="Arial Unicode MS" w:eastAsia="Arial Unicode MS"/>
+                <w:b w:val="0"/>
+                <w:color w:val="202124"/>
+                <w:sz w:val="17"/>
+              </w:rPr>
+              <w:t>设备管理、同步队列、权限控制、家庭空间和数据导出/删除</w:t>
+            </w:r>
+          </w:p>
+        </w:tc>
+      </w:tr>
+    </w:tbl>
     <w:sectPr>
-      <w:footerReference w:type="default" r:id="rId12"/>
+      <w:footerReference w:type="default" r:id="rId13"/>
       <w:pgSz w:w="12240" w:h="15840"/>
-      <w:pgMar w:top="1191" w:right="1247" w:bottom="1134" w:left="1247" w:header="720" w:footer="720" w:gutter="0"/>
+      <w:pgMar w:top="1020" w:right="1134" w:bottom="1020" w:left="1134" w:header="720" w:footer="720" w:gutter="0"/>
       <w:cols w:space="720"/>
       <w:docGrid w:linePitch="360"/>
     </w:sectPr>
@@ -3371,7 +2875,8 @@
     <w:r>
       <w:rPr>
         <w:rFonts w:ascii="Arial Unicode MS" w:hAnsi="Arial Unicode MS" w:eastAsia="Arial Unicode MS"/>
-        <w:color w:val="888888"/>
+        <w:b w:val="0"/>
+        <w:color w:val="8A8A8A"/>
         <w:sz w:val="17"/>
       </w:rPr>
       <w:t>寻忆  Anker 首届黑客松挑战赛预赛材料</w:t>
@@ -3743,9 +3248,10 @@
     <w:name w:val="Normal"/>
     <w:qFormat/>
     <w:rsid w:val="00FC693F"/>
+    <w:pPr/>
     <w:rPr>
       <w:rFonts w:ascii="Arial Unicode MS" w:hAnsi="Arial Unicode MS" w:eastAsia="Arial Unicode MS"/>
-      <w:color w:val="26322D"/>
+      <w:color w:val="000000"/>
       <w:sz w:val="21"/>
     </w:rPr>
   </w:style>

</xml_diff>